<commit_message>
Regenerate report, slides, and contributions with updated sMAPE/MASE metrics
Rebuilds the delivered documents so they reflect the corrected evaluation metrics (sMAPE, MASE, naive baseline) and the honest forecast/fuel-exogenous findings.

Co-Authored-By: Claude Opus 4.8 <noreply@anthropic.com>
</commit_message>
<xml_diff>
--- a/COS40007_E's Island_Design_Project_Report.docx
+++ b/COS40007_E's Island_Design_Project_Report.docx
@@ -3094,7 +3094,7 @@
           <w:b w:val="0"/>
           <w:i w:val="0"/>
         </w:rPr>
-        <w:t>Income levels and consumer price inflation are two of the most closely watched indicators of economic wellbeing in Malaysia. The Department of Statistics Malaysia (DOSM) publishes monthly CPI data at both national and state level, alongside periodic household income surveys, giving researchers a rich longitudinal and cross-sectional picture of the economy. Yet aggregate national averages can conceal important regional variation: states differ substantially in both their income levels and their exposure to inflationary pressure, and understanding these differences matters for designing targeted subsidies, social-protection schemes, and monetary policy.</w:t>
+        <w:t>Malaysia's Consumer Price Index (CPI) and household income data, published monthly by the Department of Statistics Malaysia (DOSM), provide a detailed picture of inflationary pressures and living standards across the country's 16 states and federal territories. Understanding how inflation evolves, and whether its impact is uniform across states, is directly relevant to monetary policy, subsidy design, and regional development planning.</w:t>
       </w:r>
     </w:p>
     <w:p>
@@ -3106,7 +3106,7 @@
           <w:b w:val="0"/>
           <w:i w:val="0"/>
         </w:rPr>
-        <w:t>Under the COS40007 Smart Government theme, this project applies two complementary AI methods to open DOSM data: ARIMA time-series forecasting to predict how national CPI inflation will evolve over the next 24 months, and unsupervised clustering to group Malaysia's 16 states into interpretable economic tiers based on their CPI and household-income profiles. The analysis is wrapped in a reproducible Python pipeline and an interactive Flask dashboard so that the findings are accessible to non-technical policymakers.</w:t>
+        <w:t>Under the COS40007 Smart Government theme, this project applies machine-learning techniques to open DOSM data to answer two questions: whether ARIMA can reliably forecast national CPI inflation several months ahead, and whether Malaysian states form interpretable economic clusters based on their CPI and income profiles. A reproducible Python pipeline and an interactive web dashboard make the findings accessible to non-technical policymakers.</w:t>
       </w:r>
     </w:p>
     <w:p>
@@ -4252,7 +4252,7 @@
                     <pic:cNvPicPr/>
                   </pic:nvPicPr>
                   <pic:blipFill>
-                    <a:blip r:embed="rId43"/>
+                    <a:blip r:embed="rId53"/>
                     <a:stretch>
                       <a:fillRect/>
                     </a:stretch>
@@ -4332,7 +4332,7 @@
               <a:graphicData uri="http://schemas.openxmlformats.org/drawingml/2006/picture">
                 <pic:pic>
                   <pic:nvPicPr>
-                    <pic:cNvPr id="0" name="cluster_elbow_silhouette.png"/>
+                    <pic:cNvPr id="0" name="image.png"/>
                     <pic:cNvPicPr/>
                   </pic:nvPicPr>
                   <pic:blipFill>
@@ -4396,7 +4396,7 @@
               <a:graphicData uri="http://schemas.openxmlformats.org/drawingml/2006/picture">
                 <pic:pic>
                   <pic:nvPicPr>
-                    <pic:cNvPr id="0" name="cluster_pca_kmeans.png"/>
+                    <pic:cNvPr id="0" name="image.png"/>
                     <pic:cNvPicPr/>
                   </pic:nvPicPr>
                   <pic:blipFill>
@@ -4448,7 +4448,7 @@
               <a:graphicData uri="http://schemas.openxmlformats.org/drawingml/2006/picture">
                 <pic:pic>
                   <pic:nvPicPr>
-                    <pic:cNvPr id="0" name="cluster_dendrogram.png"/>
+                    <pic:cNvPr id="0" name="image.png"/>
                     <pic:cNvPicPr/>
                   </pic:nvPicPr>
                   <pic:blipFill>
@@ -5161,7 +5161,7 @@
               <a:graphicData uri="http://schemas.openxmlformats.org/drawingml/2006/picture">
                 <pic:pic>
                   <pic:nvPicPr>
-                    <pic:cNvPr id="0" name="cluster_pca_hierarchical.png"/>
+                    <pic:cNvPr id="0" name="image.png"/>
                     <pic:cNvPicPr/>
                   </pic:nvPicPr>
                   <pic:blipFill>
@@ -5500,7 +5500,7 @@
               <a:graphicData uri="http://schemas.openxmlformats.org/drawingml/2006/picture">
                 <pic:pic>
                   <pic:nvPicPr>
-                    <pic:cNvPr id="0" name="cluster_profiles.png"/>
+                    <pic:cNvPr id="0" name="image.png"/>
                     <pic:cNvPicPr/>
                   </pic:nvPicPr>
                   <pic:blipFill>
@@ -5572,7 +5572,7 @@
               <a:graphicData uri="http://schemas.openxmlformats.org/drawingml/2006/picture">
                 <pic:pic>
                   <pic:nvPicPr>
-                    <pic:cNvPr id="0" name="eval_fuel_cpi_correlation.png"/>
+                    <pic:cNvPr id="0" name="image.png"/>
                     <pic:cNvPicPr/>
                   </pic:nvPicPr>
                   <pic:blipFill>
@@ -5632,7 +5632,7 @@
               <a:graphicData uri="http://schemas.openxmlformats.org/drawingml/2006/picture">
                 <pic:pic>
                   <pic:nvPicPr>
-                    <pic:cNvPr id="0" name="eval_state_cpi_comparison.png"/>
+                    <pic:cNvPr id="0" name="image.png"/>
                     <pic:cNvPicPr/>
                   </pic:nvPicPr>
                   <pic:blipFill>
@@ -5692,7 +5692,7 @@
               <a:graphicData uri="http://schemas.openxmlformats.org/drawingml/2006/picture">
                 <pic:pic>
                   <pic:nvPicPr>
-                    <pic:cNvPr id="0" name="eval_division_heatmap.png"/>
+                    <pic:cNvPr id="0" name="image.png"/>
                     <pic:cNvPicPr/>
                   </pic:nvPicPr>
                   <pic:blipFill>
@@ -5752,7 +5752,7 @@
               <a:graphicData uri="http://schemas.openxmlformats.org/drawingml/2006/picture">
                 <pic:pic>
                   <pic:nvPicPr>
-                    <pic:cNvPr id="0" name="eval_income_vs_cpi.png"/>
+                    <pic:cNvPr id="0" name="image.png"/>
                     <pic:cNvPicPr/>
                   </pic:nvPicPr>
                   <pic:blipFill>
@@ -6610,7 +6610,7 @@
               <a:graphicData uri="http://schemas.openxmlformats.org/drawingml/2006/picture">
                 <pic:pic>
                   <pic:nvPicPr>
-                    <pic:cNvPr id="0" name="cluster_elbow_silhouette.png"/>
+                    <pic:cNvPr id="0" name="image.png"/>
                     <pic:cNvPicPr/>
                   </pic:nvPicPr>
                   <pic:blipFill>
@@ -6662,7 +6662,7 @@
               <a:graphicData uri="http://schemas.openxmlformats.org/drawingml/2006/picture">
                 <pic:pic>
                   <pic:nvPicPr>
-                    <pic:cNvPr id="0" name="cluster_pca_kmeans.png"/>
+                    <pic:cNvPr id="0" name="image.png"/>
                     <pic:cNvPicPr/>
                   </pic:nvPicPr>
                   <pic:blipFill>
@@ -6714,7 +6714,7 @@
               <a:graphicData uri="http://schemas.openxmlformats.org/drawingml/2006/picture">
                 <pic:pic>
                   <pic:nvPicPr>
-                    <pic:cNvPr id="0" name="cluster_pca_hierarchical.png"/>
+                    <pic:cNvPr id="0" name="image.png"/>
                     <pic:cNvPicPr/>
                   </pic:nvPicPr>
                   <pic:blipFill>
@@ -6766,7 +6766,7 @@
               <a:graphicData uri="http://schemas.openxmlformats.org/drawingml/2006/picture">
                 <pic:pic>
                   <pic:nvPicPr>
-                    <pic:cNvPr id="0" name="cluster_dendrogram.png"/>
+                    <pic:cNvPr id="0" name="image.png"/>
                     <pic:cNvPicPr/>
                   </pic:nvPicPr>
                   <pic:blipFill>
@@ -6818,7 +6818,7 @@
               <a:graphicData uri="http://schemas.openxmlformats.org/drawingml/2006/picture">
                 <pic:pic>
                   <pic:nvPicPr>
-                    <pic:cNvPr id="0" name="cluster_profiles.png"/>
+                    <pic:cNvPr id="0" name="image.png"/>
                     <pic:cNvPicPr/>
                   </pic:nvPicPr>
                   <pic:blipFill>
@@ -6874,7 +6874,7 @@
                     <pic:cNvPicPr/>
                   </pic:nvPicPr>
                   <pic:blipFill>
-                    <a:blip r:embed="rId43"/>
+                    <a:blip r:embed="rId53"/>
                     <a:stretch>
                       <a:fillRect/>
                     </a:stretch>
@@ -6934,7 +6934,7 @@
               <a:graphicData uri="http://schemas.openxmlformats.org/drawingml/2006/picture">
                 <pic:pic>
                   <pic:nvPicPr>
-                    <pic:cNvPr id="0" name="eval_fuel_cpi_correlation.png"/>
+                    <pic:cNvPr id="0" name="image.png"/>
                     <pic:cNvPicPr/>
                   </pic:nvPicPr>
                   <pic:blipFill>
@@ -6986,7 +6986,7 @@
               <a:graphicData uri="http://schemas.openxmlformats.org/drawingml/2006/picture">
                 <pic:pic>
                   <pic:nvPicPr>
-                    <pic:cNvPr id="0" name="eval_state_cpi_comparison.png"/>
+                    <pic:cNvPr id="0" name="image.png"/>
                     <pic:cNvPicPr/>
                   </pic:nvPicPr>
                   <pic:blipFill>
@@ -7038,7 +7038,7 @@
               <a:graphicData uri="http://schemas.openxmlformats.org/drawingml/2006/picture">
                 <pic:pic>
                   <pic:nvPicPr>
-                    <pic:cNvPr id="0" name="eval_division_heatmap.png"/>
+                    <pic:cNvPr id="0" name="image.png"/>
                     <pic:cNvPicPr/>
                   </pic:nvPicPr>
                   <pic:blipFill>

</xml_diff>

<commit_message>
fix: make radio option labels visible (white-on-white in card containers)
Broaden CSS selectors for stRadio to cover all label/p/span/div
descendants so K-Means / Hierarchical option text is dark on
the white card background.

Co-Authored-By: Claude Sonnet 4.6 <noreply@anthropic.com>
</commit_message>
<xml_diff>
--- a/COS40007_E's Island_Design_Project_Report.docx
+++ b/COS40007_E's Island_Design_Project_Report.docx
@@ -29,7 +29,7 @@
           <w:color w:val="000000" w:themeColor="text1"/>
         </w:rPr>
         <w:drawing>
-          <wp:inline distT="0" distB="0" distL="0" distR="0" wp14:anchorId="541B1113" wp14:editId="2D6ADF98">
+          <wp:inline distT="0" distB="0" distL="0" distR="0" wp14:anchorId="3B02D884" wp14:editId="77390C87">
             <wp:extent cx="2937163" cy="1468582"/>
             <wp:effectExtent l="0" t="0" r="0" b="0"/>
             <wp:docPr id="143" name="Picture 144" descr="A black and red sign with white text&#10;&#10;AI-generated content may be incorrect."/>
@@ -139,7 +139,7 @@
           <w:tag w:val=""/>
           <w:id w:val="328029620"/>
           <w:placeholder>
-            <w:docPart w:val="76C1D5A310504B6D900500C145B06B13"/>
+            <w:docPart w:val="8A65AF95879F4BEDB736E3E333E352C3"/>
           </w:placeholder>
           <w:dataBinding w:prefixMappings="xmlns:ns0='http://purl.org/dc/elements/1.1/' xmlns:ns1='http://schemas.openxmlformats.org/package/2006/metadata/core-properties' " w:xpath="/ns1:coreProperties[1]/ns0:subject[1]" w:storeItemID="{6C3C8BC8-F283-45AE-878A-BAB7291924A1}"/>
           <w:text/>
@@ -152,31 +152,7 @@
               <w:sz w:val="28"/>
               <w:szCs w:val="28"/>
             </w:rPr>
-            <w:t>De</w:t>
-          </w:r>
-          <w:r>
-            <w:rPr>
-              <w:rFonts w:ascii="Times New Roman" w:eastAsia="Times New Roman" w:hAnsi="Times New Roman" w:cs="Times New Roman"/>
-              <w:sz w:val="28"/>
-              <w:szCs w:val="28"/>
-            </w:rPr>
-            <w:t>sign Project</w:t>
-          </w:r>
-          <w:r>
-            <w:rPr>
-              <w:rFonts w:ascii="Times New Roman" w:eastAsia="Times New Roman" w:hAnsi="Times New Roman" w:cs="Times New Roman"/>
-              <w:sz w:val="28"/>
-              <w:szCs w:val="28"/>
-            </w:rPr>
-            <w:t xml:space="preserve"> Theme 3</w:t>
-          </w:r>
-          <w:r>
-            <w:rPr>
-              <w:rFonts w:ascii="Times New Roman" w:eastAsia="Times New Roman" w:hAnsi="Times New Roman" w:cs="Times New Roman"/>
-              <w:sz w:val="28"/>
-              <w:szCs w:val="28"/>
-            </w:rPr>
-            <w:t>: Smart Government</w:t>
+            <w:t>Design Project Theme 3: Smart Government</w:t>
           </w:r>
         </w:sdtContent>
       </w:sdt>
@@ -271,21 +247,7 @@
           <w:rFonts w:ascii="Times New Roman" w:hAnsi="Times New Roman" w:cs="Times New Roman"/>
           <w:lang w:val="en-MY"/>
         </w:rPr>
-        <w:t xml:space="preserve">Prepared by </w:t>
-      </w:r>
-      <w:r>
-        <w:rPr>
-          <w:rFonts w:ascii="Times New Roman" w:hAnsi="Times New Roman" w:cs="Times New Roman"/>
-          <w:lang w:val="en-MY"/>
-        </w:rPr>
-        <w:t>E’s Island</w:t>
-      </w:r>
-      <w:r>
-        <w:rPr>
-          <w:rFonts w:ascii="Times New Roman" w:hAnsi="Times New Roman" w:cs="Times New Roman"/>
-          <w:lang w:val="en-MY"/>
-        </w:rPr>
-        <w:t>:</w:t>
+        <w:t>Prepared by E’s Island:</w:t>
       </w:r>
     </w:p>
     <w:p>
@@ -3049,11 +3011,13 @@
     <w:p>
       <w:pPr>
         <w:rPr>
-          <w:rFonts w:ascii="Times New Roman" w:hAnsi="Times New Roman" w:cs="Times New Roman"/>
+          <w:rFonts w:ascii="Times New Roman" w:eastAsiaTheme="minorEastAsia" w:hAnsi="Times New Roman" w:cs="Times New Roman"/>
+          <w:b/>
+          <w:bCs/>
           <w:sz w:val="24"/>
           <w:szCs w:val="24"/>
           <w:highlight w:val="lightGray"/>
-          <w:lang w:val="en-MY"/>
+          <w:lang w:val="en-MY" w:eastAsia="zh-CN"/>
         </w:rPr>
       </w:pPr>
       <w:r>
@@ -3074,6 +3038,7 @@
         <w:pStyle w:val="Heading1"/>
       </w:pPr>
       <w:r>
+        <w:lastRenderedPageBreak/>
         <w:t>Introduction</w:t>
       </w:r>
     </w:p>
@@ -3090,10 +3055,6 @@
         <w:spacing w:after="120"/>
       </w:pPr>
       <w:r>
-        <w:rPr>
-          <w:b w:val="0"/>
-          <w:i w:val="0"/>
-        </w:rPr>
         <w:t>Malaysia's Consumer Price Index (CPI) and household income data, published monthly by the Department of Statistics Malaysia (DOSM), provide a detailed picture of inflationary pressures and living standards across the country's 16 states and federal territories. Understanding how inflation evolves, and whether its impact is uniform across states, is directly relevant to monetary policy, subsidy design, and regional development planning.</w:t>
       </w:r>
     </w:p>
@@ -3102,10 +3063,6 @@
         <w:spacing w:after="120"/>
       </w:pPr>
       <w:r>
-        <w:rPr>
-          <w:b w:val="0"/>
-          <w:i w:val="0"/>
-        </w:rPr>
         <w:t>Under the COS40007 Smart Government theme, this project applies machine-learning techniques to open DOSM data to answer two questions: whether ARIMA can reliably forecast national CPI inflation several months ahead, and whether Malaysian states form interpretable economic clusters based on their CPI and income profiles. A reproducible Python pipeline and an interactive web dashboard make the findings accessible to non-technical policymakers.</w:t>
       </w:r>
     </w:p>
@@ -3122,11 +3079,15 @@
         <w:spacing w:after="120"/>
       </w:pPr>
       <w:r>
-        <w:rPr>
-          <w:b w:val="0"/>
-          <w:i w:val="0"/>
-        </w:rPr>
-        <w:t>The project set out to achieve the following objectives:</w:t>
+        <w:t xml:space="preserve">The project </w:t>
+      </w:r>
+      <w:proofErr w:type="gramStart"/>
+      <w:r>
+        <w:t>set</w:t>
+      </w:r>
+      <w:proofErr w:type="gramEnd"/>
+      <w:r>
+        <w:t xml:space="preserve"> out to achieve the following objectives:</w:t>
       </w:r>
     </w:p>
     <w:p>
@@ -3237,10 +3198,6 @@
         <w:spacing w:after="120"/>
       </w:pPr>
       <w:r>
-        <w:rPr>
-          <w:b w:val="0"/>
-          <w:i w:val="0"/>
-        </w:rPr>
         <w:t>All four DOSM datasets were processed through a single reproducible pipeline (random seed fixed at 42) that regenerates every figure and metric in this report. The key outcomes were:</w:t>
       </w:r>
     </w:p>
@@ -3259,8 +3216,21 @@
         </w:rPr>
         <w:t xml:space="preserve">Inflation forecasts with a candid accuracy assessment. </w:t>
       </w:r>
-      <w:r>
-        <w:t>ARIMA(4,0,4) forecasts overall CPI inflation in the range 2.10%–2.85% over the next 24 months (test RMSE = 1.0699, sMAPE = 46.06%). Measured by MASE = 2.35 (&gt;1), the model does not beat a naive random-walk baseline (RMSE = 0.3410) over this 24-month block horizon — an expected limitation of a mean-reverting stationary model at long horizons, reported honestly rather than masked by a percentage error.</w:t>
+      <w:proofErr w:type="gramStart"/>
+      <w:r>
+        <w:t>ARIMA(</w:t>
+      </w:r>
+      <w:proofErr w:type="gramEnd"/>
+      <w:r>
+        <w:t xml:space="preserve">4,0,4) forecasts overall CPI inflation in the range 2.10%–2.85% over the next 24 months (test RMSE = 1.0699, </w:t>
+      </w:r>
+      <w:proofErr w:type="spellStart"/>
+      <w:r>
+        <w:t>sMAPE</w:t>
+      </w:r>
+      <w:proofErr w:type="spellEnd"/>
+      <w:r>
+        <w:t xml:space="preserve"> = 46.06%). Measured by MASE = 2.35 (&gt;1), the model does not beat a naive random-walk baseline (RMSE = 0.3410) over this 24-month block horizon — an expected limitation of a mean-reverting stationary model at long horizons, reported honestly rather than masked by a percentage error.</w:t>
       </w:r>
     </w:p>
     <w:p>
@@ -3298,7 +3268,15 @@
         <w:t xml:space="preserve">Fuel correlates with inflation but does not improve its forecast. </w:t>
       </w:r>
       <w:r>
-        <w:t>Average fuel price is positively and significantly correlated with CPI inflation, yet adding it as an exogenous regressor (ARIMAX) did not reduce test error versus the univariate model — evidence that the association is not exploitable for short-horizon prediction in this specification.</w:t>
+        <w:t xml:space="preserve">Average fuel price is positively and significantly correlated with CPI </w:t>
+      </w:r>
+      <w:proofErr w:type="gramStart"/>
+      <w:r>
+        <w:t>inflation, yet</w:t>
+      </w:r>
+      <w:proofErr w:type="gramEnd"/>
+      <w:r>
+        <w:t xml:space="preserve"> adding it as an exogenous regressor (ARIMAX) did not reduce test error versus the univariate model — evidence that the association is not exploitable for short-horizon prediction in this specification.</w:t>
       </w:r>
     </w:p>
     <w:p>
@@ -3322,9 +3300,23 @@
     </w:p>
     <w:p>
       <w:pPr>
+        <w:rPr>
+          <w:b/>
+          <w:bCs/>
+          <w:sz w:val="23"/>
+          <w:szCs w:val="23"/>
+        </w:rPr>
+      </w:pPr>
+      <w:r>
+        <w:br w:type="page"/>
+      </w:r>
+    </w:p>
+    <w:p>
+      <w:pPr>
         <w:pStyle w:val="Heading1"/>
       </w:pPr>
       <w:r>
+        <w:lastRenderedPageBreak/>
         <w:t>Dataset</w:t>
       </w:r>
     </w:p>
@@ -3341,11 +3333,31 @@
         <w:spacing w:after="120"/>
       </w:pPr>
       <w:r>
-        <w:rPr>
-          <w:b w:val="0"/>
-          <w:i w:val="0"/>
-        </w:rPr>
-        <w:t>Four datasets were sourced from the OpenDOSM Data Catalogue and the Malaysian Open Data portal (data.gov.my), all published by the Department of Statistics Malaysia (DOSM) under the Creative Commons Attribution 4.0 International (CC BY 4.0) licence. They were retrieved programmatically from DOSM's storage endpoints so the analysis runs on primary-source government data rather than third-party copies.</w:t>
+        <w:t xml:space="preserve">Four datasets were sourced from the </w:t>
+      </w:r>
+      <w:proofErr w:type="spellStart"/>
+      <w:r>
+        <w:t>OpenDOSM</w:t>
+      </w:r>
+      <w:proofErr w:type="spellEnd"/>
+      <w:r>
+        <w:t xml:space="preserve"> Data Catalogue and the Malaysian Open Data portal (data.gov.my), all published by the Department of Statistics Malaysia (DOSM) under the Creative Commons Attribution 4.0 International (CC BY 4.0) </w:t>
+      </w:r>
+      <w:proofErr w:type="spellStart"/>
+      <w:r>
+        <w:t>licence</w:t>
+      </w:r>
+      <w:proofErr w:type="spellEnd"/>
+      <w:r>
+        <w:t xml:space="preserve">. They were retrieved programmatically from DOSM's storage </w:t>
+      </w:r>
+      <w:proofErr w:type="gramStart"/>
+      <w:r>
+        <w:t>endpoints</w:t>
+      </w:r>
+      <w:proofErr w:type="gramEnd"/>
+      <w:r>
+        <w:t xml:space="preserve"> so the analysis runs on primary-source government data rather than third-party copies.</w:t>
       </w:r>
     </w:p>
     <w:p>
@@ -3362,9 +3374,8 @@
     </w:p>
     <w:tbl>
       <w:tblPr>
-        <w:tblW w:type="auto" w:w="0"/>
+        <w:tblW w:w="0" w:type="auto"/>
         <w:jc w:val="center"/>
-        <w:tblLook w:firstColumn="1" w:firstRow="1" w:lastColumn="0" w:lastRow="0" w:noHBand="0" w:noVBand="1" w:val="04A0"/>
         <w:tblBorders>
           <w:top w:val="single" w:sz="4" w:space="0" w:color="808080"/>
           <w:left w:val="single" w:sz="4" w:space="0" w:color="808080"/>
@@ -3373,21 +3384,24 @@
           <w:insideH w:val="single" w:sz="4" w:space="0" w:color="808080"/>
           <w:insideV w:val="single" w:sz="4" w:space="0" w:color="808080"/>
         </w:tblBorders>
+        <w:tblLook w:val="04A0" w:firstRow="1" w:lastRow="0" w:firstColumn="1" w:lastColumn="0" w:noHBand="0" w:noVBand="1"/>
       </w:tblPr>
       <w:tblGrid>
-        <w:gridCol w:w="2269"/>
-        <w:gridCol w:w="2269"/>
-        <w:gridCol w:w="2269"/>
-        <w:gridCol w:w="2269"/>
+        <w:gridCol w:w="2592"/>
+        <w:gridCol w:w="2448"/>
+        <w:gridCol w:w="2880"/>
+        <w:gridCol w:w="1152"/>
       </w:tblGrid>
       <w:tr>
+        <w:trPr>
+          <w:jc w:val="center"/>
+        </w:trPr>
         <w:tc>
           <w:tcPr>
-            <w:tcW w:type="dxa" w:w="2592"/>
-            <w:shd w:val="clear" w:fill="1F4E79"/>
+            <w:tcW w:w="2592" w:type="dxa"/>
+            <w:shd w:val="clear" w:color="auto" w:fill="1F4E79"/>
           </w:tcPr>
           <w:p>
-            <w:r/>
             <w:r>
               <w:rPr>
                 <w:b/>
@@ -3400,11 +3414,10 @@
         </w:tc>
         <w:tc>
           <w:tcPr>
-            <w:tcW w:type="dxa" w:w="2448"/>
-            <w:shd w:val="clear" w:fill="1F4E79"/>
+            <w:tcW w:w="2448" w:type="dxa"/>
+            <w:shd w:val="clear" w:color="auto" w:fill="1F4E79"/>
           </w:tcPr>
           <w:p>
-            <w:r/>
             <w:r>
               <w:rPr>
                 <w:b/>
@@ -3417,11 +3430,10 @@
         </w:tc>
         <w:tc>
           <w:tcPr>
-            <w:tcW w:type="dxa" w:w="2880"/>
-            <w:shd w:val="clear" w:fill="1F4E79"/>
+            <w:tcW w:w="2880" w:type="dxa"/>
+            <w:shd w:val="clear" w:color="auto" w:fill="1F4E79"/>
           </w:tcPr>
           <w:p>
-            <w:r/>
             <w:r>
               <w:rPr>
                 <w:b/>
@@ -3434,11 +3446,10 @@
         </w:tc>
         <w:tc>
           <w:tcPr>
-            <w:tcW w:type="dxa" w:w="1152"/>
-            <w:shd w:val="clear" w:fill="1F4E79"/>
+            <w:tcW w:w="1152" w:type="dxa"/>
+            <w:shd w:val="clear" w:color="auto" w:fill="1F4E79"/>
           </w:tcPr>
           <w:p>
-            <w:r/>
             <w:r>
               <w:rPr>
                 <w:b/>
@@ -3451,12 +3462,14 @@
         </w:tc>
       </w:tr>
       <w:tr>
+        <w:trPr>
+          <w:jc w:val="center"/>
+        </w:trPr>
         <w:tc>
           <w:tcPr>
-            <w:tcW w:type="dxa" w:w="2592"/>
+            <w:tcW w:w="2592" w:type="dxa"/>
           </w:tcPr>
           <w:p>
-            <w:r/>
             <w:r>
               <w:rPr>
                 <w:sz w:val="18"/>
@@ -3467,10 +3480,9 @@
         </w:tc>
         <w:tc>
           <w:tcPr>
-            <w:tcW w:type="dxa" w:w="2448"/>
+            <w:tcW w:w="2448" w:type="dxa"/>
           </w:tcPr>
           <w:p>
-            <w:r/>
             <w:r>
               <w:rPr>
                 <w:sz w:val="18"/>
@@ -3481,10 +3493,9 @@
         </w:tc>
         <w:tc>
           <w:tcPr>
-            <w:tcW w:type="dxa" w:w="2880"/>
+            <w:tcW w:w="2880" w:type="dxa"/>
           </w:tcPr>
           <w:p>
-            <w:r/>
             <w:r>
               <w:rPr>
                 <w:sz w:val="18"/>
@@ -3495,10 +3506,9 @@
         </w:tc>
         <w:tc>
           <w:tcPr>
-            <w:tcW w:type="dxa" w:w="1152"/>
+            <w:tcW w:w="1152" w:type="dxa"/>
           </w:tcPr>
           <w:p>
-            <w:r/>
             <w:r>
               <w:rPr>
                 <w:sz w:val="18"/>
@@ -3509,13 +3519,15 @@
         </w:tc>
       </w:tr>
       <w:tr>
+        <w:trPr>
+          <w:jc w:val="center"/>
+        </w:trPr>
         <w:tc>
           <w:tcPr>
-            <w:tcW w:type="dxa" w:w="2592"/>
-            <w:shd w:val="clear" w:fill="EFF3F8"/>
+            <w:tcW w:w="2592" w:type="dxa"/>
+            <w:shd w:val="clear" w:color="auto" w:fill="EFF3F8"/>
           </w:tcPr>
           <w:p>
-            <w:r/>
             <w:r>
               <w:rPr>
                 <w:sz w:val="18"/>
@@ -3526,11 +3538,10 @@
         </w:tc>
         <w:tc>
           <w:tcPr>
-            <w:tcW w:type="dxa" w:w="2448"/>
-            <w:shd w:val="clear" w:fill="EFF3F8"/>
+            <w:tcW w:w="2448" w:type="dxa"/>
+            <w:shd w:val="clear" w:color="auto" w:fill="EFF3F8"/>
           </w:tcPr>
           <w:p>
-            <w:r/>
             <w:r>
               <w:rPr>
                 <w:sz w:val="18"/>
@@ -3541,11 +3552,10 @@
         </w:tc>
         <w:tc>
           <w:tcPr>
-            <w:tcW w:type="dxa" w:w="2880"/>
-            <w:shd w:val="clear" w:fill="EFF3F8"/>
+            <w:tcW w:w="2880" w:type="dxa"/>
+            <w:shd w:val="clear" w:color="auto" w:fill="EFF3F8"/>
           </w:tcPr>
           <w:p>
-            <w:r/>
             <w:r>
               <w:rPr>
                 <w:sz w:val="18"/>
@@ -3556,11 +3566,10 @@
         </w:tc>
         <w:tc>
           <w:tcPr>
-            <w:tcW w:type="dxa" w:w="1152"/>
-            <w:shd w:val="clear" w:fill="EFF3F8"/>
+            <w:tcW w:w="1152" w:type="dxa"/>
+            <w:shd w:val="clear" w:color="auto" w:fill="EFF3F8"/>
           </w:tcPr>
           <w:p>
-            <w:r/>
             <w:r>
               <w:rPr>
                 <w:sz w:val="18"/>
@@ -3571,12 +3580,14 @@
         </w:tc>
       </w:tr>
       <w:tr>
+        <w:trPr>
+          <w:jc w:val="center"/>
+        </w:trPr>
         <w:tc>
           <w:tcPr>
-            <w:tcW w:type="dxa" w:w="2592"/>
+            <w:tcW w:w="2592" w:type="dxa"/>
           </w:tcPr>
           <w:p>
-            <w:r/>
             <w:r>
               <w:rPr>
                 <w:sz w:val="18"/>
@@ -3587,24 +3598,24 @@
         </w:tc>
         <w:tc>
           <w:tcPr>
-            <w:tcW w:type="dxa" w:w="2448"/>
+            <w:tcW w:w="2448" w:type="dxa"/>
           </w:tcPr>
           <w:p>
-            <w:r/>
+            <w:proofErr w:type="spellStart"/>
             <w:r>
               <w:rPr>
                 <w:sz w:val="18"/>
               </w:rPr>
               <w:t>fuelprice</w:t>
             </w:r>
+            <w:proofErr w:type="spellEnd"/>
           </w:p>
         </w:tc>
         <w:tc>
           <w:tcPr>
-            <w:tcW w:type="dxa" w:w="2880"/>
+            <w:tcW w:w="2880" w:type="dxa"/>
           </w:tcPr>
           <w:p>
-            <w:r/>
             <w:r>
               <w:rPr>
                 <w:sz w:val="18"/>
@@ -3615,10 +3626,9 @@
         </w:tc>
         <w:tc>
           <w:tcPr>
-            <w:tcW w:type="dxa" w:w="1152"/>
+            <w:tcW w:w="1152" w:type="dxa"/>
           </w:tcPr>
           <w:p>
-            <w:r/>
             <w:r>
               <w:rPr>
                 <w:sz w:val="18"/>
@@ -3629,13 +3639,15 @@
         </w:tc>
       </w:tr>
       <w:tr>
+        <w:trPr>
+          <w:jc w:val="center"/>
+        </w:trPr>
         <w:tc>
           <w:tcPr>
-            <w:tcW w:type="dxa" w:w="2592"/>
-            <w:shd w:val="clear" w:fill="EFF3F8"/>
+            <w:tcW w:w="2592" w:type="dxa"/>
+            <w:shd w:val="clear" w:color="auto" w:fill="EFF3F8"/>
           </w:tcPr>
           <w:p>
-            <w:r/>
             <w:r>
               <w:rPr>
                 <w:sz w:val="18"/>
@@ -3646,26 +3658,26 @@
         </w:tc>
         <w:tc>
           <w:tcPr>
-            <w:tcW w:type="dxa" w:w="2448"/>
-            <w:shd w:val="clear" w:fill="EFF3F8"/>
+            <w:tcW w:w="2448" w:type="dxa"/>
+            <w:shd w:val="clear" w:color="auto" w:fill="EFF3F8"/>
           </w:tcPr>
           <w:p>
-            <w:r/>
+            <w:proofErr w:type="spellStart"/>
             <w:r>
               <w:rPr>
                 <w:sz w:val="18"/>
               </w:rPr>
               <w:t>hh_income_state</w:t>
             </w:r>
+            <w:proofErr w:type="spellEnd"/>
           </w:p>
         </w:tc>
         <w:tc>
           <w:tcPr>
-            <w:tcW w:type="dxa" w:w="2880"/>
-            <w:shd w:val="clear" w:fill="EFF3F8"/>
+            <w:tcW w:w="2880" w:type="dxa"/>
+            <w:shd w:val="clear" w:color="auto" w:fill="EFF3F8"/>
           </w:tcPr>
           <w:p>
-            <w:r/>
             <w:r>
               <w:rPr>
                 <w:sz w:val="18"/>
@@ -3676,11 +3688,10 @@
         </w:tc>
         <w:tc>
           <w:tcPr>
-            <w:tcW w:type="dxa" w:w="1152"/>
-            <w:shd w:val="clear" w:fill="EFF3F8"/>
+            <w:tcW w:w="1152" w:type="dxa"/>
+            <w:shd w:val="clear" w:color="auto" w:fill="EFF3F8"/>
           </w:tcPr>
           <w:p>
-            <w:r/>
             <w:r>
               <w:rPr>
                 <w:sz w:val="18"/>
@@ -3701,11 +3712,15 @@
         <w:spacing w:after="120"/>
       </w:pPr>
       <w:r>
-        <w:rPr>
-          <w:b w:val="0"/>
-          <w:i w:val="0"/>
-        </w:rPr>
-        <w:t>Two design choices underpin the dataset selection. The national CPI inflation series is a long monthly time series suited to ARIMA forecasting, while the state-level CPI index and household-income tables provide the cross-sectional features needed for clustering. Combining a longitudinal and a cross-sectional source lets the project answer both 'where is inflation heading nationally?' and 'which states face structurally different economic conditions?'.</w:t>
+        <w:t xml:space="preserve">Two design choices underpin the dataset selection. The national CPI inflation series is a long </w:t>
+      </w:r>
+      <w:proofErr w:type="gramStart"/>
+      <w:r>
+        <w:t>monthly time</w:t>
+      </w:r>
+      <w:proofErr w:type="gramEnd"/>
+      <w:r>
+        <w:t xml:space="preserve"> series suited to ARIMA forecasting, while the state-level CPI index and household-income tables provide the cross-sectional features needed for clustering. Combining a longitudinal and a cross-sectional source lets the project answer both 'where is inflation heading nationally?' and 'which states face structurally different economic conditions?'.</w:t>
       </w:r>
     </w:p>
     <w:p>
@@ -3721,11 +3736,23 @@
         <w:spacing w:after="120"/>
       </w:pPr>
       <w:r>
-        <w:rPr>
-          <w:b w:val="0"/>
-          <w:i w:val="0"/>
-        </w:rPr>
-        <w:t>The preprocessing module (src/preprocessing.py) loads, cleans, and engineers features from all four datasets, writing tidy outputs to data/processed/. The main steps were:</w:t>
+        <w:t>The preprocessing module (</w:t>
+      </w:r>
+      <w:proofErr w:type="spellStart"/>
+      <w:r>
+        <w:t>src</w:t>
+      </w:r>
+      <w:proofErr w:type="spellEnd"/>
+      <w:r>
+        <w:t xml:space="preserve">/preprocessing.py) loads, cleans, and </w:t>
+      </w:r>
+      <w:proofErr w:type="gramStart"/>
+      <w:r>
+        <w:t>engineers</w:t>
+      </w:r>
+      <w:proofErr w:type="gramEnd"/>
+      <w:r>
+        <w:t xml:space="preserve"> features from all four datasets, writing tidy outputs to data/processed/. The main steps were:</w:t>
       </w:r>
     </w:p>
     <w:p>
@@ -3801,7 +3828,28 @@
         <w:t xml:space="preserve">State feature engineering. </w:t>
       </w:r>
       <w:r>
-        <w:t>Five features per state were aggregated for clustering: mean CPI index level, CPI growth rate (earliest-to-latest %), CPI volatility (std dev of monthly index), latest mean income, and latest median income. All five were z-score standardised before clustering.</w:t>
+        <w:t xml:space="preserve">Five features per state were aggregated for clustering: mean CPI index level, CPI growth rate (earliest-to-latest %), CPI volatility (std dev of monthly index), latest mean income, and latest median income. All five were z-score </w:t>
+      </w:r>
+      <w:proofErr w:type="spellStart"/>
+      <w:r>
+        <w:t>standardised</w:t>
+      </w:r>
+      <w:proofErr w:type="spellEnd"/>
+      <w:r>
+        <w:t xml:space="preserve"> before clustering.</w:t>
+      </w:r>
+    </w:p>
+    <w:p>
+      <w:pPr>
+        <w:rPr>
+          <w:b/>
+          <w:bCs/>
+          <w:sz w:val="23"/>
+          <w:szCs w:val="23"/>
+        </w:rPr>
+      </w:pPr>
+      <w:r>
+        <w:br w:type="page"/>
       </w:r>
     </w:p>
     <w:p>
@@ -3809,6 +3857,7 @@
         <w:pStyle w:val="Heading1"/>
       </w:pPr>
       <w:r>
+        <w:lastRenderedPageBreak/>
         <w:t>AI model development</w:t>
       </w:r>
     </w:p>
@@ -3825,11 +3874,15 @@
         <w:spacing w:after="120"/>
       </w:pPr>
       <w:r>
-        <w:rPr>
-          <w:b w:val="0"/>
-          <w:i w:val="0"/>
-        </w:rPr>
-        <w:t>For ARIMA forecasting the single input feature is the overall CPI inflation year-on-year (%) series spanning Jan 1981 to Apr 2026 (544 monthly observations). The series is treated as a univariate time series; the integrated term d provides any trend-removal needed before fitting the AR and MA components.</w:t>
+        <w:t xml:space="preserve">For ARIMA forecasting the single input feature is the overall CPI inflation year-on-year (%) series spanning Jan 1981 to Apr 2026 (544 monthly observations). The series is treated as a univariate time series; the integrated </w:t>
+      </w:r>
+      <w:proofErr w:type="gramStart"/>
+      <w:r>
+        <w:t>term d</w:t>
+      </w:r>
+      <w:proofErr w:type="gramEnd"/>
+      <w:r>
+        <w:t xml:space="preserve"> provides any trend-removal needed before fitting the AR and MA components.</w:t>
       </w:r>
     </w:p>
     <w:p>
@@ -3837,11 +3890,39 @@
         <w:spacing w:after="120"/>
       </w:pPr>
       <w:r>
-        <w:rPr>
-          <w:b w:val="0"/>
-          <w:i w:val="0"/>
-        </w:rPr>
-        <w:t>For clustering, five standardised state-level features were constructed. Because these variables span very different scales (income in thousands of RM; CPI index centred around 100; growth rate in percent), z-score standardisation (StandardScaler) was applied so that high-magnitude income variables do not dominate the Euclidean distance.</w:t>
+        <w:t xml:space="preserve">For clustering, five </w:t>
+      </w:r>
+      <w:proofErr w:type="spellStart"/>
+      <w:r>
+        <w:t>standardised</w:t>
+      </w:r>
+      <w:proofErr w:type="spellEnd"/>
+      <w:r>
+        <w:t xml:space="preserve"> state-level features were constructed. Because these variables span very different scales (income in thousands of RM; CPI index </w:t>
+      </w:r>
+      <w:proofErr w:type="spellStart"/>
+      <w:r>
+        <w:t>centred</w:t>
+      </w:r>
+      <w:proofErr w:type="spellEnd"/>
+      <w:r>
+        <w:t xml:space="preserve"> around 100; growth rate in percent), z-score </w:t>
+      </w:r>
+      <w:proofErr w:type="spellStart"/>
+      <w:r>
+        <w:t>standardisation</w:t>
+      </w:r>
+      <w:proofErr w:type="spellEnd"/>
+      <w:r>
+        <w:t xml:space="preserve"> (</w:t>
+      </w:r>
+      <w:proofErr w:type="spellStart"/>
+      <w:r>
+        <w:t>StandardScaler</w:t>
+      </w:r>
+      <w:proofErr w:type="spellEnd"/>
+      <w:r>
+        <w:t>) was applied so that high-magnitude income variables do not dominate the Euclidean distance.</w:t>
       </w:r>
     </w:p>
     <w:p>
@@ -3858,9 +3939,8 @@
     </w:p>
     <w:tbl>
       <w:tblPr>
-        <w:tblW w:type="auto" w:w="0"/>
+        <w:tblW w:w="0" w:type="auto"/>
         <w:jc w:val="center"/>
-        <w:tblLook w:firstColumn="1" w:firstRow="1" w:lastColumn="0" w:lastRow="0" w:noHBand="0" w:noVBand="1" w:val="04A0"/>
         <w:tblBorders>
           <w:top w:val="single" w:sz="4" w:space="0" w:color="808080"/>
           <w:left w:val="single" w:sz="4" w:space="0" w:color="808080"/>
@@ -3869,20 +3949,23 @@
           <w:insideH w:val="single" w:sz="4" w:space="0" w:color="808080"/>
           <w:insideV w:val="single" w:sz="4" w:space="0" w:color="808080"/>
         </w:tblBorders>
+        <w:tblLook w:val="04A0" w:firstRow="1" w:lastRow="0" w:firstColumn="1" w:lastColumn="0" w:noHBand="0" w:noVBand="1"/>
       </w:tblPr>
       <w:tblGrid>
-        <w:gridCol w:w="3025"/>
-        <w:gridCol w:w="3025"/>
-        <w:gridCol w:w="3025"/>
+        <w:gridCol w:w="2592"/>
+        <w:gridCol w:w="4608"/>
+        <w:gridCol w:w="1728"/>
       </w:tblGrid>
       <w:tr>
+        <w:trPr>
+          <w:jc w:val="center"/>
+        </w:trPr>
         <w:tc>
           <w:tcPr>
-            <w:tcW w:type="dxa" w:w="2592"/>
-            <w:shd w:val="clear" w:fill="1F4E79"/>
+            <w:tcW w:w="2592" w:type="dxa"/>
+            <w:shd w:val="clear" w:color="auto" w:fill="1F4E79"/>
           </w:tcPr>
           <w:p>
-            <w:r/>
             <w:r>
               <w:rPr>
                 <w:b/>
@@ -3895,11 +3978,10 @@
         </w:tc>
         <w:tc>
           <w:tcPr>
-            <w:tcW w:type="dxa" w:w="4608"/>
-            <w:shd w:val="clear" w:fill="1F4E79"/>
+            <w:tcW w:w="4608" w:type="dxa"/>
+            <w:shd w:val="clear" w:color="auto" w:fill="1F4E79"/>
           </w:tcPr>
           <w:p>
-            <w:r/>
             <w:r>
               <w:rPr>
                 <w:b/>
@@ -3912,11 +3994,10 @@
         </w:tc>
         <w:tc>
           <w:tcPr>
-            <w:tcW w:type="dxa" w:w="1728"/>
-            <w:shd w:val="clear" w:fill="1F4E79"/>
+            <w:tcW w:w="1728" w:type="dxa"/>
+            <w:shd w:val="clear" w:color="auto" w:fill="1F4E79"/>
           </w:tcPr>
           <w:p>
-            <w:r/>
             <w:r>
               <w:rPr>
                 <w:b/>
@@ -3929,26 +4010,29 @@
         </w:tc>
       </w:tr>
       <w:tr>
+        <w:trPr>
+          <w:jc w:val="center"/>
+        </w:trPr>
         <w:tc>
           <w:tcPr>
-            <w:tcW w:type="dxa" w:w="2592"/>
+            <w:tcW w:w="2592" w:type="dxa"/>
           </w:tcPr>
           <w:p>
-            <w:r/>
+            <w:proofErr w:type="spellStart"/>
             <w:r>
               <w:rPr>
                 <w:sz w:val="18"/>
               </w:rPr>
               <w:t>mean_cpi_index</w:t>
             </w:r>
+            <w:proofErr w:type="spellEnd"/>
           </w:p>
         </w:tc>
         <w:tc>
           <w:tcPr>
-            <w:tcW w:type="dxa" w:w="4608"/>
+            <w:tcW w:w="4608" w:type="dxa"/>
           </w:tcPr>
           <w:p>
-            <w:r/>
             <w:r>
               <w:rPr>
                 <w:sz w:val="18"/>
@@ -3959,10 +4043,9 @@
         </w:tc>
         <w:tc>
           <w:tcPr>
-            <w:tcW w:type="dxa" w:w="1728"/>
+            <w:tcW w:w="1728" w:type="dxa"/>
           </w:tcPr>
           <w:p>
-            <w:r/>
             <w:r>
               <w:rPr>
                 <w:sz w:val="18"/>
@@ -3973,28 +4056,31 @@
         </w:tc>
       </w:tr>
       <w:tr>
+        <w:trPr>
+          <w:jc w:val="center"/>
+        </w:trPr>
         <w:tc>
           <w:tcPr>
-            <w:tcW w:type="dxa" w:w="2592"/>
-            <w:shd w:val="clear" w:fill="EFF3F8"/>
+            <w:tcW w:w="2592" w:type="dxa"/>
+            <w:shd w:val="clear" w:color="auto" w:fill="EFF3F8"/>
           </w:tcPr>
           <w:p>
-            <w:r/>
+            <w:proofErr w:type="spellStart"/>
             <w:r>
               <w:rPr>
                 <w:sz w:val="18"/>
               </w:rPr>
               <w:t>cpi_growth_rate</w:t>
             </w:r>
+            <w:proofErr w:type="spellEnd"/>
           </w:p>
         </w:tc>
         <w:tc>
           <w:tcPr>
-            <w:tcW w:type="dxa" w:w="4608"/>
-            <w:shd w:val="clear" w:fill="EFF3F8"/>
+            <w:tcW w:w="4608" w:type="dxa"/>
+            <w:shd w:val="clear" w:color="auto" w:fill="EFF3F8"/>
           </w:tcPr>
           <w:p>
-            <w:r/>
             <w:r>
               <w:rPr>
                 <w:sz w:val="18"/>
@@ -4005,11 +4091,10 @@
         </w:tc>
         <w:tc>
           <w:tcPr>
-            <w:tcW w:type="dxa" w:w="1728"/>
-            <w:shd w:val="clear" w:fill="EFF3F8"/>
+            <w:tcW w:w="1728" w:type="dxa"/>
+            <w:shd w:val="clear" w:color="auto" w:fill="EFF3F8"/>
           </w:tcPr>
           <w:p>
-            <w:r/>
             <w:r>
               <w:rPr>
                 <w:sz w:val="18"/>
@@ -4020,26 +4105,29 @@
         </w:tc>
       </w:tr>
       <w:tr>
+        <w:trPr>
+          <w:jc w:val="center"/>
+        </w:trPr>
         <w:tc>
           <w:tcPr>
-            <w:tcW w:type="dxa" w:w="2592"/>
+            <w:tcW w:w="2592" w:type="dxa"/>
           </w:tcPr>
           <w:p>
-            <w:r/>
+            <w:proofErr w:type="spellStart"/>
             <w:r>
               <w:rPr>
                 <w:sz w:val="18"/>
               </w:rPr>
               <w:t>cpi_volatility</w:t>
             </w:r>
+            <w:proofErr w:type="spellEnd"/>
           </w:p>
         </w:tc>
         <w:tc>
           <w:tcPr>
-            <w:tcW w:type="dxa" w:w="4608"/>
+            <w:tcW w:w="4608" w:type="dxa"/>
           </w:tcPr>
           <w:p>
-            <w:r/>
             <w:r>
               <w:rPr>
                 <w:sz w:val="18"/>
@@ -4050,10 +4138,9 @@
         </w:tc>
         <w:tc>
           <w:tcPr>
-            <w:tcW w:type="dxa" w:w="1728"/>
+            <w:tcW w:w="1728" w:type="dxa"/>
           </w:tcPr>
           <w:p>
-            <w:r/>
             <w:r>
               <w:rPr>
                 <w:sz w:val="18"/>
@@ -4064,43 +4151,59 @@
         </w:tc>
       </w:tr>
       <w:tr>
+        <w:trPr>
+          <w:jc w:val="center"/>
+        </w:trPr>
         <w:tc>
           <w:tcPr>
-            <w:tcW w:type="dxa" w:w="2592"/>
-            <w:shd w:val="clear" w:fill="EFF3F8"/>
+            <w:tcW w:w="2592" w:type="dxa"/>
+            <w:shd w:val="clear" w:color="auto" w:fill="EFF3F8"/>
           </w:tcPr>
           <w:p>
-            <w:r/>
+            <w:proofErr w:type="spellStart"/>
             <w:r>
               <w:rPr>
                 <w:sz w:val="18"/>
               </w:rPr>
               <w:t>income_mean_latest</w:t>
             </w:r>
+            <w:proofErr w:type="spellEnd"/>
           </w:p>
         </w:tc>
         <w:tc>
           <w:tcPr>
-            <w:tcW w:type="dxa" w:w="4608"/>
-            <w:shd w:val="clear" w:fill="EFF3F8"/>
+            <w:tcW w:w="4608" w:type="dxa"/>
+            <w:shd w:val="clear" w:color="auto" w:fill="EFF3F8"/>
           </w:tcPr>
           <w:p>
-            <w:r/>
-            <w:r>
-              <w:rPr>
-                <w:sz w:val="18"/>
-              </w:rPr>
-              <w:t>Most recent survey mean gross monthly household income</w:t>
+            <w:r>
+              <w:rPr>
+                <w:sz w:val="18"/>
+              </w:rPr>
+              <w:t xml:space="preserve">Most recent </w:t>
+            </w:r>
+            <w:proofErr w:type="gramStart"/>
+            <w:r>
+              <w:rPr>
+                <w:sz w:val="18"/>
+              </w:rPr>
+              <w:t>survey</w:t>
+            </w:r>
+            <w:proofErr w:type="gramEnd"/>
+            <w:r>
+              <w:rPr>
+                <w:sz w:val="18"/>
+              </w:rPr>
+              <w:t xml:space="preserve"> mean gross monthly household income</w:t>
             </w:r>
           </w:p>
         </w:tc>
         <w:tc>
           <w:tcPr>
-            <w:tcW w:type="dxa" w:w="1728"/>
-            <w:shd w:val="clear" w:fill="EFF3F8"/>
+            <w:tcW w:w="1728" w:type="dxa"/>
+            <w:shd w:val="clear" w:color="auto" w:fill="EFF3F8"/>
           </w:tcPr>
           <w:p>
-            <w:r/>
             <w:r>
               <w:rPr>
                 <w:sz w:val="18"/>
@@ -4111,26 +4214,29 @@
         </w:tc>
       </w:tr>
       <w:tr>
+        <w:trPr>
+          <w:jc w:val="center"/>
+        </w:trPr>
         <w:tc>
           <w:tcPr>
-            <w:tcW w:type="dxa" w:w="2592"/>
+            <w:tcW w:w="2592" w:type="dxa"/>
           </w:tcPr>
           <w:p>
-            <w:r/>
+            <w:proofErr w:type="spellStart"/>
             <w:r>
               <w:rPr>
                 <w:sz w:val="18"/>
               </w:rPr>
               <w:t>income_median_latest</w:t>
             </w:r>
+            <w:proofErr w:type="spellEnd"/>
           </w:p>
         </w:tc>
         <w:tc>
           <w:tcPr>
-            <w:tcW w:type="dxa" w:w="4608"/>
+            <w:tcW w:w="4608" w:type="dxa"/>
           </w:tcPr>
           <w:p>
-            <w:r/>
             <w:r>
               <w:rPr>
                 <w:sz w:val="18"/>
@@ -4141,10 +4247,9 @@
         </w:tc>
         <w:tc>
           <w:tcPr>
-            <w:tcW w:type="dxa" w:w="1728"/>
+            <w:tcW w:w="1728" w:type="dxa"/>
           </w:tcPr>
           <w:p>
-            <w:r/>
             <w:r>
               <w:rPr>
                 <w:sz w:val="18"/>
@@ -4165,11 +4270,23 @@
         <w:spacing w:after="120"/>
       </w:pPr>
       <w:r>
-        <w:rPr>
-          <w:b w:val="0"/>
-          <w:i w:val="0"/>
-        </w:rPr>
-        <w:t>For dimensionality reduction and visualisation, Principal Component Analysis (PCA) projected the five standardised features onto two components before plotting the cluster assignments in 2D space.</w:t>
+        <w:t xml:space="preserve">For dimensionality reduction and </w:t>
+      </w:r>
+      <w:proofErr w:type="spellStart"/>
+      <w:r>
+        <w:t>visualisation</w:t>
+      </w:r>
+      <w:proofErr w:type="spellEnd"/>
+      <w:r>
+        <w:t xml:space="preserve">, Principal Component Analysis (PCA) projected the five </w:t>
+      </w:r>
+      <w:proofErr w:type="spellStart"/>
+      <w:r>
+        <w:t>standardised</w:t>
+      </w:r>
+      <w:proofErr w:type="spellEnd"/>
+      <w:r>
+        <w:t xml:space="preserve"> features onto two components before plotting the cluster assignments in 2D space.</w:t>
       </w:r>
     </w:p>
     <w:p>
@@ -4185,10 +4302,6 @@
         <w:spacing w:after="120"/>
       </w:pPr>
       <w:r>
-        <w:rPr>
-          <w:b w:val="0"/>
-          <w:i w:val="0"/>
-        </w:rPr>
         <w:t>For the ARIMA forecasting task, the last 24 months of the overall inflation series form the hold-out test set; all earlier months form the training set. An Augmented Dickey–Fuller (ADF) stationarity test is run on the training series before fitting to determine the differencing order d. The ADF test returned p = 0.0003 (stationary), so d = 0 was used. After the test-set error is measured, the model is refit on the complete series to generate the genuine out-of-sample forecast.</w:t>
       </w:r>
     </w:p>
@@ -4197,11 +4310,23 @@
         <w:spacing w:after="120"/>
       </w:pPr>
       <w:r>
-        <w:rPr>
-          <w:b w:val="0"/>
-          <w:i w:val="0"/>
-        </w:rPr>
-        <w:t>For clustering the task is unsupervised and uses all 16 states; there is no labelled target, so model quality is assessed with internal validity indices (silhouette, Davies–Bouldin, Calinski–Harabasz) and cross-validated by running two different algorithms on the same data.</w:t>
+        <w:t xml:space="preserve">For clustering the task is unsupervised and uses all 16 states; there is no labelled target, so model quality is assessed with internal validity indices (silhouette, Davies–Bouldin, </w:t>
+      </w:r>
+      <w:proofErr w:type="spellStart"/>
+      <w:r>
+        <w:t>Calinski</w:t>
+      </w:r>
+      <w:proofErr w:type="spellEnd"/>
+      <w:r>
+        <w:t>–</w:t>
+      </w:r>
+      <w:proofErr w:type="spellStart"/>
+      <w:r>
+        <w:t>Harabasz</w:t>
+      </w:r>
+      <w:proofErr w:type="spellEnd"/>
+      <w:r>
+        <w:t>) and cross-validated by running two different algorithms on the same data.</w:t>
       </w:r>
     </w:p>
     <w:p>
@@ -4217,7 +4342,7 @@
         <w:pStyle w:val="Heading3"/>
       </w:pPr>
       <w:r>
-        <w:t>3.3.1  Time-series — ARIMA</w:t>
+        <w:t xml:space="preserve">  Time-series — ARIMA</w:t>
       </w:r>
     </w:p>
     <w:p>
@@ -4225,11 +4350,23 @@
         <w:spacing w:after="120"/>
       </w:pPr>
       <w:r>
-        <w:rPr>
-          <w:b w:val="0"/>
-          <w:i w:val="0"/>
-        </w:rPr>
-        <w:t>A BIC grid search over p ∈ [0,4] and q ∈ [0,4] selected ARIMA(4,0,4) for the overall inflation series (AIC = 926.15, BIC = 969.14). BIC was chosen over AIC because its stronger complexity penalty yields more parsimonious models that generalise better on a moderately long monthly series. ARIMA is well suited to this data: it is a univariate series with no strong seasonality after year-on-year differencing, and it produces interpretable forecasts with confidence intervals — valuable for policy communication.</w:t>
+        <w:t xml:space="preserve">A BIC grid search over p ∈ [0,4] and q ∈ [0,4] selected </w:t>
+      </w:r>
+      <w:proofErr w:type="gramStart"/>
+      <w:r>
+        <w:t>ARIMA(</w:t>
+      </w:r>
+      <w:proofErr w:type="gramEnd"/>
+      <w:r>
+        <w:t xml:space="preserve">4,0,4) for the overall inflation series (AIC = 926.15, BIC = 969.14). BIC was chosen over AIC because its stronger complexity penalty yields more parsimonious models that </w:t>
+      </w:r>
+      <w:proofErr w:type="spellStart"/>
+      <w:r>
+        <w:t>generalise</w:t>
+      </w:r>
+      <w:proofErr w:type="spellEnd"/>
+      <w:r>
+        <w:t xml:space="preserve"> better on a moderately long monthly series. ARIMA is well suited to this data: it is a univariate series with no strong seasonality after year-on-year differencing, and it produces interpretable forecasts with confidence intervals — valuable for policy communication.</w:t>
       </w:r>
     </w:p>
     <w:p>
@@ -4237,22 +4374,27 @@
         <w:jc w:val="center"/>
       </w:pPr>
       <w:r>
+        <w:rPr>
+          <w:noProof/>
+        </w:rPr>
+        <w:lastRenderedPageBreak/>
         <w:drawing>
-          <wp:inline xmlns:a="http://schemas.openxmlformats.org/drawingml/2006/main" xmlns:pic="http://schemas.openxmlformats.org/drawingml/2006/picture">
+          <wp:inline distT="0" distB="0" distL="0" distR="0" wp14:anchorId="62A2894F" wp14:editId="107A75B1">
             <wp:extent cx="5486400" cy="1712883"/>
+            <wp:effectExtent l="0" t="0" r="0" b="0"/>
             <wp:docPr id="144" name="Picture 144"/>
             <wp:cNvGraphicFramePr>
-              <a:graphicFrameLocks noChangeAspect="1"/>
+              <a:graphicFrameLocks xmlns:a="http://schemas.openxmlformats.org/drawingml/2006/main" noChangeAspect="1"/>
             </wp:cNvGraphicFramePr>
-            <a:graphic>
+            <a:graphic xmlns:a="http://schemas.openxmlformats.org/drawingml/2006/main">
               <a:graphicData uri="http://schemas.openxmlformats.org/drawingml/2006/picture">
-                <pic:pic>
+                <pic:pic xmlns:pic="http://schemas.openxmlformats.org/drawingml/2006/picture">
                   <pic:nvPicPr>
                     <pic:cNvPr id="0" name="ts_forecast.png"/>
                     <pic:cNvPicPr/>
                   </pic:nvPicPr>
                   <pic:blipFill>
-                    <a:blip r:embed="rId53"/>
+                    <a:blip r:embed="rId9"/>
                     <a:stretch>
                       <a:fillRect/>
                     </a:stretch>
@@ -4262,7 +4404,9 @@
                       <a:off x="0" y="0"/>
                       <a:ext cx="5486400" cy="1712883"/>
                     </a:xfrm>
-                    <a:prstGeom prst="rect"/>
+                    <a:prstGeom prst="rect">
+                      <a:avLst/>
+                    </a:prstGeom>
                   </pic:spPr>
                 </pic:pic>
               </a:graphicData>
@@ -4281,7 +4425,39 @@
           <w:i/>
           <w:sz w:val="18"/>
         </w:rPr>
-        <w:t>Figure 1. ARIMA(4,0,4) — train series, test-period fit, and 24-month forecast with 95% confidence interval.</w:t>
+        <w:t xml:space="preserve">Figure 1. </w:t>
+      </w:r>
+      <w:proofErr w:type="gramStart"/>
+      <w:r>
+        <w:rPr>
+          <w:i/>
+          <w:sz w:val="18"/>
+        </w:rPr>
+        <w:t>ARIMA(</w:t>
+      </w:r>
+      <w:proofErr w:type="gramEnd"/>
+      <w:r>
+        <w:rPr>
+          <w:i/>
+          <w:sz w:val="18"/>
+        </w:rPr>
+        <w:t>4,0,</w:t>
+      </w:r>
+      <w:proofErr w:type="gramStart"/>
+      <w:r>
+        <w:rPr>
+          <w:i/>
+          <w:sz w:val="18"/>
+        </w:rPr>
+        <w:t>4) —</w:t>
+      </w:r>
+      <w:proofErr w:type="gramEnd"/>
+      <w:r>
+        <w:rPr>
+          <w:i/>
+          <w:sz w:val="18"/>
+        </w:rPr>
+        <w:t xml:space="preserve"> train series, test-period fit, and 24-month forecast with 95% confidence interval.</w:t>
       </w:r>
     </w:p>
     <w:p>
@@ -4290,7 +4466,6 @@
       </w:pPr>
       <w:r>
         <w:rPr>
-          <w:b w:val="0"/>
           <w:i/>
         </w:rPr>
         <w:t>[Figure not found: ts_test_evaluation.png]</w:t>
@@ -4301,7 +4476,7 @@
         <w:pStyle w:val="Heading3"/>
       </w:pPr>
       <w:r>
-        <w:t>3.3.2  Clustering — K-Means and Agglomerative Hierarchical</w:t>
+        <w:t xml:space="preserve">  Clustering — K-Means and Agglomerative Hierarchical</w:t>
       </w:r>
     </w:p>
     <w:p>
@@ -4309,10 +4484,6 @@
         <w:spacing w:after="120"/>
       </w:pPr>
       <w:r>
-        <w:rPr>
-          <w:b w:val="0"/>
-          <w:i w:val="0"/>
-        </w:rPr>
         <w:t>The optimal number of clusters was selected by computing three independent criteria for k = 2 to 8: the elbow (within-cluster sum of squares), the silhouette score (higher is better), and the Davies–Bouldin index (lower is better). All three criteria agreed on k = 2 — the silhouette score peaks at 0.5764 before declining for larger k.</w:t>
       </w:r>
     </w:p>
@@ -4321,22 +4492,26 @@
         <w:jc w:val="center"/>
       </w:pPr>
       <w:r>
+        <w:rPr>
+          <w:noProof/>
+        </w:rPr>
         <w:drawing>
-          <wp:inline xmlns:a="http://schemas.openxmlformats.org/drawingml/2006/main" xmlns:pic="http://schemas.openxmlformats.org/drawingml/2006/picture">
+          <wp:inline distT="0" distB="0" distL="0" distR="0" wp14:anchorId="4501C08C" wp14:editId="6F448C01">
             <wp:extent cx="5486400" cy="1465902"/>
+            <wp:effectExtent l="0" t="0" r="0" b="0"/>
             <wp:docPr id="145" name="Picture 145"/>
             <wp:cNvGraphicFramePr>
-              <a:graphicFrameLocks noChangeAspect="1"/>
+              <a:graphicFrameLocks xmlns:a="http://schemas.openxmlformats.org/drawingml/2006/main" noChangeAspect="1"/>
             </wp:cNvGraphicFramePr>
-            <a:graphic>
+            <a:graphic xmlns:a="http://schemas.openxmlformats.org/drawingml/2006/main">
               <a:graphicData uri="http://schemas.openxmlformats.org/drawingml/2006/picture">
-                <pic:pic>
+                <pic:pic xmlns:pic="http://schemas.openxmlformats.org/drawingml/2006/picture">
                   <pic:nvPicPr>
                     <pic:cNvPr id="0" name="image.png"/>
                     <pic:cNvPicPr/>
                   </pic:nvPicPr>
                   <pic:blipFill>
-                    <a:blip r:embed="rId44"/>
+                    <a:blip r:embed="rId10"/>
                     <a:stretch>
                       <a:fillRect/>
                     </a:stretch>
@@ -4346,7 +4521,9 @@
                       <a:off x="0" y="0"/>
                       <a:ext cx="5486400" cy="1465902"/>
                     </a:xfrm>
-                    <a:prstGeom prst="rect"/>
+                    <a:prstGeom prst="rect">
+                      <a:avLst/>
+                    </a:prstGeom>
                   </pic:spPr>
                 </pic:pic>
               </a:graphicData>
@@ -4373,11 +4550,23 @@
         <w:spacing w:after="120"/>
       </w:pPr>
       <w:r>
-        <w:rPr>
-          <w:b w:val="0"/>
-          <w:i w:val="0"/>
-        </w:rPr>
-        <w:t>Two algorithms were fit at k = 2. K-Means partitions states to minimise within-cluster variance; Agglomerative (Ward-linkage) hierarchical clustering builds groups bottom-up by repeatedly merging the least-costly pair. Running both provides a cross-validation of structure — if independent algorithms recover the same groups the clusters are likely genuine rather than artefacts.</w:t>
+        <w:t xml:space="preserve">Two algorithms </w:t>
+      </w:r>
+      <w:proofErr w:type="gramStart"/>
+      <w:r>
+        <w:t>were fit</w:t>
+      </w:r>
+      <w:proofErr w:type="gramEnd"/>
+      <w:r>
+        <w:t xml:space="preserve"> at k = 2. K-Means partitions states to </w:t>
+      </w:r>
+      <w:proofErr w:type="spellStart"/>
+      <w:r>
+        <w:t>minimise</w:t>
+      </w:r>
+      <w:proofErr w:type="spellEnd"/>
+      <w:r>
+        <w:t xml:space="preserve"> within-cluster variance; Agglomerative (Ward-linkage) hierarchical clustering builds groups bottom-up by repeatedly merging the least-costly pair. Running both provides a cross-validation of structure — if independent algorithms recover the same groups the clusters are likely genuine rather than artefacts.</w:t>
       </w:r>
     </w:p>
     <w:p>
@@ -4385,22 +4574,27 @@
         <w:jc w:val="center"/>
       </w:pPr>
       <w:r>
+        <w:rPr>
+          <w:noProof/>
+        </w:rPr>
+        <w:lastRenderedPageBreak/>
         <w:drawing>
-          <wp:inline xmlns:a="http://schemas.openxmlformats.org/drawingml/2006/main" xmlns:pic="http://schemas.openxmlformats.org/drawingml/2006/picture">
+          <wp:inline distT="0" distB="0" distL="0" distR="0" wp14:anchorId="33BBF7B4" wp14:editId="4D1A7940">
             <wp:extent cx="5120640" cy="3571938"/>
+            <wp:effectExtent l="0" t="0" r="0" b="0"/>
             <wp:docPr id="146" name="Picture 146"/>
             <wp:cNvGraphicFramePr>
-              <a:graphicFrameLocks noChangeAspect="1"/>
+              <a:graphicFrameLocks xmlns:a="http://schemas.openxmlformats.org/drawingml/2006/main" noChangeAspect="1"/>
             </wp:cNvGraphicFramePr>
-            <a:graphic>
+            <a:graphic xmlns:a="http://schemas.openxmlformats.org/drawingml/2006/main">
               <a:graphicData uri="http://schemas.openxmlformats.org/drawingml/2006/picture">
-                <pic:pic>
+                <pic:pic xmlns:pic="http://schemas.openxmlformats.org/drawingml/2006/picture">
                   <pic:nvPicPr>
                     <pic:cNvPr id="0" name="image.png"/>
                     <pic:cNvPicPr/>
                   </pic:nvPicPr>
                   <pic:blipFill>
-                    <a:blip r:embed="rId45"/>
+                    <a:blip r:embed="rId11"/>
                     <a:stretch>
                       <a:fillRect/>
                     </a:stretch>
@@ -4410,7 +4604,9 @@
                       <a:off x="0" y="0"/>
                       <a:ext cx="5120640" cy="3571938"/>
                     </a:xfrm>
-                    <a:prstGeom prst="rect"/>
+                    <a:prstGeom prst="rect">
+                      <a:avLst/>
+                    </a:prstGeom>
                   </pic:spPr>
                 </pic:pic>
               </a:graphicData>
@@ -4437,22 +4633,26 @@
         <w:jc w:val="center"/>
       </w:pPr>
       <w:r>
+        <w:rPr>
+          <w:noProof/>
+        </w:rPr>
         <w:drawing>
-          <wp:inline xmlns:a="http://schemas.openxmlformats.org/drawingml/2006/main" xmlns:pic="http://schemas.openxmlformats.org/drawingml/2006/picture">
+          <wp:inline distT="0" distB="0" distL="0" distR="0" wp14:anchorId="0BAA6352" wp14:editId="22B0F6D1">
             <wp:extent cx="5486400" cy="2257525"/>
+            <wp:effectExtent l="0" t="0" r="0" b="0"/>
             <wp:docPr id="147" name="Picture 147"/>
             <wp:cNvGraphicFramePr>
-              <a:graphicFrameLocks noChangeAspect="1"/>
+              <a:graphicFrameLocks xmlns:a="http://schemas.openxmlformats.org/drawingml/2006/main" noChangeAspect="1"/>
             </wp:cNvGraphicFramePr>
-            <a:graphic>
+            <a:graphic xmlns:a="http://schemas.openxmlformats.org/drawingml/2006/main">
               <a:graphicData uri="http://schemas.openxmlformats.org/drawingml/2006/picture">
-                <pic:pic>
+                <pic:pic xmlns:pic="http://schemas.openxmlformats.org/drawingml/2006/picture">
                   <pic:nvPicPr>
                     <pic:cNvPr id="0" name="image.png"/>
                     <pic:cNvPicPr/>
                   </pic:nvPicPr>
                   <pic:blipFill>
-                    <a:blip r:embed="rId46"/>
+                    <a:blip r:embed="rId12"/>
                     <a:stretch>
                       <a:fillRect/>
                     </a:stretch>
@@ -4462,7 +4662,9 @@
                       <a:off x="0" y="0"/>
                       <a:ext cx="5486400" cy="2257525"/>
                     </a:xfrm>
-                    <a:prstGeom prst="rect"/>
+                    <a:prstGeom prst="rect">
+                      <a:avLst/>
+                    </a:prstGeom>
                   </pic:spPr>
                 </pic:pic>
               </a:graphicData>
@@ -4497,7 +4699,7 @@
         <w:pStyle w:val="Heading3"/>
       </w:pPr>
       <w:r>
-        <w:t>3.4.1  Forecast accuracy</w:t>
+        <w:t xml:space="preserve">  Forecast accuracy</w:t>
       </w:r>
     </w:p>
     <w:p>
@@ -4505,11 +4707,23 @@
         <w:spacing w:after="120"/>
       </w:pPr>
       <w:r>
-        <w:rPr>
-          <w:b w:val="0"/>
-          <w:i w:val="0"/>
-        </w:rPr>
-        <w:t>Forecast accuracy was measured on the held-out test set using MAE, RMSE, sMAPE and MASE. Plain MAPE is deliberately avoided: year-on-year inflation crosses zero, which makes percentage error undefined and unstable. sMAPE is bounded and symmetric, while MASE scales the error against a naive random-walk baseline (MASE &lt; 1 beats the baseline; MASE &gt; 1 is worse than it).</w:t>
+        <w:t xml:space="preserve">Forecast accuracy was measured on the held-out test set using MAE, RMSE, </w:t>
+      </w:r>
+      <w:proofErr w:type="spellStart"/>
+      <w:r>
+        <w:t>sMAPE</w:t>
+      </w:r>
+      <w:proofErr w:type="spellEnd"/>
+      <w:r>
+        <w:t xml:space="preserve"> and MASE. Plain MAPE is deliberately avoided: year-on-year inflation crosses zero, which makes percentage error undefined and unstable. </w:t>
+      </w:r>
+      <w:proofErr w:type="spellStart"/>
+      <w:r>
+        <w:t>sMAPE</w:t>
+      </w:r>
+      <w:proofErr w:type="spellEnd"/>
+      <w:r>
+        <w:t xml:space="preserve"> is bounded and symmetric, while MASE scales the error against a naive random-walk baseline (MASE &lt; 1 beats the baseline; MASE &gt; 1 is worse than it).</w:t>
       </w:r>
     </w:p>
     <w:p>
@@ -4526,9 +4740,8 @@
     </w:p>
     <w:tbl>
       <w:tblPr>
-        <w:tblW w:type="auto" w:w="0"/>
+        <w:tblW w:w="0" w:type="auto"/>
         <w:jc w:val="center"/>
-        <w:tblLook w:firstColumn="1" w:firstRow="1" w:lastColumn="0" w:lastRow="0" w:noHBand="0" w:noVBand="1" w:val="04A0"/>
         <w:tblBorders>
           <w:top w:val="single" w:sz="4" w:space="0" w:color="808080"/>
           <w:left w:val="single" w:sz="4" w:space="0" w:color="808080"/>
@@ -4537,26 +4750,29 @@
           <w:insideH w:val="single" w:sz="4" w:space="0" w:color="808080"/>
           <w:insideV w:val="single" w:sz="4" w:space="0" w:color="808080"/>
         </w:tblBorders>
+        <w:tblLook w:val="04A0" w:firstRow="1" w:lastRow="0" w:firstColumn="1" w:lastColumn="0" w:noHBand="0" w:noVBand="1"/>
       </w:tblPr>
       <w:tblGrid>
-        <w:gridCol w:w="1008"/>
-        <w:gridCol w:w="1008"/>
-        <w:gridCol w:w="1008"/>
-        <w:gridCol w:w="1008"/>
-        <w:gridCol w:w="1008"/>
-        <w:gridCol w:w="1008"/>
-        <w:gridCol w:w="1008"/>
-        <w:gridCol w:w="1008"/>
-        <w:gridCol w:w="1008"/>
+        <w:gridCol w:w="1712"/>
+        <w:gridCol w:w="1097"/>
+        <w:gridCol w:w="878"/>
+        <w:gridCol w:w="878"/>
+        <w:gridCol w:w="981"/>
+        <w:gridCol w:w="878"/>
+        <w:gridCol w:w="1112"/>
+        <w:gridCol w:w="878"/>
+        <w:gridCol w:w="878"/>
       </w:tblGrid>
       <w:tr>
+        <w:trPr>
+          <w:jc w:val="center"/>
+        </w:trPr>
         <w:tc>
           <w:tcPr>
-            <w:tcW w:type="dxa" w:w="2736"/>
-            <w:shd w:val="clear" w:fill="1F4E79"/>
+            <w:tcW w:w="2736" w:type="dxa"/>
+            <w:shd w:val="clear" w:color="auto" w:fill="1F4E79"/>
           </w:tcPr>
           <w:p>
-            <w:r/>
             <w:r>
               <w:rPr>
                 <w:b/>
@@ -4569,11 +4785,10 @@
         </w:tc>
         <w:tc>
           <w:tcPr>
-            <w:tcW w:type="dxa" w:w="1440"/>
-            <w:shd w:val="clear" w:fill="1F4E79"/>
+            <w:tcW w:w="1440" w:type="dxa"/>
+            <w:shd w:val="clear" w:color="auto" w:fill="1F4E79"/>
           </w:tcPr>
           <w:p>
-            <w:r/>
             <w:r>
               <w:rPr>
                 <w:b/>
@@ -4586,11 +4801,10 @@
         </w:tc>
         <w:tc>
           <w:tcPr>
-            <w:tcW w:type="dxa" w:w="1008"/>
-            <w:shd w:val="clear" w:fill="1F4E79"/>
+            <w:tcW w:w="1008" w:type="dxa"/>
+            <w:shd w:val="clear" w:color="auto" w:fill="1F4E79"/>
           </w:tcPr>
           <w:p>
-            <w:r/>
             <w:r>
               <w:rPr>
                 <w:b/>
@@ -4603,11 +4817,10 @@
         </w:tc>
         <w:tc>
           <w:tcPr>
-            <w:tcW w:type="dxa" w:w="1008"/>
-            <w:shd w:val="clear" w:fill="1F4E79"/>
+            <w:tcW w:w="1008" w:type="dxa"/>
+            <w:shd w:val="clear" w:color="auto" w:fill="1F4E79"/>
           </w:tcPr>
           <w:p>
-            <w:r/>
             <w:r>
               <w:rPr>
                 <w:b/>
@@ -4620,28 +4833,36 @@
         </w:tc>
         <w:tc>
           <w:tcPr>
-            <w:tcW w:type="dxa" w:w="1152"/>
-            <w:shd w:val="clear" w:fill="1F4E79"/>
+            <w:tcW w:w="1152" w:type="dxa"/>
+            <w:shd w:val="clear" w:color="auto" w:fill="1F4E79"/>
           </w:tcPr>
           <w:p>
-            <w:r/>
+            <w:proofErr w:type="spellStart"/>
             <w:r>
               <w:rPr>
                 <w:b/>
                 <w:color w:val="FFFFFF"/>
                 <w:sz w:val="18"/>
               </w:rPr>
-              <w:t>sMAPE (%)</w:t>
+              <w:t>sMAPE</w:t>
+            </w:r>
+            <w:proofErr w:type="spellEnd"/>
+            <w:r>
+              <w:rPr>
+                <w:b/>
+                <w:color w:val="FFFFFF"/>
+                <w:sz w:val="18"/>
+              </w:rPr>
+              <w:t xml:space="preserve"> (%)</w:t>
             </w:r>
           </w:p>
         </w:tc>
         <w:tc>
           <w:tcPr>
-            <w:tcW w:type="dxa" w:w="1008"/>
-            <w:shd w:val="clear" w:fill="1F4E79"/>
+            <w:tcW w:w="1008" w:type="dxa"/>
+            <w:shd w:val="clear" w:color="auto" w:fill="1F4E79"/>
           </w:tcPr>
           <w:p>
-            <w:r/>
             <w:r>
               <w:rPr>
                 <w:b/>
@@ -4654,11 +4875,10 @@
         </w:tc>
         <w:tc>
           <w:tcPr>
-            <w:tcW w:type="dxa" w:w="1296"/>
-            <w:shd w:val="clear" w:fill="1F4E79"/>
+            <w:tcW w:w="1296" w:type="dxa"/>
+            <w:shd w:val="clear" w:color="auto" w:fill="1F4E79"/>
           </w:tcPr>
           <w:p>
-            <w:r/>
             <w:r>
               <w:rPr>
                 <w:b/>
@@ -4671,11 +4891,10 @@
         </w:tc>
         <w:tc>
           <w:tcPr>
-            <w:tcW w:type="dxa" w:w="1008"/>
-            <w:shd w:val="clear" w:fill="1F4E79"/>
+            <w:tcW w:w="1008" w:type="dxa"/>
+            <w:shd w:val="clear" w:color="auto" w:fill="1F4E79"/>
           </w:tcPr>
           <w:p>
-            <w:r/>
             <w:r>
               <w:rPr>
                 <w:b/>
@@ -4688,11 +4907,10 @@
         </w:tc>
         <w:tc>
           <w:tcPr>
-            <w:tcW w:type="dxa" w:w="1008"/>
-            <w:shd w:val="clear" w:fill="1F4E79"/>
+            <w:tcW w:w="1008" w:type="dxa"/>
+            <w:shd w:val="clear" w:color="auto" w:fill="1F4E79"/>
           </w:tcPr>
           <w:p>
-            <w:r/>
             <w:r>
               <w:rPr>
                 <w:b/>
@@ -4705,12 +4923,14 @@
         </w:tc>
       </w:tr>
       <w:tr>
+        <w:trPr>
+          <w:jc w:val="center"/>
+        </w:trPr>
         <w:tc>
           <w:tcPr>
-            <w:tcW w:type="dxa" w:w="2736"/>
+            <w:tcW w:w="2736" w:type="dxa"/>
           </w:tcPr>
           <w:p>
-            <w:r/>
             <w:r>
               <w:rPr>
                 <w:sz w:val="18"/>
@@ -4721,10 +4941,9 @@
         </w:tc>
         <w:tc>
           <w:tcPr>
-            <w:tcW w:type="dxa" w:w="1440"/>
+            <w:tcW w:w="1440" w:type="dxa"/>
           </w:tcPr>
           <w:p>
-            <w:r/>
             <w:r>
               <w:rPr>
                 <w:sz w:val="18"/>
@@ -4735,10 +4954,9 @@
         </w:tc>
         <w:tc>
           <w:tcPr>
-            <w:tcW w:type="dxa" w:w="1008"/>
+            <w:tcW w:w="1008" w:type="dxa"/>
           </w:tcPr>
           <w:p>
-            <w:r/>
             <w:r>
               <w:rPr>
                 <w:sz w:val="18"/>
@@ -4749,10 +4967,9 @@
         </w:tc>
         <w:tc>
           <w:tcPr>
-            <w:tcW w:type="dxa" w:w="1008"/>
+            <w:tcW w:w="1008" w:type="dxa"/>
           </w:tcPr>
           <w:p>
-            <w:r/>
             <w:r>
               <w:rPr>
                 <w:sz w:val="18"/>
@@ -4763,10 +4980,9 @@
         </w:tc>
         <w:tc>
           <w:tcPr>
-            <w:tcW w:type="dxa" w:w="1152"/>
+            <w:tcW w:w="1152" w:type="dxa"/>
           </w:tcPr>
           <w:p>
-            <w:r/>
             <w:r>
               <w:rPr>
                 <w:sz w:val="18"/>
@@ -4777,10 +4993,9 @@
         </w:tc>
         <w:tc>
           <w:tcPr>
-            <w:tcW w:type="dxa" w:w="1008"/>
+            <w:tcW w:w="1008" w:type="dxa"/>
           </w:tcPr>
           <w:p>
-            <w:r/>
             <w:r>
               <w:rPr>
                 <w:sz w:val="18"/>
@@ -4791,10 +5006,9 @@
         </w:tc>
         <w:tc>
           <w:tcPr>
-            <w:tcW w:type="dxa" w:w="1296"/>
+            <w:tcW w:w="1296" w:type="dxa"/>
           </w:tcPr>
           <w:p>
-            <w:r/>
             <w:r>
               <w:rPr>
                 <w:sz w:val="18"/>
@@ -4805,10 +5019,9 @@
         </w:tc>
         <w:tc>
           <w:tcPr>
-            <w:tcW w:type="dxa" w:w="1008"/>
+            <w:tcW w:w="1008" w:type="dxa"/>
           </w:tcPr>
           <w:p>
-            <w:r/>
             <w:r>
               <w:rPr>
                 <w:sz w:val="18"/>
@@ -4819,10 +5032,9 @@
         </w:tc>
         <w:tc>
           <w:tcPr>
-            <w:tcW w:type="dxa" w:w="1008"/>
+            <w:tcW w:w="1008" w:type="dxa"/>
           </w:tcPr>
           <w:p>
-            <w:r/>
             <w:r>
               <w:rPr>
                 <w:sz w:val="18"/>
@@ -4843,11 +5055,19 @@
         <w:spacing w:after="120"/>
       </w:pPr>
       <w:r>
-        <w:rPr>
-          <w:b w:val="0"/>
-          <w:i w:val="0"/>
-        </w:rPr>
-        <w:t>The model forecasts overall CPI inflation in the range 2.10%–2.85% over the next 24 months. However, with MASE = 2.35 (&gt;1), the ARIMA model does not outperform a naive random-walk baseline (RMSE 1.0699 vs 0.3410) when forecasting the full 24-month block at once. This is an expected and honestly reported limitation: a stationary mean-reverting model collapses toward the series mean over long horizons, so a persistence baseline is hard to beat on a multi-step block. The model remains useful for characterising trend direction and uncertainty rather than for precise long-horizon point forecasts; a rolling one-step-ahead evaluation would be the appropriate test of short-horizon skill and is identified as future work.</w:t>
+        <w:t xml:space="preserve">The model forecasts overall CPI inflation in the range 2.10%–2.85% over the next 24 months. However, with MASE = 2.35 (&gt;1), the ARIMA model does not outperform a naive </w:t>
+      </w:r>
+      <w:r>
+        <w:lastRenderedPageBreak/>
+        <w:t xml:space="preserve">random-walk baseline (RMSE 1.0699 vs 0.3410) when forecasting the full 24-month block at once. This is an expected and honestly reported limitation: a stationary mean-reverting model collapses toward the series mean over long horizons, so a persistence baseline is hard to beat on a multi-step block. The model remains useful for </w:t>
+      </w:r>
+      <w:proofErr w:type="spellStart"/>
+      <w:r>
+        <w:t>characterising</w:t>
+      </w:r>
+      <w:proofErr w:type="spellEnd"/>
+      <w:r>
+        <w:t xml:space="preserve"> trend direction and uncertainty rather than for precise long-horizon point forecasts; a rolling one-step-ahead evaluation would be the appropriate test of short-horizon skill and is identified as future work.</w:t>
       </w:r>
     </w:p>
     <w:p>
@@ -4855,7 +5075,10 @@
         <w:pStyle w:val="Heading3"/>
       </w:pPr>
       <w:r>
-        <w:t>3.4.2  Clustering validity</w:t>
+        <w:t xml:space="preserve"> Clustering</w:t>
+      </w:r>
+      <w:r>
+        <w:t xml:space="preserve"> validity</w:t>
       </w:r>
     </w:p>
     <w:p>
@@ -4863,10 +5086,6 @@
         <w:spacing w:after="120"/>
       </w:pPr>
       <w:r>
-        <w:rPr>
-          <w:b w:val="0"/>
-          <w:i w:val="0"/>
-        </w:rPr>
         <w:t>K-Means and hierarchical clustering produced similar internal validity scores at k = 2, confirming the cluster structure is robust to algorithm choice.</w:t>
       </w:r>
     </w:p>
@@ -4884,9 +5103,8 @@
     </w:p>
     <w:tbl>
       <w:tblPr>
-        <w:tblW w:type="auto" w:w="0"/>
+        <w:tblW w:w="0" w:type="auto"/>
         <w:jc w:val="center"/>
-        <w:tblLook w:firstColumn="1" w:firstRow="1" w:lastColumn="0" w:lastRow="0" w:noHBand="0" w:noVBand="1" w:val="04A0"/>
         <w:tblBorders>
           <w:top w:val="single" w:sz="4" w:space="0" w:color="808080"/>
           <w:left w:val="single" w:sz="4" w:space="0" w:color="808080"/>
@@ -4895,22 +5113,25 @@
           <w:insideH w:val="single" w:sz="4" w:space="0" w:color="808080"/>
           <w:insideV w:val="single" w:sz="4" w:space="0" w:color="808080"/>
         </w:tblBorders>
+        <w:tblLook w:val="04A0" w:firstRow="1" w:lastRow="0" w:firstColumn="1" w:lastColumn="0" w:noHBand="0" w:noVBand="1"/>
       </w:tblPr>
       <w:tblGrid>
-        <w:gridCol w:w="1815"/>
-        <w:gridCol w:w="1815"/>
-        <w:gridCol w:w="1815"/>
-        <w:gridCol w:w="1815"/>
-        <w:gridCol w:w="1815"/>
+        <w:gridCol w:w="2458"/>
+        <w:gridCol w:w="812"/>
+        <w:gridCol w:w="1668"/>
+        <w:gridCol w:w="2041"/>
+        <w:gridCol w:w="2313"/>
       </w:tblGrid>
       <w:tr>
+        <w:trPr>
+          <w:jc w:val="center"/>
+        </w:trPr>
         <w:tc>
           <w:tcPr>
-            <w:tcW w:type="dxa" w:w="2592"/>
-            <w:shd w:val="clear" w:fill="1F4E79"/>
+            <w:tcW w:w="2592" w:type="dxa"/>
+            <w:shd w:val="clear" w:color="auto" w:fill="1F4E79"/>
           </w:tcPr>
           <w:p>
-            <w:r/>
             <w:r>
               <w:rPr>
                 <w:b/>
@@ -4923,11 +5144,10 @@
         </w:tc>
         <w:tc>
           <w:tcPr>
-            <w:tcW w:type="dxa" w:w="864"/>
-            <w:shd w:val="clear" w:fill="1F4E79"/>
+            <w:tcW w:w="864" w:type="dxa"/>
+            <w:shd w:val="clear" w:color="auto" w:fill="1F4E79"/>
           </w:tcPr>
           <w:p>
-            <w:r/>
             <w:r>
               <w:rPr>
                 <w:b/>
@@ -4940,11 +5160,10 @@
         </w:tc>
         <w:tc>
           <w:tcPr>
-            <w:tcW w:type="dxa" w:w="1728"/>
-            <w:shd w:val="clear" w:fill="1F4E79"/>
+            <w:tcW w:w="1728" w:type="dxa"/>
+            <w:shd w:val="clear" w:color="auto" w:fill="1F4E79"/>
           </w:tcPr>
           <w:p>
-            <w:r/>
             <w:r>
               <w:rPr>
                 <w:b/>
@@ -4957,11 +5176,10 @@
         </w:tc>
         <w:tc>
           <w:tcPr>
-            <w:tcW w:type="dxa" w:w="2160"/>
-            <w:shd w:val="clear" w:fill="1F4E79"/>
+            <w:tcW w:w="2160" w:type="dxa"/>
+            <w:shd w:val="clear" w:color="auto" w:fill="1F4E79"/>
           </w:tcPr>
           <w:p>
-            <w:r/>
             <w:r>
               <w:rPr>
                 <w:b/>
@@ -4974,29 +5192,48 @@
         </w:tc>
         <w:tc>
           <w:tcPr>
-            <w:tcW w:type="dxa" w:w="2448"/>
-            <w:shd w:val="clear" w:fill="1F4E79"/>
+            <w:tcW w:w="2448" w:type="dxa"/>
+            <w:shd w:val="clear" w:color="auto" w:fill="1F4E79"/>
           </w:tcPr>
           <w:p>
-            <w:r/>
             <w:r>
               <w:rPr>
                 <w:b/>
                 <w:color w:val="FFFFFF"/>
                 <w:sz w:val="18"/>
               </w:rPr>
-              <w:t>Calinski–Harabasz ↑</w:t>
+              <w:t>Calinski–</w:t>
+            </w:r>
+            <w:proofErr w:type="spellStart"/>
+            <w:r>
+              <w:rPr>
+                <w:b/>
+                <w:color w:val="FFFFFF"/>
+                <w:sz w:val="18"/>
+              </w:rPr>
+              <w:t>Harabasz</w:t>
+            </w:r>
+            <w:proofErr w:type="spellEnd"/>
+            <w:r>
+              <w:rPr>
+                <w:b/>
+                <w:color w:val="FFFFFF"/>
+                <w:sz w:val="18"/>
+              </w:rPr>
+              <w:t xml:space="preserve"> ↑</w:t>
             </w:r>
           </w:p>
         </w:tc>
       </w:tr>
       <w:tr>
+        <w:trPr>
+          <w:jc w:val="center"/>
+        </w:trPr>
         <w:tc>
           <w:tcPr>
-            <w:tcW w:type="dxa" w:w="2592"/>
+            <w:tcW w:w="2592" w:type="dxa"/>
           </w:tcPr>
           <w:p>
-            <w:r/>
             <w:r>
               <w:rPr>
                 <w:sz w:val="18"/>
@@ -5007,10 +5244,9 @@
         </w:tc>
         <w:tc>
           <w:tcPr>
-            <w:tcW w:type="dxa" w:w="864"/>
+            <w:tcW w:w="864" w:type="dxa"/>
           </w:tcPr>
           <w:p>
-            <w:r/>
             <w:r>
               <w:rPr>
                 <w:sz w:val="18"/>
@@ -5021,10 +5257,9 @@
         </w:tc>
         <w:tc>
           <w:tcPr>
-            <w:tcW w:type="dxa" w:w="1728"/>
+            <w:tcW w:w="1728" w:type="dxa"/>
           </w:tcPr>
           <w:p>
-            <w:r/>
             <w:r>
               <w:rPr>
                 <w:sz w:val="18"/>
@@ -5035,10 +5270,9 @@
         </w:tc>
         <w:tc>
           <w:tcPr>
-            <w:tcW w:type="dxa" w:w="2160"/>
+            <w:tcW w:w="2160" w:type="dxa"/>
           </w:tcPr>
           <w:p>
-            <w:r/>
             <w:r>
               <w:rPr>
                 <w:sz w:val="18"/>
@@ -5049,10 +5283,9 @@
         </w:tc>
         <w:tc>
           <w:tcPr>
-            <w:tcW w:type="dxa" w:w="2448"/>
+            <w:tcW w:w="2448" w:type="dxa"/>
           </w:tcPr>
           <w:p>
-            <w:r/>
             <w:r>
               <w:rPr>
                 <w:sz w:val="18"/>
@@ -5063,13 +5296,15 @@
         </w:tc>
       </w:tr>
       <w:tr>
+        <w:trPr>
+          <w:jc w:val="center"/>
+        </w:trPr>
         <w:tc>
           <w:tcPr>
-            <w:tcW w:type="dxa" w:w="2592"/>
-            <w:shd w:val="clear" w:fill="EFF3F8"/>
+            <w:tcW w:w="2592" w:type="dxa"/>
+            <w:shd w:val="clear" w:color="auto" w:fill="EFF3F8"/>
           </w:tcPr>
           <w:p>
-            <w:r/>
             <w:r>
               <w:rPr>
                 <w:sz w:val="18"/>
@@ -5080,11 +5315,10 @@
         </w:tc>
         <w:tc>
           <w:tcPr>
-            <w:tcW w:type="dxa" w:w="864"/>
-            <w:shd w:val="clear" w:fill="EFF3F8"/>
+            <w:tcW w:w="864" w:type="dxa"/>
+            <w:shd w:val="clear" w:color="auto" w:fill="EFF3F8"/>
           </w:tcPr>
           <w:p>
-            <w:r/>
             <w:r>
               <w:rPr>
                 <w:sz w:val="18"/>
@@ -5095,11 +5329,10 @@
         </w:tc>
         <w:tc>
           <w:tcPr>
-            <w:tcW w:type="dxa" w:w="1728"/>
-            <w:shd w:val="clear" w:fill="EFF3F8"/>
+            <w:tcW w:w="1728" w:type="dxa"/>
+            <w:shd w:val="clear" w:color="auto" w:fill="EFF3F8"/>
           </w:tcPr>
           <w:p>
-            <w:r/>
             <w:r>
               <w:rPr>
                 <w:sz w:val="18"/>
@@ -5110,11 +5343,10 @@
         </w:tc>
         <w:tc>
           <w:tcPr>
-            <w:tcW w:type="dxa" w:w="2160"/>
-            <w:shd w:val="clear" w:fill="EFF3F8"/>
+            <w:tcW w:w="2160" w:type="dxa"/>
+            <w:shd w:val="clear" w:color="auto" w:fill="EFF3F8"/>
           </w:tcPr>
           <w:p>
-            <w:r/>
             <w:r>
               <w:rPr>
                 <w:sz w:val="18"/>
@@ -5125,11 +5357,10 @@
         </w:tc>
         <w:tc>
           <w:tcPr>
-            <w:tcW w:type="dxa" w:w="2448"/>
-            <w:shd w:val="clear" w:fill="EFF3F8"/>
+            <w:tcW w:w="2448" w:type="dxa"/>
+            <w:shd w:val="clear" w:color="auto" w:fill="EFF3F8"/>
           </w:tcPr>
           <w:p>
-            <w:r/>
             <w:r>
               <w:rPr>
                 <w:sz w:val="18"/>
@@ -5150,22 +5381,26 @@
         <w:jc w:val="center"/>
       </w:pPr>
       <w:r>
+        <w:rPr>
+          <w:noProof/>
+        </w:rPr>
         <w:drawing>
-          <wp:inline xmlns:a="http://schemas.openxmlformats.org/drawingml/2006/main" xmlns:pic="http://schemas.openxmlformats.org/drawingml/2006/picture">
+          <wp:inline distT="0" distB="0" distL="0" distR="0" wp14:anchorId="79F961FA" wp14:editId="6F309A8B">
             <wp:extent cx="5120640" cy="3571938"/>
+            <wp:effectExtent l="0" t="0" r="0" b="0"/>
             <wp:docPr id="148" name="Picture 148"/>
             <wp:cNvGraphicFramePr>
-              <a:graphicFrameLocks noChangeAspect="1"/>
+              <a:graphicFrameLocks xmlns:a="http://schemas.openxmlformats.org/drawingml/2006/main" noChangeAspect="1"/>
             </wp:cNvGraphicFramePr>
-            <a:graphic>
+            <a:graphic xmlns:a="http://schemas.openxmlformats.org/drawingml/2006/main">
               <a:graphicData uri="http://schemas.openxmlformats.org/drawingml/2006/picture">
-                <pic:pic>
+                <pic:pic xmlns:pic="http://schemas.openxmlformats.org/drawingml/2006/picture">
                   <pic:nvPicPr>
                     <pic:cNvPr id="0" name="image.png"/>
                     <pic:cNvPicPr/>
                   </pic:nvPicPr>
                   <pic:blipFill>
-                    <a:blip r:embed="rId47"/>
+                    <a:blip r:embed="rId13"/>
                     <a:stretch>
                       <a:fillRect/>
                     </a:stretch>
@@ -5175,7 +5410,9 @@
                       <a:off x="0" y="0"/>
                       <a:ext cx="5120640" cy="3571938"/>
                     </a:xfrm>
-                    <a:prstGeom prst="rect"/>
+                    <a:prstGeom prst="rect">
+                      <a:avLst/>
+                    </a:prstGeom>
                   </pic:spPr>
                 </pic:pic>
               </a:graphicData>
@@ -5202,10 +5439,6 @@
         <w:spacing w:after="120"/>
       </w:pPr>
       <w:r>
-        <w:rPr>
-          <w:b w:val="0"/>
-          <w:i w:val="0"/>
-        </w:rPr>
         <w:t>The socioeconomic profile of each cluster:</w:t>
       </w:r>
     </w:p>
@@ -5223,9 +5456,8 @@
     </w:p>
     <w:tbl>
       <w:tblPr>
-        <w:tblW w:type="auto" w:w="0"/>
+        <w:tblW w:w="0" w:type="auto"/>
         <w:jc w:val="center"/>
-        <w:tblLook w:firstColumn="1" w:firstRow="1" w:lastColumn="0" w:lastRow="0" w:noHBand="0" w:noVBand="1" w:val="04A0"/>
         <w:tblBorders>
           <w:top w:val="single" w:sz="4" w:space="0" w:color="808080"/>
           <w:left w:val="single" w:sz="4" w:space="0" w:color="808080"/>
@@ -5234,22 +5466,25 @@
           <w:insideH w:val="single" w:sz="4" w:space="0" w:color="808080"/>
           <w:insideV w:val="single" w:sz="4" w:space="0" w:color="808080"/>
         </w:tblBorders>
+        <w:tblLook w:val="04A0" w:firstRow="1" w:lastRow="0" w:firstColumn="1" w:lastColumn="0" w:noHBand="0" w:noVBand="1"/>
       </w:tblPr>
       <w:tblGrid>
-        <w:gridCol w:w="1815"/>
-        <w:gridCol w:w="1815"/>
-        <w:gridCol w:w="1815"/>
-        <w:gridCol w:w="1815"/>
-        <w:gridCol w:w="1815"/>
+        <w:gridCol w:w="2968"/>
+        <w:gridCol w:w="986"/>
+        <w:gridCol w:w="1770"/>
+        <w:gridCol w:w="1784"/>
+        <w:gridCol w:w="1784"/>
       </w:tblGrid>
       <w:tr>
+        <w:trPr>
+          <w:jc w:val="center"/>
+        </w:trPr>
         <w:tc>
           <w:tcPr>
-            <w:tcW w:type="dxa" w:w="3168"/>
-            <w:shd w:val="clear" w:fill="1F4E79"/>
+            <w:tcW w:w="3168" w:type="dxa"/>
+            <w:shd w:val="clear" w:color="auto" w:fill="1F4E79"/>
           </w:tcPr>
           <w:p>
-            <w:r/>
             <w:r>
               <w:rPr>
                 <w:b/>
@@ -5262,11 +5497,10 @@
         </w:tc>
         <w:tc>
           <w:tcPr>
-            <w:tcW w:type="dxa" w:w="1008"/>
-            <w:shd w:val="clear" w:fill="1F4E79"/>
+            <w:tcW w:w="1008" w:type="dxa"/>
+            <w:shd w:val="clear" w:color="auto" w:fill="1F4E79"/>
           </w:tcPr>
           <w:p>
-            <w:r/>
             <w:r>
               <w:rPr>
                 <w:b/>
@@ -5279,11 +5513,10 @@
         </w:tc>
         <w:tc>
           <w:tcPr>
-            <w:tcW w:type="dxa" w:w="1872"/>
-            <w:shd w:val="clear" w:fill="1F4E79"/>
+            <w:tcW w:w="1872" w:type="dxa"/>
+            <w:shd w:val="clear" w:color="auto" w:fill="1F4E79"/>
           </w:tcPr>
           <w:p>
-            <w:r/>
             <w:r>
               <w:rPr>
                 <w:b/>
@@ -5296,11 +5529,10 @@
         </w:tc>
         <w:tc>
           <w:tcPr>
-            <w:tcW w:type="dxa" w:w="1872"/>
-            <w:shd w:val="clear" w:fill="1F4E79"/>
+            <w:tcW w:w="1872" w:type="dxa"/>
+            <w:shd w:val="clear" w:color="auto" w:fill="1F4E79"/>
           </w:tcPr>
           <w:p>
-            <w:r/>
             <w:r>
               <w:rPr>
                 <w:b/>
@@ -5313,11 +5545,10 @@
         </w:tc>
         <w:tc>
           <w:tcPr>
-            <w:tcW w:type="dxa" w:w="1872"/>
-            <w:shd w:val="clear" w:fill="1F4E79"/>
+            <w:tcW w:w="1872" w:type="dxa"/>
+            <w:shd w:val="clear" w:color="auto" w:fill="1F4E79"/>
           </w:tcPr>
           <w:p>
-            <w:r/>
             <w:r>
               <w:rPr>
                 <w:b/>
@@ -5330,12 +5561,14 @@
         </w:tc>
       </w:tr>
       <w:tr>
+        <w:trPr>
+          <w:jc w:val="center"/>
+        </w:trPr>
         <w:tc>
           <w:tcPr>
-            <w:tcW w:type="dxa" w:w="3168"/>
+            <w:tcW w:w="3168" w:type="dxa"/>
           </w:tcPr>
           <w:p>
-            <w:r/>
             <w:r>
               <w:rPr>
                 <w:sz w:val="18"/>
@@ -5346,10 +5579,9 @@
         </w:tc>
         <w:tc>
           <w:tcPr>
-            <w:tcW w:type="dxa" w:w="1008"/>
+            <w:tcW w:w="1008" w:type="dxa"/>
           </w:tcPr>
           <w:p>
-            <w:r/>
             <w:r>
               <w:rPr>
                 <w:sz w:val="18"/>
@@ -5360,10 +5592,9 @@
         </w:tc>
         <w:tc>
           <w:tcPr>
-            <w:tcW w:type="dxa" w:w="1872"/>
+            <w:tcW w:w="1872" w:type="dxa"/>
           </w:tcPr>
           <w:p>
-            <w:r/>
             <w:r>
               <w:rPr>
                 <w:sz w:val="18"/>
@@ -5374,10 +5605,9 @@
         </w:tc>
         <w:tc>
           <w:tcPr>
-            <w:tcW w:type="dxa" w:w="1872"/>
+            <w:tcW w:w="1872" w:type="dxa"/>
           </w:tcPr>
           <w:p>
-            <w:r/>
             <w:r>
               <w:rPr>
                 <w:sz w:val="18"/>
@@ -5388,10 +5618,9 @@
         </w:tc>
         <w:tc>
           <w:tcPr>
-            <w:tcW w:type="dxa" w:w="1872"/>
+            <w:tcW w:w="1872" w:type="dxa"/>
           </w:tcPr>
           <w:p>
-            <w:r/>
             <w:r>
               <w:rPr>
                 <w:sz w:val="18"/>
@@ -5402,13 +5631,15 @@
         </w:tc>
       </w:tr>
       <w:tr>
+        <w:trPr>
+          <w:jc w:val="center"/>
+        </w:trPr>
         <w:tc>
           <w:tcPr>
-            <w:tcW w:type="dxa" w:w="3168"/>
-            <w:shd w:val="clear" w:fill="EFF3F8"/>
+            <w:tcW w:w="3168" w:type="dxa"/>
+            <w:shd w:val="clear" w:color="auto" w:fill="EFF3F8"/>
           </w:tcPr>
           <w:p>
-            <w:r/>
             <w:r>
               <w:rPr>
                 <w:sz w:val="18"/>
@@ -5419,11 +5650,10 @@
         </w:tc>
         <w:tc>
           <w:tcPr>
-            <w:tcW w:type="dxa" w:w="1008"/>
-            <w:shd w:val="clear" w:fill="EFF3F8"/>
+            <w:tcW w:w="1008" w:type="dxa"/>
+            <w:shd w:val="clear" w:color="auto" w:fill="EFF3F8"/>
           </w:tcPr>
           <w:p>
-            <w:r/>
             <w:r>
               <w:rPr>
                 <w:sz w:val="18"/>
@@ -5434,11 +5664,10 @@
         </w:tc>
         <w:tc>
           <w:tcPr>
-            <w:tcW w:type="dxa" w:w="1872"/>
-            <w:shd w:val="clear" w:fill="EFF3F8"/>
+            <w:tcW w:w="1872" w:type="dxa"/>
+            <w:shd w:val="clear" w:color="auto" w:fill="EFF3F8"/>
           </w:tcPr>
           <w:p>
-            <w:r/>
             <w:r>
               <w:rPr>
                 <w:sz w:val="18"/>
@@ -5449,11 +5678,10 @@
         </w:tc>
         <w:tc>
           <w:tcPr>
-            <w:tcW w:type="dxa" w:w="1872"/>
-            <w:shd w:val="clear" w:fill="EFF3F8"/>
+            <w:tcW w:w="1872" w:type="dxa"/>
+            <w:shd w:val="clear" w:color="auto" w:fill="EFF3F8"/>
           </w:tcPr>
           <w:p>
-            <w:r/>
             <w:r>
               <w:rPr>
                 <w:sz w:val="18"/>
@@ -5464,11 +5692,10 @@
         </w:tc>
         <w:tc>
           <w:tcPr>
-            <w:tcW w:type="dxa" w:w="1872"/>
-            <w:shd w:val="clear" w:fill="EFF3F8"/>
+            <w:tcW w:w="1872" w:type="dxa"/>
+            <w:shd w:val="clear" w:color="auto" w:fill="EFF3F8"/>
           </w:tcPr>
           <w:p>
-            <w:r/>
             <w:r>
               <w:rPr>
                 <w:sz w:val="18"/>
@@ -5489,22 +5716,27 @@
         <w:jc w:val="center"/>
       </w:pPr>
       <w:r>
+        <w:rPr>
+          <w:noProof/>
+        </w:rPr>
+        <w:lastRenderedPageBreak/>
         <w:drawing>
-          <wp:inline xmlns:a="http://schemas.openxmlformats.org/drawingml/2006/main" xmlns:pic="http://schemas.openxmlformats.org/drawingml/2006/picture">
+          <wp:inline distT="0" distB="0" distL="0" distR="0" wp14:anchorId="36A5C7E6" wp14:editId="10F290B5">
             <wp:extent cx="5486400" cy="1948165"/>
+            <wp:effectExtent l="0" t="0" r="0" b="0"/>
             <wp:docPr id="149" name="Picture 149"/>
             <wp:cNvGraphicFramePr>
-              <a:graphicFrameLocks noChangeAspect="1"/>
+              <a:graphicFrameLocks xmlns:a="http://schemas.openxmlformats.org/drawingml/2006/main" noChangeAspect="1"/>
             </wp:cNvGraphicFramePr>
-            <a:graphic>
+            <a:graphic xmlns:a="http://schemas.openxmlformats.org/drawingml/2006/main">
               <a:graphicData uri="http://schemas.openxmlformats.org/drawingml/2006/picture">
-                <pic:pic>
+                <pic:pic xmlns:pic="http://schemas.openxmlformats.org/drawingml/2006/picture">
                   <pic:nvPicPr>
                     <pic:cNvPr id="0" name="image.png"/>
                     <pic:cNvPicPr/>
                   </pic:nvPicPr>
                   <pic:blipFill>
-                    <a:blip r:embed="rId48"/>
+                    <a:blip r:embed="rId14"/>
                     <a:stretch>
                       <a:fillRect/>
                     </a:stretch>
@@ -5514,7 +5746,9 @@
                       <a:off x="0" y="0"/>
                       <a:ext cx="5486400" cy="1948165"/>
                     </a:xfrm>
-                    <a:prstGeom prst="rect"/>
+                    <a:prstGeom prst="rect">
+                      <a:avLst/>
+                    </a:prstGeom>
                   </pic:spPr>
                 </pic:pic>
               </a:graphicData>
@@ -5533,7 +5767,23 @@
           <w:i/>
           <w:sz w:val="18"/>
         </w:rPr>
-        <w:t>Figure 6. Cluster feature heatmap (left) and state counts per cluster (right).</w:t>
+        <w:t xml:space="preserve">Figure 6. Cluster </w:t>
+      </w:r>
+      <w:proofErr w:type="gramStart"/>
+      <w:r>
+        <w:rPr>
+          <w:i/>
+          <w:sz w:val="18"/>
+        </w:rPr>
+        <w:t>feature</w:t>
+      </w:r>
+      <w:proofErr w:type="gramEnd"/>
+      <w:r>
+        <w:rPr>
+          <w:i/>
+          <w:sz w:val="18"/>
+        </w:rPr>
+        <w:t xml:space="preserve"> heatmap (left) and state counts per cluster (right).</w:t>
       </w:r>
     </w:p>
     <w:p>
@@ -5541,7 +5791,7 @@
         <w:pStyle w:val="Heading3"/>
       </w:pPr>
       <w:r>
-        <w:t>3.4.3  Fuel price and CPI correlation</w:t>
+        <w:t xml:space="preserve">  Fuel price and CPI correlation</w:t>
       </w:r>
     </w:p>
     <w:p>
@@ -5549,10 +5799,6 @@
         <w:spacing w:after="120"/>
       </w:pPr>
       <w:r>
-        <w:rPr>
-          <w:b w:val="0"/>
-          <w:i w:val="0"/>
-        </w:rPr>
         <w:t>Retail fuel prices show a positive contemporaneous correlation with overall CPI inflation. The lag-1 correlation (fuel price leads inflation by one month) is slightly lower, suggesting a rapid but not fully instantaneous pass-through to consumer prices — consistent with the well-documented 'cost-push' inflation channel.</w:t>
       </w:r>
     </w:p>
@@ -5561,22 +5807,26 @@
         <w:jc w:val="center"/>
       </w:pPr>
       <w:r>
+        <w:rPr>
+          <w:noProof/>
+        </w:rPr>
         <w:drawing>
-          <wp:inline xmlns:a="http://schemas.openxmlformats.org/drawingml/2006/main" xmlns:pic="http://schemas.openxmlformats.org/drawingml/2006/picture">
+          <wp:inline distT="0" distB="0" distL="0" distR="0" wp14:anchorId="44A6348A" wp14:editId="373A623B">
             <wp:extent cx="5486400" cy="1957079"/>
+            <wp:effectExtent l="0" t="0" r="0" b="0"/>
             <wp:docPr id="150" name="Picture 150"/>
             <wp:cNvGraphicFramePr>
-              <a:graphicFrameLocks noChangeAspect="1"/>
+              <a:graphicFrameLocks xmlns:a="http://schemas.openxmlformats.org/drawingml/2006/main" noChangeAspect="1"/>
             </wp:cNvGraphicFramePr>
-            <a:graphic>
+            <a:graphic xmlns:a="http://schemas.openxmlformats.org/drawingml/2006/main">
               <a:graphicData uri="http://schemas.openxmlformats.org/drawingml/2006/picture">
-                <pic:pic>
+                <pic:pic xmlns:pic="http://schemas.openxmlformats.org/drawingml/2006/picture">
                   <pic:nvPicPr>
                     <pic:cNvPr id="0" name="image.png"/>
                     <pic:cNvPicPr/>
                   </pic:nvPicPr>
                   <pic:blipFill>
-                    <a:blip r:embed="rId49"/>
+                    <a:blip r:embed="rId15"/>
                     <a:stretch>
                       <a:fillRect/>
                     </a:stretch>
@@ -5586,7 +5836,9 @@
                       <a:off x="0" y="0"/>
                       <a:ext cx="5486400" cy="1957079"/>
                     </a:xfrm>
-                    <a:prstGeom prst="rect"/>
+                    <a:prstGeom prst="rect">
+                      <a:avLst/>
+                    </a:prstGeom>
                   </pic:spPr>
                 </pic:pic>
               </a:graphicData>
@@ -5613,7 +5865,8 @@
         <w:pStyle w:val="Heading3"/>
       </w:pPr>
       <w:r>
-        <w:t>3.4.4  State CPI comparison</w:t>
+        <w:lastRenderedPageBreak/>
+        <w:t xml:space="preserve">  State CPI comparison</w:t>
       </w:r>
     </w:p>
     <w:p>
@@ -5621,22 +5874,26 @@
         <w:jc w:val="center"/>
       </w:pPr>
       <w:r>
+        <w:rPr>
+          <w:noProof/>
+        </w:rPr>
         <w:drawing>
-          <wp:inline xmlns:a="http://schemas.openxmlformats.org/drawingml/2006/main" xmlns:pic="http://schemas.openxmlformats.org/drawingml/2006/picture">
+          <wp:inline distT="0" distB="0" distL="0" distR="0" wp14:anchorId="55D751F1" wp14:editId="406F6298">
             <wp:extent cx="5486400" cy="4252346"/>
+            <wp:effectExtent l="0" t="0" r="0" b="0"/>
             <wp:docPr id="151" name="Picture 151"/>
             <wp:cNvGraphicFramePr>
-              <a:graphicFrameLocks noChangeAspect="1"/>
+              <a:graphicFrameLocks xmlns:a="http://schemas.openxmlformats.org/drawingml/2006/main" noChangeAspect="1"/>
             </wp:cNvGraphicFramePr>
-            <a:graphic>
+            <a:graphic xmlns:a="http://schemas.openxmlformats.org/drawingml/2006/main">
               <a:graphicData uri="http://schemas.openxmlformats.org/drawingml/2006/picture">
-                <pic:pic>
+                <pic:pic xmlns:pic="http://schemas.openxmlformats.org/drawingml/2006/picture">
                   <pic:nvPicPr>
                     <pic:cNvPr id="0" name="image.png"/>
                     <pic:cNvPicPr/>
                   </pic:nvPicPr>
                   <pic:blipFill>
-                    <a:blip r:embed="rId50"/>
+                    <a:blip r:embed="rId16"/>
                     <a:stretch>
                       <a:fillRect/>
                     </a:stretch>
@@ -5646,7 +5903,9 @@
                       <a:off x="0" y="0"/>
                       <a:ext cx="5486400" cy="4252346"/>
                     </a:xfrm>
-                    <a:prstGeom prst="rect"/>
+                    <a:prstGeom prst="rect">
+                      <a:avLst/>
+                    </a:prstGeom>
                   </pic:spPr>
                 </pic:pic>
               </a:graphicData>
@@ -5665,7 +5924,23 @@
           <w:i/>
           <w:sz w:val="18"/>
         </w:rPr>
-        <w:t>Figure 8. Overall CPI growth rate by state (2010 → latest). States above the median are in red; below in blue.</w:t>
+        <w:t xml:space="preserve">Figure 8. Overall CPI growth rate by state (2010 → latest). States above the </w:t>
+      </w:r>
+      <w:proofErr w:type="gramStart"/>
+      <w:r>
+        <w:rPr>
+          <w:i/>
+          <w:sz w:val="18"/>
+        </w:rPr>
+        <w:t>median</w:t>
+      </w:r>
+      <w:proofErr w:type="gramEnd"/>
+      <w:r>
+        <w:rPr>
+          <w:i/>
+          <w:sz w:val="18"/>
+        </w:rPr>
+        <w:t xml:space="preserve"> are in red; below in blue.</w:t>
       </w:r>
     </w:p>
     <w:p>
@@ -5673,7 +5948,7 @@
         <w:pStyle w:val="Heading3"/>
       </w:pPr>
       <w:r>
-        <w:t>3.4.5  Division inflation heatmap</w:t>
+        <w:t xml:space="preserve">  Division inflation heatmap</w:t>
       </w:r>
     </w:p>
     <w:p>
@@ -5681,22 +5956,26 @@
         <w:jc w:val="center"/>
       </w:pPr>
       <w:r>
+        <w:rPr>
+          <w:noProof/>
+        </w:rPr>
         <w:drawing>
-          <wp:inline xmlns:a="http://schemas.openxmlformats.org/drawingml/2006/main" xmlns:pic="http://schemas.openxmlformats.org/drawingml/2006/picture">
+          <wp:inline distT="0" distB="0" distL="0" distR="0" wp14:anchorId="0C26251B" wp14:editId="2E6A4604">
             <wp:extent cx="5669280" cy="2658277"/>
+            <wp:effectExtent l="0" t="0" r="0" b="0"/>
             <wp:docPr id="152" name="Picture 152"/>
             <wp:cNvGraphicFramePr>
-              <a:graphicFrameLocks noChangeAspect="1"/>
+              <a:graphicFrameLocks xmlns:a="http://schemas.openxmlformats.org/drawingml/2006/main" noChangeAspect="1"/>
             </wp:cNvGraphicFramePr>
-            <a:graphic>
+            <a:graphic xmlns:a="http://schemas.openxmlformats.org/drawingml/2006/main">
               <a:graphicData uri="http://schemas.openxmlformats.org/drawingml/2006/picture">
-                <pic:pic>
+                <pic:pic xmlns:pic="http://schemas.openxmlformats.org/drawingml/2006/picture">
                   <pic:nvPicPr>
                     <pic:cNvPr id="0" name="image.png"/>
                     <pic:cNvPicPr/>
                   </pic:nvPicPr>
                   <pic:blipFill>
-                    <a:blip r:embed="rId51"/>
+                    <a:blip r:embed="rId17"/>
                     <a:stretch>
                       <a:fillRect/>
                     </a:stretch>
@@ -5706,7 +5985,9 @@
                       <a:off x="0" y="0"/>
                       <a:ext cx="5669280" cy="2658277"/>
                     </a:xfrm>
-                    <a:prstGeom prst="rect"/>
+                    <a:prstGeom prst="rect">
+                      <a:avLst/>
+                    </a:prstGeom>
                   </pic:spPr>
                 </pic:pic>
               </a:graphicData>
@@ -5732,8 +6013,14 @@
       <w:pPr>
         <w:pStyle w:val="Heading3"/>
       </w:pPr>
-      <w:r>
-        <w:t>3.4.6  Income vs CPI scatter</w:t>
+      <w:proofErr w:type="gramStart"/>
+      <w:r>
+        <w:lastRenderedPageBreak/>
+        <w:t>3.4.6  Income</w:t>
+      </w:r>
+      <w:proofErr w:type="gramEnd"/>
+      <w:r>
+        <w:t xml:space="preserve"> vs CPI scatter</w:t>
       </w:r>
     </w:p>
     <w:p>
@@ -5741,22 +6028,26 @@
         <w:jc w:val="center"/>
       </w:pPr>
       <w:r>
+        <w:rPr>
+          <w:noProof/>
+        </w:rPr>
         <w:drawing>
-          <wp:inline xmlns:a="http://schemas.openxmlformats.org/drawingml/2006/main" xmlns:pic="http://schemas.openxmlformats.org/drawingml/2006/picture">
+          <wp:inline distT="0" distB="0" distL="0" distR="0" wp14:anchorId="3E0CCCB0" wp14:editId="0C154F7C">
             <wp:extent cx="5120640" cy="3068044"/>
+            <wp:effectExtent l="0" t="0" r="0" b="0"/>
             <wp:docPr id="153" name="Picture 153"/>
             <wp:cNvGraphicFramePr>
-              <a:graphicFrameLocks noChangeAspect="1"/>
+              <a:graphicFrameLocks xmlns:a="http://schemas.openxmlformats.org/drawingml/2006/main" noChangeAspect="1"/>
             </wp:cNvGraphicFramePr>
-            <a:graphic>
+            <a:graphic xmlns:a="http://schemas.openxmlformats.org/drawingml/2006/main">
               <a:graphicData uri="http://schemas.openxmlformats.org/drawingml/2006/picture">
-                <pic:pic>
+                <pic:pic xmlns:pic="http://schemas.openxmlformats.org/drawingml/2006/picture">
                   <pic:nvPicPr>
                     <pic:cNvPr id="0" name="image.png"/>
                     <pic:cNvPicPr/>
                   </pic:nvPicPr>
                   <pic:blipFill>
-                    <a:blip r:embed="rId52"/>
+                    <a:blip r:embed="rId18"/>
                     <a:stretch>
                       <a:fillRect/>
                     </a:stretch>
@@ -5766,7 +6057,9 @@
                       <a:off x="0" y="0"/>
                       <a:ext cx="5120640" cy="3068044"/>
                     </a:xfrm>
-                    <a:prstGeom prst="rect"/>
+                    <a:prstGeom prst="rect">
+                      <a:avLst/>
+                    </a:prstGeom>
                   </pic:spPr>
                 </pic:pic>
               </a:graphicData>
@@ -5779,14 +6072,74 @@
       <w:pPr>
         <w:spacing w:after="200"/>
         <w:jc w:val="center"/>
-      </w:pPr>
-      <w:r>
-        <w:rPr>
+        <w:rPr>
+          <w:rFonts w:eastAsiaTheme="minorEastAsia"/>
           <w:i/>
           <w:sz w:val="18"/>
-        </w:rPr>
-        <w:t>Figure 10. Latest mean household income vs mean CPI index per state, coloured by cluster.</w:t>
-      </w:r>
+          <w:lang w:eastAsia="zh-CN"/>
+        </w:rPr>
+      </w:pPr>
+      <w:r>
+        <w:rPr>
+          <w:i/>
+          <w:sz w:val="18"/>
+        </w:rPr>
+        <w:t xml:space="preserve">Figure 10. Latest mean household income vs </w:t>
+      </w:r>
+      <w:proofErr w:type="gramStart"/>
+      <w:r>
+        <w:rPr>
+          <w:i/>
+          <w:sz w:val="18"/>
+        </w:rPr>
+        <w:t>mean</w:t>
+      </w:r>
+      <w:proofErr w:type="gramEnd"/>
+      <w:r>
+        <w:rPr>
+          <w:i/>
+          <w:sz w:val="18"/>
+        </w:rPr>
+        <w:t xml:space="preserve"> CPI index per state, </w:t>
+      </w:r>
+      <w:proofErr w:type="spellStart"/>
+      <w:r>
+        <w:rPr>
+          <w:i/>
+          <w:sz w:val="18"/>
+        </w:rPr>
+        <w:t>coloured</w:t>
+      </w:r>
+      <w:proofErr w:type="spellEnd"/>
+      <w:r>
+        <w:rPr>
+          <w:i/>
+          <w:sz w:val="18"/>
+        </w:rPr>
+        <w:t xml:space="preserve"> by cluster.</w:t>
+      </w:r>
+    </w:p>
+    <w:p>
+      <w:pPr>
+        <w:spacing w:after="200"/>
+        <w:jc w:val="center"/>
+        <w:rPr>
+          <w:rFonts w:eastAsiaTheme="minorEastAsia"/>
+          <w:i/>
+          <w:sz w:val="18"/>
+          <w:lang w:eastAsia="zh-CN"/>
+        </w:rPr>
+      </w:pPr>
+    </w:p>
+    <w:p>
+      <w:pPr>
+        <w:spacing w:after="200"/>
+        <w:jc w:val="center"/>
+        <w:rPr>
+          <w:rFonts w:eastAsiaTheme="minorEastAsia"/>
+          <w:lang w:eastAsia="zh-CN"/>
+        </w:rPr>
+      </w:pPr>
     </w:p>
     <w:p>
       <w:pPr>
@@ -5801,11 +6154,15 @@
         <w:spacing w:after="120"/>
       </w:pPr>
       <w:r>
-        <w:rPr>
-          <w:b w:val="0"/>
-          <w:i w:val="0"/>
-        </w:rPr>
-        <w:t>The analysis is delivered as an interactive Flask web dashboard (app/dashboard.py) served at http://localhost:5050, launched via python run_pipeline.py. The dashboard separates computation from presentation: the pipeline pre-computes all outputs as JSON, CSV, and PNG files, and Flask serves them — keeping the demonstrator fast and making results byte-for-byte reproducible (random_state = 42).</w:t>
+        <w:t>The analysis is delivered as an interactive Flask web dashboard (app/dashboard.py) served at http://localhost:5050, launched via python run_pipeline.py. The dashboard separates computation from presentation: the pipeline pre-computes all outputs as JSON, CSV, and PNG files, and Flask serves them — keeping the demonstrator fast and making results byte-for-byte reproducible (</w:t>
+      </w:r>
+      <w:proofErr w:type="spellStart"/>
+      <w:r>
+        <w:t>random_state</w:t>
+      </w:r>
+      <w:proofErr w:type="spellEnd"/>
+      <w:r>
+        <w:t xml:space="preserve"> = 42).</w:t>
       </w:r>
     </w:p>
     <w:p>
@@ -5813,10 +6170,6 @@
         <w:spacing w:after="120"/>
       </w:pPr>
       <w:r>
-        <w:rPr>
-          <w:b w:val="0"/>
-          <w:i w:val="0"/>
-        </w:rPr>
         <w:t>The demonstrator exposes four tabs, each backed by a lightweight JSON API:</w:t>
       </w:r>
     </w:p>
@@ -5836,7 +6189,15 @@
         <w:t xml:space="preserve">Overview. </w:t>
       </w:r>
       <w:r>
-        <w:t>National and state-level CPI and income summary (/api/overview); fuel price history.</w:t>
+        <w:t>National and state-level CPI and income summary (/</w:t>
+      </w:r>
+      <w:proofErr w:type="spellStart"/>
+      <w:r>
+        <w:t>api</w:t>
+      </w:r>
+      <w:proofErr w:type="spellEnd"/>
+      <w:r>
+        <w:t>/overview); fuel price history.</w:t>
       </w:r>
     </w:p>
     <w:p>
@@ -5855,7 +6216,23 @@
         <w:t xml:space="preserve">Time-series forecast. </w:t>
       </w:r>
       <w:r>
-        <w:t>Train/test/forecast CPI inflation chart (/api/ts/forecast) with ARIMA order, AIC, BIC, and test accuracy metrics displayed alongside.</w:t>
+        <w:t>Train/test/forecast CPI inflation chart (/</w:t>
+      </w:r>
+      <w:proofErr w:type="spellStart"/>
+      <w:r>
+        <w:t>api</w:t>
+      </w:r>
+      <w:proofErr w:type="spellEnd"/>
+      <w:r>
+        <w:t>/</w:t>
+      </w:r>
+      <w:proofErr w:type="spellStart"/>
+      <w:r>
+        <w:t>ts</w:t>
+      </w:r>
+      <w:proofErr w:type="spellEnd"/>
+      <w:r>
+        <w:t>/forecast) with ARIMA order, AIC, BIC, and test accuracy metrics displayed alongside.</w:t>
       </w:r>
     </w:p>
     <w:p>
@@ -5874,7 +6251,23 @@
         <w:t xml:space="preserve">Clustering. </w:t>
       </w:r>
       <w:r>
-        <w:t>PCA scatter, dendrogram, cluster profiles, and validity scores (/api/cluster/states, /api/cluster/metrics).</w:t>
+        <w:t>PCA scatter, dendrogram, cluster profiles, and validity scores (/</w:t>
+      </w:r>
+      <w:proofErr w:type="spellStart"/>
+      <w:r>
+        <w:t>api</w:t>
+      </w:r>
+      <w:proofErr w:type="spellEnd"/>
+      <w:r>
+        <w:t>/cluster/states, /</w:t>
+      </w:r>
+      <w:proofErr w:type="spellStart"/>
+      <w:r>
+        <w:t>api</w:t>
+      </w:r>
+      <w:proofErr w:type="spellEnd"/>
+      <w:r>
+        <w:t>/cluster/metrics).</w:t>
       </w:r>
     </w:p>
     <w:p>
@@ -5893,47 +6286,15 @@
         <w:t xml:space="preserve">Fuel analysis. </w:t>
       </w:r>
       <w:r>
-        <w:t>Fuel price vs CPI scatter and lag-correlation bar chart (/api/fuel/correlation).</w:t>
-      </w:r>
-    </w:p>
-    <w:p>
-      <w:pPr>
-        <w:pStyle w:val="Heading1"/>
-      </w:pPr>
-      <w:r>
-        <w:t>Conclusions</w:t>
-      </w:r>
-    </w:p>
-    <w:p>
-      <w:pPr>
-        <w:spacing w:after="120"/>
-      </w:pPr>
-      <w:r>
-        <w:rPr>
-          <w:b w:val="0"/>
-          <w:i w:val="0"/>
-        </w:rPr>
-        <w:t>A BIC-selected ARIMA(4,0,4) was fitted to Malaysia's national CPI inflation series (test RMSE = 1.0699, sMAPE = 46.06%). A rigorous MASE assessment (2.35) shows the model does not surpass a naive baseline over the full 24-month block — a genuine limitation of long-horizon point forecasting with a stationary model, which we report transparently rather than obscure. The parsimonious BIC order still avoids over-fitting and yields a forecast consistent with the moderating trend in recent DOSM releases; its value lies in characterising trend and uncertainty, with rolling one-step evaluation recommended for assessing short-horizon skill.</w:t>
-      </w:r>
-    </w:p>
-    <w:p>
-      <w:pPr>
-        <w:spacing w:after="120"/>
-      </w:pPr>
-      <w:r>
-        <w:rPr>
-          <w:b w:val="0"/>
-          <w:i w:val="0"/>
-        </w:rPr>
-        <w:t>Clustering identified k = 2 interpretable state tiers (K-Means silhouette = 0.5764), validated independently by K-Means and Ward-linkage hierarchical clustering. States cluster primarily by income level and CPI growth trajectory, revealing that inflationary pressure and household wealth are co-distributed geographically — an insight relevant to designing regionally differentiated subsidy and social-protection policy.</w:t>
-      </w:r>
-    </w:p>
-    <w:p>
-      <w:pPr>
-        <w:pStyle w:val="Heading2"/>
-      </w:pPr>
-      <w:r>
-        <w:t>Challenges and how we overcame them</w:t>
+        <w:t>Fuel price vs CPI scatter and lag-correlation bar chart (/</w:t>
+      </w:r>
+      <w:proofErr w:type="spellStart"/>
+      <w:r>
+        <w:t>api</w:t>
+      </w:r>
+      <w:proofErr w:type="spellEnd"/>
+      <w:r>
+        <w:t>/fuel/correlation).</w:t>
       </w:r>
     </w:p>
     <w:p>
@@ -5941,37 +6302,89 @@
         <w:pStyle w:val="ListParagraph"/>
         <w:spacing w:after="60"/>
         <w:ind w:left="432"/>
-      </w:pPr>
-      <w:r>
-        <w:t xml:space="preserve">•  </w:t>
-      </w:r>
-      <w:r>
-        <w:rPr>
-          <w:b/>
-        </w:rPr>
-        <w:t xml:space="preserve">Frequency misalignment. </w:t>
-      </w:r>
-      <w:r>
-        <w:t>The fuel price dataset is weekly while CPI is monthly. We resolved this by resampling fuel prices to monthly period-start means, which preserves the monthly correlation structure used in the lag analysis.</w:t>
-      </w:r>
+        <w:rPr>
+          <w:rFonts w:eastAsiaTheme="minorEastAsia"/>
+          <w:lang w:eastAsia="zh-CN"/>
+        </w:rPr>
+      </w:pPr>
     </w:p>
     <w:p>
       <w:pPr>
         <w:pStyle w:val="ListParagraph"/>
         <w:spacing w:after="60"/>
         <w:ind w:left="432"/>
-      </w:pPr>
-      <w:r>
-        <w:t xml:space="preserve">•  </w:t>
-      </w:r>
-      <w:r>
-        <w:rPr>
-          <w:b/>
-        </w:rPr>
-        <w:t xml:space="preserve">Short cross-sectional sample. </w:t>
-      </w:r>
-      <w:r>
-        <w:t>With only 16 states, the clustering sample size limits the number of well-separated groups (maximum sensible k ≈ 8). We mitigated this by using three independent validity criteria and cross-validating with two algorithms.</w:t>
+        <w:rPr>
+          <w:rFonts w:eastAsiaTheme="minorEastAsia"/>
+          <w:lang w:eastAsia="zh-CN"/>
+        </w:rPr>
+      </w:pPr>
+    </w:p>
+    <w:p>
+      <w:pPr>
+        <w:pStyle w:val="Heading1"/>
+      </w:pPr>
+      <w:r>
+        <w:t>Conclusions</w:t>
+      </w:r>
+    </w:p>
+    <w:p>
+      <w:pPr>
+        <w:spacing w:after="120"/>
+      </w:pPr>
+      <w:r>
+        <w:t xml:space="preserve">A BIC-selected </w:t>
+      </w:r>
+      <w:proofErr w:type="gramStart"/>
+      <w:r>
+        <w:t>ARIMA(</w:t>
+      </w:r>
+      <w:proofErr w:type="gramEnd"/>
+      <w:r>
+        <w:t xml:space="preserve">4,0,4) was fitted to Malaysia's national CPI inflation series (test RMSE = 1.0699, </w:t>
+      </w:r>
+      <w:proofErr w:type="spellStart"/>
+      <w:r>
+        <w:t>sMAPE</w:t>
+      </w:r>
+      <w:proofErr w:type="spellEnd"/>
+      <w:r>
+        <w:t xml:space="preserve"> = 46.06%). A rigorous MASE assessment (2.35) shows the model does not surpass a naive baseline over the full 24-month block — a genuine limitation of long-horizon point forecasting with a stationary model, which we report transparently rather than obscure. The parsimonious BIC order still avoids over-fitting and yields a forecast consistent with the moderating trend in recent DOSM releases; its value lies in </w:t>
+      </w:r>
+      <w:proofErr w:type="spellStart"/>
+      <w:r>
+        <w:t>characterising</w:t>
+      </w:r>
+      <w:proofErr w:type="spellEnd"/>
+      <w:r>
+        <w:t xml:space="preserve"> trend and uncertainty, with rolling one-step evaluation recommended for assessing short-horizon skill.</w:t>
+      </w:r>
+    </w:p>
+    <w:p>
+      <w:pPr>
+        <w:spacing w:after="120"/>
+      </w:pPr>
+      <w:r>
+        <w:t xml:space="preserve">Clustering identified k = 2 interpretable state tiers (K-Means silhouette = 0.5764), validated independently by K-Means and Ward-linkage hierarchical clustering. States cluster primarily </w:t>
+      </w:r>
+      <w:r>
+        <w:lastRenderedPageBreak/>
+        <w:t>by income level and CPI growth trajectory, revealing that inflationary pressure and household wealth are co-distributed geographically — an insight relevant to designing regionally differentiated subsidy and social-protection policy.</w:t>
+      </w:r>
+    </w:p>
+    <w:p>
+      <w:pPr>
+        <w:pStyle w:val="Heading2"/>
+      </w:pPr>
+      <w:r>
+        <w:t xml:space="preserve">Challenges and how we </w:t>
+      </w:r>
+      <w:proofErr w:type="gramStart"/>
+      <w:r>
+        <w:t>overcame</w:t>
+      </w:r>
+      <w:proofErr w:type="gramEnd"/>
+      <w:r>
+        <w:t xml:space="preserve"> them</w:t>
       </w:r>
     </w:p>
     <w:p>
@@ -5987,18 +6400,10 @@
         <w:rPr>
           <w:b/>
         </w:rPr>
-        <w:t xml:space="preserve">ARIMA univariate limitation. </w:t>
-      </w:r>
-      <w:r>
-        <w:t>ARIMA cannot anticipate structural breaks such as sudden fuel subsidy changes. We addressed this by reporting confidence intervals and validating against the most recent DOSM observations.</w:t>
-      </w:r>
-    </w:p>
-    <w:p>
-      <w:pPr>
-        <w:pStyle w:val="Heading2"/>
-      </w:pPr>
-      <w:r>
-        <w:t>What we learnt</w:t>
+        <w:t xml:space="preserve">Frequency misalignment. </w:t>
+      </w:r>
+      <w:r>
+        <w:t>The fuel price dataset is weekly while CPI is monthly. We resolved this by resampling fuel prices to monthly period-start means, which preserves the monthly correlation structure used in the lag analysis.</w:t>
       </w:r>
     </w:p>
     <w:p>
@@ -6011,7 +6416,13 @@
         <w:t xml:space="preserve">•  </w:t>
       </w:r>
       <w:r>
-        <w:t>BIC is a better model-selection criterion than AIC for moderately long monthly economic series because it penalises complexity more strongly and tends to select more parsimonious orders.</w:t>
+        <w:rPr>
+          <w:b/>
+        </w:rPr>
+        <w:t xml:space="preserve">Short cross-sectional sample. </w:t>
+      </w:r>
+      <w:r>
+        <w:t>With only 16 states, the clustering sample size limits the number of well-separated groups (maximum sensible k ≈ 8). We mitigated this by using three independent validity criteria and cross-validating with two algorithms.</w:t>
       </w:r>
     </w:p>
     <w:p>
@@ -6024,7 +6435,21 @@
         <w:t xml:space="preserve">•  </w:t>
       </w:r>
       <w:r>
-        <w:t>Running two independent clustering algorithms on the same data is a simple and effective way to check whether discovered clusters are genuine structure rather than algorithm artefacts.</w:t>
+        <w:rPr>
+          <w:b/>
+        </w:rPr>
+        <w:t xml:space="preserve">ARIMA univariate limitation. </w:t>
+      </w:r>
+      <w:r>
+        <w:t>ARIMA cannot anticipate structural breaks such as sudden fuel subsidy changes. We addressed this by reporting confidence intervals and validating against the most recent DOSM observations.</w:t>
+      </w:r>
+    </w:p>
+    <w:p>
+      <w:pPr>
+        <w:pStyle w:val="Heading2"/>
+      </w:pPr>
+      <w:r>
+        <w:t>What we learnt</w:t>
       </w:r>
     </w:p>
     <w:p>
@@ -6034,10 +6459,15 @@
         <w:ind w:left="432"/>
       </w:pPr>
       <w:r>
-        <w:t xml:space="preserve">•  </w:t>
-      </w:r>
-      <w:r>
-        <w:t>Separating the heavy computation (the pipeline) from the presentation layer (Flask) makes the demonstrator fast, reproducible, and easy to update when new data is published.</w:t>
+        <w:t xml:space="preserve">•  BIC is a better model-selection criterion than AIC for moderately long monthly economic series because it </w:t>
+      </w:r>
+      <w:proofErr w:type="spellStart"/>
+      <w:r>
+        <w:t>penalises</w:t>
+      </w:r>
+      <w:proofErr w:type="spellEnd"/>
+      <w:r>
+        <w:t xml:space="preserve"> complexity more strongly and tends to select more parsimonious orders.</w:t>
       </w:r>
     </w:p>
     <w:p>
@@ -6047,11 +6477,40 @@
         <w:ind w:left="432"/>
       </w:pPr>
       <w:r>
-        <w:t xml:space="preserve">•  </w:t>
-      </w:r>
-      <w:r>
-        <w:t>Fuel-price pass-through to CPI inflation is rapid (within one month) but partial, consistent with Malaysia's administered fuel-pricing regime that smooths but does not eliminate cost-push pressure.</w:t>
-      </w:r>
+        <w:t>•  Running two independent clustering algorithms on the same data is a simple and effective way to check whether discovered clusters are genuine structure rather than algorithm artefacts.</w:t>
+      </w:r>
+    </w:p>
+    <w:p>
+      <w:pPr>
+        <w:pStyle w:val="ListParagraph"/>
+        <w:spacing w:after="60"/>
+        <w:ind w:left="432"/>
+      </w:pPr>
+      <w:r>
+        <w:t>•  Separating the heavy computation (the pipeline) from the presentation layer (Flask) makes the demonstrator fast, reproducible, and easy to update when new data is published.</w:t>
+      </w:r>
+    </w:p>
+    <w:p>
+      <w:pPr>
+        <w:pStyle w:val="ListParagraph"/>
+        <w:spacing w:after="60"/>
+        <w:ind w:left="432"/>
+      </w:pPr>
+      <w:r>
+        <w:t>•  Fuel-price pass-through to CPI inflation is rapid (within one month) but partial, consistent with Malaysia's administered fuel-pricing regime that smooths but does not eliminate cost-push pressure.</w:t>
+      </w:r>
+    </w:p>
+    <w:p>
+      <w:r>
+        <w:br w:type="page"/>
+      </w:r>
+    </w:p>
+    <w:p>
+      <w:pPr>
+        <w:pStyle w:val="ListParagraph"/>
+        <w:spacing w:after="60"/>
+        <w:ind w:left="432"/>
+      </w:pPr>
     </w:p>
     <w:p>
       <w:pPr>
@@ -6071,10 +6530,29 @@
         <w:rPr>
           <w:b/>
         </w:rPr>
-        <w:t xml:space="preserve">[1]  </w:t>
-      </w:r>
-      <w:r>
-        <w:t>Department of Statistics Malaysia (DOSM). (2024). CPI by Division — National (cpi_2d_inflation). OpenDOSM. https://open.dosm.gov.my/data-catalogue/cpi_2d_inflation</w:t>
+        <w:t>[1</w:t>
+      </w:r>
+      <w:proofErr w:type="gramStart"/>
+      <w:r>
+        <w:rPr>
+          <w:b/>
+        </w:rPr>
+        <w:t xml:space="preserve">]  </w:t>
+      </w:r>
+      <w:r>
+        <w:t>Department</w:t>
+      </w:r>
+      <w:proofErr w:type="gramEnd"/>
+      <w:r>
+        <w:t xml:space="preserve"> of Statistics Malaysia (DOSM). (2024). CPI by Division — National (cpi_2d_inflation). </w:t>
+      </w:r>
+      <w:proofErr w:type="spellStart"/>
+      <w:r>
+        <w:t>OpenDOSM</w:t>
+      </w:r>
+      <w:proofErr w:type="spellEnd"/>
+      <w:r>
+        <w:t>. https://open.dosm.gov.my/data-catalogue/cpi_2d_inflation</w:t>
       </w:r>
     </w:p>
     <w:p>
@@ -6087,10 +6565,29 @@
         <w:rPr>
           <w:b/>
         </w:rPr>
-        <w:t xml:space="preserve">[2]  </w:t>
-      </w:r>
-      <w:r>
-        <w:t>Department of Statistics Malaysia (DOSM). (2024). CPI by Division — State (cpi_2d_state). OpenDOSM. https://open.dosm.gov.my/data-catalogue/cpi_2d_state</w:t>
+        <w:t>[2</w:t>
+      </w:r>
+      <w:proofErr w:type="gramStart"/>
+      <w:r>
+        <w:rPr>
+          <w:b/>
+        </w:rPr>
+        <w:t xml:space="preserve">]  </w:t>
+      </w:r>
+      <w:r>
+        <w:t>Department</w:t>
+      </w:r>
+      <w:proofErr w:type="gramEnd"/>
+      <w:r>
+        <w:t xml:space="preserve"> of Statistics Malaysia (DOSM). (2024). CPI by Division — State (cpi_2d_state). </w:t>
+      </w:r>
+      <w:proofErr w:type="spellStart"/>
+      <w:r>
+        <w:t>OpenDOSM</w:t>
+      </w:r>
+      <w:proofErr w:type="spellEnd"/>
+      <w:r>
+        <w:t>. https://open.dosm.gov.my/data-catalogue/cpi_2d_state</w:t>
       </w:r>
     </w:p>
     <w:p>
@@ -6103,10 +6600,37 @@
         <w:rPr>
           <w:b/>
         </w:rPr>
-        <w:t xml:space="preserve">[3]  </w:t>
-      </w:r>
-      <w:r>
-        <w:t>Department of Statistics Malaysia (DOSM). (2024). Retail Fuel Prices (fuelprice). OpenDOSM. https://open.dosm.gov.my/data-catalogue/fuelprice</w:t>
+        <w:t>[3</w:t>
+      </w:r>
+      <w:proofErr w:type="gramStart"/>
+      <w:r>
+        <w:rPr>
+          <w:b/>
+        </w:rPr>
+        <w:t xml:space="preserve">]  </w:t>
+      </w:r>
+      <w:r>
+        <w:t>Department</w:t>
+      </w:r>
+      <w:proofErr w:type="gramEnd"/>
+      <w:r>
+        <w:t xml:space="preserve"> of Statistics Malaysia (DOSM). (2024). Retail Fuel Prices (</w:t>
+      </w:r>
+      <w:proofErr w:type="spellStart"/>
+      <w:r>
+        <w:t>fuelprice</w:t>
+      </w:r>
+      <w:proofErr w:type="spellEnd"/>
+      <w:r>
+        <w:t xml:space="preserve">). </w:t>
+      </w:r>
+      <w:proofErr w:type="spellStart"/>
+      <w:r>
+        <w:t>OpenDOSM</w:t>
+      </w:r>
+      <w:proofErr w:type="spellEnd"/>
+      <w:r>
+        <w:t>. https://open.dosm.gov.my/data-catalogue/fuelprice</w:t>
       </w:r>
     </w:p>
     <w:p>
@@ -6119,10 +6643,37 @@
         <w:rPr>
           <w:b/>
         </w:rPr>
-        <w:t xml:space="preserve">[4]  </w:t>
-      </w:r>
-      <w:r>
-        <w:t>Department of Statistics Malaysia (DOSM). (2023). Household Income by State (hh_income_state). OpenDOSM. https://open.dosm.gov.my/data-catalogue/hh_income_state</w:t>
+        <w:t>[4</w:t>
+      </w:r>
+      <w:proofErr w:type="gramStart"/>
+      <w:r>
+        <w:rPr>
+          <w:b/>
+        </w:rPr>
+        <w:t xml:space="preserve">]  </w:t>
+      </w:r>
+      <w:r>
+        <w:t>Department</w:t>
+      </w:r>
+      <w:proofErr w:type="gramEnd"/>
+      <w:r>
+        <w:t xml:space="preserve"> of Statistics Malaysia (DOSM). (2023). Household Income by State (</w:t>
+      </w:r>
+      <w:proofErr w:type="spellStart"/>
+      <w:r>
+        <w:t>hh_income_state</w:t>
+      </w:r>
+      <w:proofErr w:type="spellEnd"/>
+      <w:r>
+        <w:t xml:space="preserve">). </w:t>
+      </w:r>
+      <w:proofErr w:type="spellStart"/>
+      <w:r>
+        <w:t>OpenDOSM</w:t>
+      </w:r>
+      <w:proofErr w:type="spellEnd"/>
+      <w:r>
+        <w:t>. https://open.dosm.gov.my/data-catalogue/hh_income_state</w:t>
       </w:r>
     </w:p>
     <w:p>
@@ -6135,10 +6686,37 @@
         <w:rPr>
           <w:b/>
         </w:rPr>
-        <w:t xml:space="preserve">[5]  </w:t>
-      </w:r>
-      <w:r>
-        <w:t>Seabold, S., &amp; Perktold, J. (2010). statsmodels: Econometric and statistical modeling with Python. https://www.statsmodels.org/stable/generated/statsmodels.tsa.arima.model.ARIMA.html</w:t>
+        <w:t>[5</w:t>
+      </w:r>
+      <w:proofErr w:type="gramStart"/>
+      <w:r>
+        <w:rPr>
+          <w:b/>
+        </w:rPr>
+        <w:t xml:space="preserve">]  </w:t>
+      </w:r>
+      <w:r>
+        <w:t>Seabold</w:t>
+      </w:r>
+      <w:proofErr w:type="gramEnd"/>
+      <w:r>
+        <w:t xml:space="preserve">, S., &amp; </w:t>
+      </w:r>
+      <w:proofErr w:type="spellStart"/>
+      <w:r>
+        <w:t>Perktold</w:t>
+      </w:r>
+      <w:proofErr w:type="spellEnd"/>
+      <w:r>
+        <w:t xml:space="preserve">, J. (2010). </w:t>
+      </w:r>
+      <w:proofErr w:type="spellStart"/>
+      <w:r>
+        <w:t>statsmodels</w:t>
+      </w:r>
+      <w:proofErr w:type="spellEnd"/>
+      <w:r>
+        <w:t>: Econometric and statistical modeling with Python. https://www.statsmodels.org/stable/generated/statsmodels.tsa.arima.model.ARIMA.html</w:t>
       </w:r>
     </w:p>
     <w:p>
@@ -6151,10 +6729,21 @@
         <w:rPr>
           <w:b/>
         </w:rPr>
-        <w:t xml:space="preserve">[6]  </w:t>
-      </w:r>
-      <w:r>
-        <w:t>Pedregosa, F., et al. (2011). Scikit-learn: Machine Learning in Python. JMLR 12, 2825-2830. https://scikit-learn.org/</w:t>
+        <w:t>[6</w:t>
+      </w:r>
+      <w:proofErr w:type="gramStart"/>
+      <w:r>
+        <w:rPr>
+          <w:b/>
+        </w:rPr>
+        <w:t xml:space="preserve">]  </w:t>
+      </w:r>
+      <w:r>
+        <w:t>Pedregosa</w:t>
+      </w:r>
+      <w:proofErr w:type="gramEnd"/>
+      <w:r>
+        <w:t>, F., et al. (2011). Scikit-learn: Machine Learning in Python. JMLR 12, 2825-2830. https://scikit-learn.org/</w:t>
       </w:r>
     </w:p>
     <w:p>
@@ -6167,11 +6756,42 @@
         <w:rPr>
           <w:b/>
         </w:rPr>
-        <w:t xml:space="preserve">[7]  </w:t>
-      </w:r>
-      <w:r>
-        <w:t>Project source code and reproducible pipeline (E's Island). GitHub: https://github.com/kenn040502/COS40007-Design-Project</w:t>
-      </w:r>
+        <w:t>[7</w:t>
+      </w:r>
+      <w:proofErr w:type="gramStart"/>
+      <w:r>
+        <w:rPr>
+          <w:b/>
+        </w:rPr>
+        <w:t xml:space="preserve">]  </w:t>
+      </w:r>
+      <w:r>
+        <w:t>Project</w:t>
+      </w:r>
+      <w:proofErr w:type="gramEnd"/>
+      <w:r>
+        <w:t xml:space="preserve"> source code and reproducible pipeline (E's Island). GitHub: </w:t>
+      </w:r>
+      <w:hyperlink r:id="rId19" w:history="1">
+        <w:r>
+          <w:rPr>
+            <w:rStyle w:val="Hyperlink"/>
+          </w:rPr>
+          <w:t>https://github.com/kenn040502/COS40007-Design-Project</w:t>
+        </w:r>
+      </w:hyperlink>
+    </w:p>
+    <w:p>
+      <w:r>
+        <w:br w:type="page"/>
+      </w:r>
+    </w:p>
+    <w:p>
+      <w:pPr>
+        <w:pStyle w:val="ListParagraph"/>
+        <w:spacing w:after="80"/>
+        <w:ind w:left="432" w:hanging="432"/>
+      </w:pPr>
     </w:p>
     <w:p>
       <w:pPr>
@@ -6185,8 +6805,13 @@
       <w:pPr>
         <w:pStyle w:val="Heading2"/>
       </w:pPr>
-      <w:r>
-        <w:t>A.1  Reproducing the analysis</w:t>
+      <w:proofErr w:type="gramStart"/>
+      <w:r>
+        <w:t>A.1  Reproducing</w:t>
+      </w:r>
+      <w:proofErr w:type="gramEnd"/>
+      <w:r>
+        <w:t xml:space="preserve"> the analysis</w:t>
       </w:r>
     </w:p>
     <w:p>
@@ -6194,10 +6819,6 @@
         <w:spacing w:after="120"/>
       </w:pPr>
       <w:r>
-        <w:rPr>
-          <w:b w:val="0"/>
-          <w:i w:val="0"/>
-        </w:rPr>
         <w:t>The complete project is available at https://github.com/kenn040502/COS40007-Design-Project. To reproduce every figure, table, and metric in this report:</w:t>
       </w:r>
     </w:p>
@@ -6208,10 +6829,7 @@
         <w:ind w:left="432"/>
       </w:pPr>
       <w:r>
-        <w:t xml:space="preserve">•  </w:t>
-      </w:r>
-      <w:r>
-        <w:t>pip install -r requirements.txt</w:t>
+        <w:t>•  pip install -r requirements.txt</w:t>
       </w:r>
     </w:p>
     <w:p>
@@ -6221,10 +6839,15 @@
         <w:ind w:left="432"/>
       </w:pPr>
       <w:r>
-        <w:t xml:space="preserve">•  </w:t>
-      </w:r>
-      <w:r>
-        <w:t>python run_analysis.py   (headless: preprocessing → ARIMA → clustering → evaluation)</w:t>
+        <w:t>•  python run_analysis.py</w:t>
+      </w:r>
+      <w:proofErr w:type="gramStart"/>
+      <w:r>
+        <w:t xml:space="preserve">   (</w:t>
+      </w:r>
+      <w:proofErr w:type="gramEnd"/>
+      <w:r>
+        <w:t>headless: preprocessing → ARIMA → clustering → evaluation)</w:t>
       </w:r>
     </w:p>
     <w:p>
@@ -6234,10 +6857,15 @@
         <w:ind w:left="432"/>
       </w:pPr>
       <w:r>
-        <w:t xml:space="preserve">•  </w:t>
-      </w:r>
-      <w:r>
-        <w:t>python run_pipeline.py   (runs the analysis then launches the dashboard at http://localhost:5050)</w:t>
+        <w:t>•  python run_pipeline.py</w:t>
+      </w:r>
+      <w:proofErr w:type="gramStart"/>
+      <w:r>
+        <w:t xml:space="preserve">   (</w:t>
+      </w:r>
+      <w:proofErr w:type="gramEnd"/>
+      <w:r>
+        <w:t>runs the analysis then launches the dashboard at http://localhost:5050)</w:t>
       </w:r>
     </w:p>
     <w:p>
@@ -6247,10 +6875,15 @@
         <w:ind w:left="432"/>
       </w:pPr>
       <w:r>
-        <w:t xml:space="preserve">•  </w:t>
-      </w:r>
-      <w:r>
-        <w:t>python compute_report_stats.py   (prints key statistics for verification)</w:t>
+        <w:t>•  python compute_report_stats.py</w:t>
+      </w:r>
+      <w:proofErr w:type="gramStart"/>
+      <w:r>
+        <w:t xml:space="preserve">   (</w:t>
+      </w:r>
+      <w:proofErr w:type="gramEnd"/>
+      <w:r>
+        <w:t>prints key statistics for verification)</w:t>
       </w:r>
     </w:p>
     <w:p>
@@ -6260,10 +6893,15 @@
         <w:ind w:left="432"/>
       </w:pPr>
       <w:r>
-        <w:t xml:space="preserve">•  </w:t>
-      </w:r>
-      <w:r>
-        <w:t>python build_report.py   (regenerates this Word document)</w:t>
+        <w:t>•  python build_report.py</w:t>
+      </w:r>
+      <w:proofErr w:type="gramStart"/>
+      <w:r>
+        <w:t xml:space="preserve">   (</w:t>
+      </w:r>
+      <w:proofErr w:type="gramEnd"/>
+      <w:r>
+        <w:t>regenerates this Word document)</w:t>
       </w:r>
     </w:p>
     <w:p>
@@ -6271,19 +6909,28 @@
         <w:spacing w:after="120"/>
       </w:pPr>
       <w:r>
-        <w:rPr>
-          <w:b w:val="0"/>
-          <w:i w:val="0"/>
-        </w:rPr>
-        <w:t>All randomness is seeded (random_state = 42), so results are fully deterministic. Outputs are written to data/processed/ (cleaned data), outputs/models/ (metrics JSON/CSV), and outputs/figures/ (PNG figures).</w:t>
+        <w:t>All randomness is seeded (</w:t>
+      </w:r>
+      <w:proofErr w:type="spellStart"/>
+      <w:r>
+        <w:t>random_state</w:t>
+      </w:r>
+      <w:proofErr w:type="spellEnd"/>
+      <w:r>
+        <w:t xml:space="preserve"> = 42), so results are fully deterministic. Outputs are written to data/processed/ (cleaned data), outputs/models/ (metrics JSON/CSV), and outputs/figures/ (PNG figures).</w:t>
       </w:r>
     </w:p>
     <w:p>
       <w:pPr>
         <w:pStyle w:val="Heading2"/>
       </w:pPr>
-      <w:r>
-        <w:t>A.2  Project deliverables and shareable links</w:t>
+      <w:proofErr w:type="gramStart"/>
+      <w:r>
+        <w:t>A.2  Project</w:t>
+      </w:r>
+      <w:proofErr w:type="gramEnd"/>
+      <w:r>
+        <w:t xml:space="preserve"> deliverables and shareable links</w:t>
       </w:r>
     </w:p>
     <w:p>
@@ -6300,9 +6947,8 @@
     </w:p>
     <w:tbl>
       <w:tblPr>
-        <w:tblW w:type="auto" w:w="0"/>
+        <w:tblW w:w="0" w:type="auto"/>
         <w:jc w:val="center"/>
-        <w:tblLook w:firstColumn="1" w:firstRow="1" w:lastColumn="0" w:lastRow="0" w:noHBand="0" w:noVBand="1" w:val="04A0"/>
         <w:tblBorders>
           <w:top w:val="single" w:sz="4" w:space="0" w:color="808080"/>
           <w:left w:val="single" w:sz="4" w:space="0" w:color="808080"/>
@@ -6311,19 +6957,22 @@
           <w:insideH w:val="single" w:sz="4" w:space="0" w:color="808080"/>
           <w:insideV w:val="single" w:sz="4" w:space="0" w:color="808080"/>
         </w:tblBorders>
+        <w:tblLook w:val="04A0" w:firstRow="1" w:lastRow="0" w:firstColumn="1" w:lastColumn="0" w:noHBand="0" w:noVBand="1"/>
       </w:tblPr>
       <w:tblGrid>
-        <w:gridCol w:w="4538"/>
-        <w:gridCol w:w="4538"/>
+        <w:gridCol w:w="3456"/>
+        <w:gridCol w:w="5760"/>
       </w:tblGrid>
       <w:tr>
+        <w:trPr>
+          <w:jc w:val="center"/>
+        </w:trPr>
         <w:tc>
           <w:tcPr>
-            <w:tcW w:type="dxa" w:w="3456"/>
-            <w:shd w:val="clear" w:fill="1F4E79"/>
+            <w:tcW w:w="3456" w:type="dxa"/>
+            <w:shd w:val="clear" w:color="auto" w:fill="1F4E79"/>
           </w:tcPr>
           <w:p>
-            <w:r/>
             <w:r>
               <w:rPr>
                 <w:b/>
@@ -6336,11 +6985,10 @@
         </w:tc>
         <w:tc>
           <w:tcPr>
-            <w:tcW w:type="dxa" w:w="5760"/>
-            <w:shd w:val="clear" w:fill="1F4E79"/>
+            <w:tcW w:w="5760" w:type="dxa"/>
+            <w:shd w:val="clear" w:color="auto" w:fill="1F4E79"/>
           </w:tcPr>
           <w:p>
-            <w:r/>
             <w:r>
               <w:rPr>
                 <w:b/>
@@ -6353,12 +7001,14 @@
         </w:tc>
       </w:tr>
       <w:tr>
+        <w:trPr>
+          <w:jc w:val="center"/>
+        </w:trPr>
         <w:tc>
           <w:tcPr>
-            <w:tcW w:type="dxa" w:w="3456"/>
+            <w:tcW w:w="3456" w:type="dxa"/>
           </w:tcPr>
           <w:p>
-            <w:r/>
             <w:r>
               <w:rPr>
                 <w:sz w:val="18"/>
@@ -6369,10 +7019,9 @@
         </w:tc>
         <w:tc>
           <w:tcPr>
-            <w:tcW w:type="dxa" w:w="5760"/>
+            <w:tcW w:w="5760" w:type="dxa"/>
           </w:tcPr>
           <w:p>
-            <w:r/>
             <w:r>
               <w:rPr>
                 <w:sz w:val="18"/>
@@ -6383,13 +7032,15 @@
         </w:tc>
       </w:tr>
       <w:tr>
+        <w:trPr>
+          <w:jc w:val="center"/>
+        </w:trPr>
         <w:tc>
           <w:tcPr>
-            <w:tcW w:type="dxa" w:w="3456"/>
-            <w:shd w:val="clear" w:fill="EFF3F8"/>
+            <w:tcW w:w="3456" w:type="dxa"/>
+            <w:shd w:val="clear" w:color="auto" w:fill="EFF3F8"/>
           </w:tcPr>
           <w:p>
-            <w:r/>
             <w:r>
               <w:rPr>
                 <w:sz w:val="18"/>
@@ -6400,11 +7051,10 @@
         </w:tc>
         <w:tc>
           <w:tcPr>
-            <w:tcW w:type="dxa" w:w="5760"/>
-            <w:shd w:val="clear" w:fill="EFF3F8"/>
+            <w:tcW w:w="5760" w:type="dxa"/>
+            <w:shd w:val="clear" w:color="auto" w:fill="EFF3F8"/>
           </w:tcPr>
           <w:p>
-            <w:r/>
             <w:r>
               <w:rPr>
                 <w:sz w:val="18"/>
@@ -6415,12 +7065,14 @@
         </w:tc>
       </w:tr>
       <w:tr>
+        <w:trPr>
+          <w:jc w:val="center"/>
+        </w:trPr>
         <w:tc>
           <w:tcPr>
-            <w:tcW w:type="dxa" w:w="3456"/>
+            <w:tcW w:w="3456" w:type="dxa"/>
           </w:tcPr>
           <w:p>
-            <w:r/>
             <w:r>
               <w:rPr>
                 <w:sz w:val="18"/>
@@ -6431,27 +7083,42 @@
         </w:tc>
         <w:tc>
           <w:tcPr>
-            <w:tcW w:type="dxa" w:w="5760"/>
+            <w:tcW w:w="5760" w:type="dxa"/>
           </w:tcPr>
           <w:p>
-            <w:r/>
-            <w:r>
-              <w:rPr>
-                <w:sz w:val="18"/>
-              </w:rPr>
-              <w:t>outputs/models/arima_results.json, ts_metrics_summary.csv</w:t>
+            <w:r>
+              <w:rPr>
+                <w:sz w:val="18"/>
+              </w:rPr>
+              <w:t>outputs/models/</w:t>
+            </w:r>
+            <w:proofErr w:type="spellStart"/>
+            <w:r>
+              <w:rPr>
+                <w:sz w:val="18"/>
+              </w:rPr>
+              <w:t>arima_results.json</w:t>
+            </w:r>
+            <w:proofErr w:type="spellEnd"/>
+            <w:r>
+              <w:rPr>
+                <w:sz w:val="18"/>
+              </w:rPr>
+              <w:t>, ts_metrics_summary.csv</w:t>
             </w:r>
           </w:p>
         </w:tc>
       </w:tr>
       <w:tr>
+        <w:trPr>
+          <w:jc w:val="center"/>
+        </w:trPr>
         <w:tc>
           <w:tcPr>
-            <w:tcW w:type="dxa" w:w="3456"/>
-            <w:shd w:val="clear" w:fill="EFF3F8"/>
+            <w:tcW w:w="3456" w:type="dxa"/>
+            <w:shd w:val="clear" w:color="auto" w:fill="EFF3F8"/>
           </w:tcPr>
           <w:p>
-            <w:r/>
             <w:r>
               <w:rPr>
                 <w:sz w:val="18"/>
@@ -6462,27 +7129,36 @@
         </w:tc>
         <w:tc>
           <w:tcPr>
-            <w:tcW w:type="dxa" w:w="5760"/>
-            <w:shd w:val="clear" w:fill="EFF3F8"/>
+            <w:tcW w:w="5760" w:type="dxa"/>
+            <w:shd w:val="clear" w:color="auto" w:fill="EFF3F8"/>
           </w:tcPr>
           <w:p>
-            <w:r/>
-            <w:r>
-              <w:rPr>
-                <w:sz w:val="18"/>
-              </w:rPr>
-              <w:t>outputs/models/clustering_results.json</w:t>
-            </w:r>
+            <w:r>
+              <w:rPr>
+                <w:sz w:val="18"/>
+              </w:rPr>
+              <w:t>outputs/models/</w:t>
+            </w:r>
+            <w:proofErr w:type="spellStart"/>
+            <w:r>
+              <w:rPr>
+                <w:sz w:val="18"/>
+              </w:rPr>
+              <w:t>clustering_results.json</w:t>
+            </w:r>
+            <w:proofErr w:type="spellEnd"/>
           </w:p>
         </w:tc>
       </w:tr>
       <w:tr>
+        <w:trPr>
+          <w:jc w:val="center"/>
+        </w:trPr>
         <w:tc>
           <w:tcPr>
-            <w:tcW w:type="dxa" w:w="3456"/>
+            <w:tcW w:w="3456" w:type="dxa"/>
           </w:tcPr>
           <w:p>
-            <w:r/>
             <w:r>
               <w:rPr>
                 <w:sz w:val="18"/>
@@ -6493,10 +7169,9 @@
         </w:tc>
         <w:tc>
           <w:tcPr>
-            <w:tcW w:type="dxa" w:w="5760"/>
+            <w:tcW w:w="5760" w:type="dxa"/>
           </w:tcPr>
           <w:p>
-            <w:r/>
             <w:r>
               <w:rPr>
                 <w:sz w:val="18"/>
@@ -6507,13 +7182,15 @@
         </w:tc>
       </w:tr>
       <w:tr>
+        <w:trPr>
+          <w:jc w:val="center"/>
+        </w:trPr>
         <w:tc>
           <w:tcPr>
-            <w:tcW w:type="dxa" w:w="3456"/>
-            <w:shd w:val="clear" w:fill="EFF3F8"/>
+            <w:tcW w:w="3456" w:type="dxa"/>
+            <w:shd w:val="clear" w:color="auto" w:fill="EFF3F8"/>
           </w:tcPr>
           <w:p>
-            <w:r/>
             <w:r>
               <w:rPr>
                 <w:sz w:val="18"/>
@@ -6524,11 +7201,10 @@
         </w:tc>
         <w:tc>
           <w:tcPr>
-            <w:tcW w:type="dxa" w:w="5760"/>
-            <w:shd w:val="clear" w:fill="EFF3F8"/>
+            <w:tcW w:w="5760" w:type="dxa"/>
+            <w:shd w:val="clear" w:color="auto" w:fill="EFF3F8"/>
           </w:tcPr>
           <w:p>
-            <w:r/>
             <w:r>
               <w:rPr>
                 <w:sz w:val="18"/>
@@ -6539,12 +7215,14 @@
         </w:tc>
       </w:tr>
       <w:tr>
+        <w:trPr>
+          <w:jc w:val="center"/>
+        </w:trPr>
         <w:tc>
           <w:tcPr>
-            <w:tcW w:type="dxa" w:w="3456"/>
+            <w:tcW w:w="3456" w:type="dxa"/>
           </w:tcPr>
           <w:p>
-            <w:r/>
             <w:r>
               <w:rPr>
                 <w:sz w:val="18"/>
@@ -6555,10 +7233,9 @@
         </w:tc>
         <w:tc>
           <w:tcPr>
-            <w:tcW w:type="dxa" w:w="5760"/>
+            <w:tcW w:w="5760" w:type="dxa"/>
           </w:tcPr>
           <w:p>
-            <w:r/>
             <w:r>
               <w:rPr>
                 <w:sz w:val="18"/>
@@ -6578,8 +7255,13 @@
       <w:pPr>
         <w:pStyle w:val="Heading2"/>
       </w:pPr>
-      <w:r>
-        <w:t>A.3  Additional figures</w:t>
+      <w:proofErr w:type="gramStart"/>
+      <w:r>
+        <w:t>A.3  Additional</w:t>
+      </w:r>
+      <w:proofErr w:type="gramEnd"/>
+      <w:r>
+        <w:t xml:space="preserve"> figures</w:t>
       </w:r>
     </w:p>
     <w:p>
@@ -6587,10 +7269,6 @@
         <w:spacing w:after="120"/>
       </w:pPr>
       <w:r>
-        <w:rPr>
-          <w:b w:val="0"/>
-          <w:i w:val="0"/>
-        </w:rPr>
         <w:t>All figures generated by the pipeline are in outputs/figures/. Key charts:</w:t>
       </w:r>
     </w:p>
@@ -6599,22 +7277,26 @@
         <w:jc w:val="center"/>
       </w:pPr>
       <w:r>
+        <w:rPr>
+          <w:noProof/>
+        </w:rPr>
         <w:drawing>
-          <wp:inline xmlns:a="http://schemas.openxmlformats.org/drawingml/2006/main" xmlns:pic="http://schemas.openxmlformats.org/drawingml/2006/picture">
+          <wp:inline distT="0" distB="0" distL="0" distR="0" wp14:anchorId="28970FD4" wp14:editId="4647124E">
             <wp:extent cx="5303520" cy="1417039"/>
+            <wp:effectExtent l="0" t="0" r="0" b="0"/>
             <wp:docPr id="154" name="Picture 154"/>
             <wp:cNvGraphicFramePr>
-              <a:graphicFrameLocks noChangeAspect="1"/>
+              <a:graphicFrameLocks xmlns:a="http://schemas.openxmlformats.org/drawingml/2006/main" noChangeAspect="1"/>
             </wp:cNvGraphicFramePr>
-            <a:graphic>
+            <a:graphic xmlns:a="http://schemas.openxmlformats.org/drawingml/2006/main">
               <a:graphicData uri="http://schemas.openxmlformats.org/drawingml/2006/picture">
-                <pic:pic>
+                <pic:pic xmlns:pic="http://schemas.openxmlformats.org/drawingml/2006/picture">
                   <pic:nvPicPr>
                     <pic:cNvPr id="0" name="image.png"/>
                     <pic:cNvPicPr/>
                   </pic:nvPicPr>
                   <pic:blipFill>
-                    <a:blip r:embed="rId44"/>
+                    <a:blip r:embed="rId10"/>
                     <a:stretch>
                       <a:fillRect/>
                     </a:stretch>
@@ -6624,7 +7306,9 @@
                       <a:off x="0" y="0"/>
                       <a:ext cx="5303520" cy="1417039"/>
                     </a:xfrm>
-                    <a:prstGeom prst="rect"/>
+                    <a:prstGeom prst="rect">
+                      <a:avLst/>
+                    </a:prstGeom>
                   </pic:spPr>
                 </pic:pic>
               </a:graphicData>
@@ -6651,22 +7335,27 @@
         <w:jc w:val="center"/>
       </w:pPr>
       <w:r>
+        <w:rPr>
+          <w:noProof/>
+        </w:rPr>
+        <w:lastRenderedPageBreak/>
         <w:drawing>
-          <wp:inline xmlns:a="http://schemas.openxmlformats.org/drawingml/2006/main" xmlns:pic="http://schemas.openxmlformats.org/drawingml/2006/picture">
+          <wp:inline distT="0" distB="0" distL="0" distR="0" wp14:anchorId="2F960F75" wp14:editId="2ADBBC2B">
             <wp:extent cx="5303520" cy="3699507"/>
+            <wp:effectExtent l="0" t="0" r="0" b="0"/>
             <wp:docPr id="155" name="Picture 155"/>
             <wp:cNvGraphicFramePr>
-              <a:graphicFrameLocks noChangeAspect="1"/>
+              <a:graphicFrameLocks xmlns:a="http://schemas.openxmlformats.org/drawingml/2006/main" noChangeAspect="1"/>
             </wp:cNvGraphicFramePr>
-            <a:graphic>
+            <a:graphic xmlns:a="http://schemas.openxmlformats.org/drawingml/2006/main">
               <a:graphicData uri="http://schemas.openxmlformats.org/drawingml/2006/picture">
-                <pic:pic>
+                <pic:pic xmlns:pic="http://schemas.openxmlformats.org/drawingml/2006/picture">
                   <pic:nvPicPr>
                     <pic:cNvPr id="0" name="image.png"/>
                     <pic:cNvPicPr/>
                   </pic:nvPicPr>
                   <pic:blipFill>
-                    <a:blip r:embed="rId45"/>
+                    <a:blip r:embed="rId11"/>
                     <a:stretch>
                       <a:fillRect/>
                     </a:stretch>
@@ -6676,7 +7365,9 @@
                       <a:off x="0" y="0"/>
                       <a:ext cx="5303520" cy="3699507"/>
                     </a:xfrm>
-                    <a:prstGeom prst="rect"/>
+                    <a:prstGeom prst="rect">
+                      <a:avLst/>
+                    </a:prstGeom>
                   </pic:spPr>
                 </pic:pic>
               </a:graphicData>
@@ -6703,22 +7394,26 @@
         <w:jc w:val="center"/>
       </w:pPr>
       <w:r>
+        <w:rPr>
+          <w:noProof/>
+        </w:rPr>
         <w:drawing>
-          <wp:inline xmlns:a="http://schemas.openxmlformats.org/drawingml/2006/main" xmlns:pic="http://schemas.openxmlformats.org/drawingml/2006/picture">
+          <wp:inline distT="0" distB="0" distL="0" distR="0" wp14:anchorId="4ACE8E18" wp14:editId="712E0BB4">
             <wp:extent cx="5303520" cy="3699507"/>
+            <wp:effectExtent l="0" t="0" r="0" b="0"/>
             <wp:docPr id="156" name="Picture 156"/>
             <wp:cNvGraphicFramePr>
-              <a:graphicFrameLocks noChangeAspect="1"/>
+              <a:graphicFrameLocks xmlns:a="http://schemas.openxmlformats.org/drawingml/2006/main" noChangeAspect="1"/>
             </wp:cNvGraphicFramePr>
-            <a:graphic>
+            <a:graphic xmlns:a="http://schemas.openxmlformats.org/drawingml/2006/main">
               <a:graphicData uri="http://schemas.openxmlformats.org/drawingml/2006/picture">
-                <pic:pic>
+                <pic:pic xmlns:pic="http://schemas.openxmlformats.org/drawingml/2006/picture">
                   <pic:nvPicPr>
                     <pic:cNvPr id="0" name="image.png"/>
                     <pic:cNvPicPr/>
                   </pic:nvPicPr>
                   <pic:blipFill>
-                    <a:blip r:embed="rId47"/>
+                    <a:blip r:embed="rId13"/>
                     <a:stretch>
                       <a:fillRect/>
                     </a:stretch>
@@ -6728,7 +7423,9 @@
                       <a:off x="0" y="0"/>
                       <a:ext cx="5303520" cy="3699507"/>
                     </a:xfrm>
-                    <a:prstGeom prst="rect"/>
+                    <a:prstGeom prst="rect">
+                      <a:avLst/>
+                    </a:prstGeom>
                   </pic:spPr>
                 </pic:pic>
               </a:graphicData>
@@ -6755,22 +7452,27 @@
         <w:jc w:val="center"/>
       </w:pPr>
       <w:r>
+        <w:rPr>
+          <w:noProof/>
+        </w:rPr>
+        <w:lastRenderedPageBreak/>
         <w:drawing>
-          <wp:inline xmlns:a="http://schemas.openxmlformats.org/drawingml/2006/main" xmlns:pic="http://schemas.openxmlformats.org/drawingml/2006/picture">
+          <wp:inline distT="0" distB="0" distL="0" distR="0" wp14:anchorId="0E83E231" wp14:editId="7489378E">
             <wp:extent cx="5303520" cy="2182274"/>
+            <wp:effectExtent l="0" t="0" r="0" b="0"/>
             <wp:docPr id="157" name="Picture 157"/>
             <wp:cNvGraphicFramePr>
-              <a:graphicFrameLocks noChangeAspect="1"/>
+              <a:graphicFrameLocks xmlns:a="http://schemas.openxmlformats.org/drawingml/2006/main" noChangeAspect="1"/>
             </wp:cNvGraphicFramePr>
-            <a:graphic>
+            <a:graphic xmlns:a="http://schemas.openxmlformats.org/drawingml/2006/main">
               <a:graphicData uri="http://schemas.openxmlformats.org/drawingml/2006/picture">
-                <pic:pic>
+                <pic:pic xmlns:pic="http://schemas.openxmlformats.org/drawingml/2006/picture">
                   <pic:nvPicPr>
                     <pic:cNvPr id="0" name="image.png"/>
                     <pic:cNvPicPr/>
                   </pic:nvPicPr>
                   <pic:blipFill>
-                    <a:blip r:embed="rId46"/>
+                    <a:blip r:embed="rId12"/>
                     <a:stretch>
                       <a:fillRect/>
                     </a:stretch>
@@ -6780,7 +7482,9 @@
                       <a:off x="0" y="0"/>
                       <a:ext cx="5303520" cy="2182274"/>
                     </a:xfrm>
-                    <a:prstGeom prst="rect"/>
+                    <a:prstGeom prst="rect">
+                      <a:avLst/>
+                    </a:prstGeom>
                   </pic:spPr>
                 </pic:pic>
               </a:graphicData>
@@ -6807,22 +7511,26 @@
         <w:jc w:val="center"/>
       </w:pPr>
       <w:r>
+        <w:rPr>
+          <w:noProof/>
+        </w:rPr>
         <w:drawing>
-          <wp:inline xmlns:a="http://schemas.openxmlformats.org/drawingml/2006/main" xmlns:pic="http://schemas.openxmlformats.org/drawingml/2006/picture">
+          <wp:inline distT="0" distB="0" distL="0" distR="0" wp14:anchorId="4F2546E9" wp14:editId="641E2A17">
             <wp:extent cx="5303520" cy="1883226"/>
+            <wp:effectExtent l="0" t="0" r="0" b="0"/>
             <wp:docPr id="158" name="Picture 158"/>
             <wp:cNvGraphicFramePr>
-              <a:graphicFrameLocks noChangeAspect="1"/>
+              <a:graphicFrameLocks xmlns:a="http://schemas.openxmlformats.org/drawingml/2006/main" noChangeAspect="1"/>
             </wp:cNvGraphicFramePr>
-            <a:graphic>
+            <a:graphic xmlns:a="http://schemas.openxmlformats.org/drawingml/2006/main">
               <a:graphicData uri="http://schemas.openxmlformats.org/drawingml/2006/picture">
-                <pic:pic>
+                <pic:pic xmlns:pic="http://schemas.openxmlformats.org/drawingml/2006/picture">
                   <pic:nvPicPr>
                     <pic:cNvPr id="0" name="image.png"/>
                     <pic:cNvPicPr/>
                   </pic:nvPicPr>
                   <pic:blipFill>
-                    <a:blip r:embed="rId48"/>
+                    <a:blip r:embed="rId14"/>
                     <a:stretch>
                       <a:fillRect/>
                     </a:stretch>
@@ -6832,7 +7540,9 @@
                       <a:off x="0" y="0"/>
                       <a:ext cx="5303520" cy="1883226"/>
                     </a:xfrm>
-                    <a:prstGeom prst="rect"/>
+                    <a:prstGeom prst="rect">
+                      <a:avLst/>
+                    </a:prstGeom>
                   </pic:spPr>
                 </pic:pic>
               </a:graphicData>
@@ -6859,22 +7569,26 @@
         <w:jc w:val="center"/>
       </w:pPr>
       <w:r>
+        <w:rPr>
+          <w:noProof/>
+        </w:rPr>
         <w:drawing>
-          <wp:inline xmlns:a="http://schemas.openxmlformats.org/drawingml/2006/main" xmlns:pic="http://schemas.openxmlformats.org/drawingml/2006/picture">
+          <wp:inline distT="0" distB="0" distL="0" distR="0" wp14:anchorId="74419F33" wp14:editId="1485687B">
             <wp:extent cx="5303520" cy="1655787"/>
+            <wp:effectExtent l="0" t="0" r="0" b="0"/>
             <wp:docPr id="159" name="Picture 159"/>
             <wp:cNvGraphicFramePr>
-              <a:graphicFrameLocks noChangeAspect="1"/>
+              <a:graphicFrameLocks xmlns:a="http://schemas.openxmlformats.org/drawingml/2006/main" noChangeAspect="1"/>
             </wp:cNvGraphicFramePr>
-            <a:graphic>
+            <a:graphic xmlns:a="http://schemas.openxmlformats.org/drawingml/2006/main">
               <a:graphicData uri="http://schemas.openxmlformats.org/drawingml/2006/picture">
-                <pic:pic>
+                <pic:pic xmlns:pic="http://schemas.openxmlformats.org/drawingml/2006/picture">
                   <pic:nvPicPr>
                     <pic:cNvPr id="0" name="ts_forecast.png"/>
                     <pic:cNvPicPr/>
                   </pic:nvPicPr>
                   <pic:blipFill>
-                    <a:blip r:embed="rId53"/>
+                    <a:blip r:embed="rId9"/>
                     <a:stretch>
                       <a:fillRect/>
                     </a:stretch>
@@ -6884,7 +7598,9 @@
                       <a:off x="0" y="0"/>
                       <a:ext cx="5303520" cy="1655787"/>
                     </a:xfrm>
-                    <a:prstGeom prst="rect"/>
+                    <a:prstGeom prst="rect">
+                      <a:avLst/>
+                    </a:prstGeom>
                   </pic:spPr>
                 </pic:pic>
               </a:graphicData>
@@ -6912,7 +7628,6 @@
       </w:pPr>
       <w:r>
         <w:rPr>
-          <w:b w:val="0"/>
           <w:i/>
         </w:rPr>
         <w:t>[Figure not found: ts_test_evaluation.png]</w:t>
@@ -6923,22 +7638,26 @@
         <w:jc w:val="center"/>
       </w:pPr>
       <w:r>
+        <w:rPr>
+          <w:noProof/>
+        </w:rPr>
         <w:drawing>
-          <wp:inline xmlns:a="http://schemas.openxmlformats.org/drawingml/2006/main" xmlns:pic="http://schemas.openxmlformats.org/drawingml/2006/picture">
+          <wp:inline distT="0" distB="0" distL="0" distR="0" wp14:anchorId="5D060163" wp14:editId="4A70107A">
             <wp:extent cx="5303520" cy="1891843"/>
+            <wp:effectExtent l="0" t="0" r="0" b="0"/>
             <wp:docPr id="160" name="Picture 160"/>
             <wp:cNvGraphicFramePr>
-              <a:graphicFrameLocks noChangeAspect="1"/>
+              <a:graphicFrameLocks xmlns:a="http://schemas.openxmlformats.org/drawingml/2006/main" noChangeAspect="1"/>
             </wp:cNvGraphicFramePr>
-            <a:graphic>
+            <a:graphic xmlns:a="http://schemas.openxmlformats.org/drawingml/2006/main">
               <a:graphicData uri="http://schemas.openxmlformats.org/drawingml/2006/picture">
-                <pic:pic>
+                <pic:pic xmlns:pic="http://schemas.openxmlformats.org/drawingml/2006/picture">
                   <pic:nvPicPr>
                     <pic:cNvPr id="0" name="image.png"/>
                     <pic:cNvPicPr/>
                   </pic:nvPicPr>
                   <pic:blipFill>
-                    <a:blip r:embed="rId49"/>
+                    <a:blip r:embed="rId15"/>
                     <a:stretch>
                       <a:fillRect/>
                     </a:stretch>
@@ -6948,7 +7667,9 @@
                       <a:off x="0" y="0"/>
                       <a:ext cx="5303520" cy="1891843"/>
                     </a:xfrm>
-                    <a:prstGeom prst="rect"/>
+                    <a:prstGeom prst="rect">
+                      <a:avLst/>
+                    </a:prstGeom>
                   </pic:spPr>
                 </pic:pic>
               </a:graphicData>
@@ -6975,22 +7696,27 @@
         <w:jc w:val="center"/>
       </w:pPr>
       <w:r>
+        <w:rPr>
+          <w:noProof/>
+        </w:rPr>
+        <w:lastRenderedPageBreak/>
         <w:drawing>
-          <wp:inline xmlns:a="http://schemas.openxmlformats.org/drawingml/2006/main" xmlns:pic="http://schemas.openxmlformats.org/drawingml/2006/picture">
+          <wp:inline distT="0" distB="0" distL="0" distR="0" wp14:anchorId="4834E62C" wp14:editId="306EF543">
             <wp:extent cx="5303520" cy="4110601"/>
+            <wp:effectExtent l="0" t="0" r="0" b="0"/>
             <wp:docPr id="161" name="Picture 161"/>
             <wp:cNvGraphicFramePr>
-              <a:graphicFrameLocks noChangeAspect="1"/>
+              <a:graphicFrameLocks xmlns:a="http://schemas.openxmlformats.org/drawingml/2006/main" noChangeAspect="1"/>
             </wp:cNvGraphicFramePr>
-            <a:graphic>
+            <a:graphic xmlns:a="http://schemas.openxmlformats.org/drawingml/2006/main">
               <a:graphicData uri="http://schemas.openxmlformats.org/drawingml/2006/picture">
-                <pic:pic>
+                <pic:pic xmlns:pic="http://schemas.openxmlformats.org/drawingml/2006/picture">
                   <pic:nvPicPr>
                     <pic:cNvPr id="0" name="image.png"/>
                     <pic:cNvPicPr/>
                   </pic:nvPicPr>
                   <pic:blipFill>
-                    <a:blip r:embed="rId50"/>
+                    <a:blip r:embed="rId16"/>
                     <a:stretch>
                       <a:fillRect/>
                     </a:stretch>
@@ -7000,7 +7726,9 @@
                       <a:off x="0" y="0"/>
                       <a:ext cx="5303520" cy="4110601"/>
                     </a:xfrm>
-                    <a:prstGeom prst="rect"/>
+                    <a:prstGeom prst="rect">
+                      <a:avLst/>
+                    </a:prstGeom>
                   </pic:spPr>
                 </pic:pic>
               </a:graphicData>
@@ -7027,22 +7755,26 @@
         <w:jc w:val="center"/>
       </w:pPr>
       <w:r>
+        <w:rPr>
+          <w:noProof/>
+        </w:rPr>
         <w:drawing>
-          <wp:inline xmlns:a="http://schemas.openxmlformats.org/drawingml/2006/main" xmlns:pic="http://schemas.openxmlformats.org/drawingml/2006/picture">
+          <wp:inline distT="0" distB="0" distL="0" distR="0" wp14:anchorId="2BC3C590" wp14:editId="107EDDF6">
             <wp:extent cx="5303520" cy="2486775"/>
+            <wp:effectExtent l="0" t="0" r="0" b="0"/>
             <wp:docPr id="162" name="Picture 162"/>
             <wp:cNvGraphicFramePr>
-              <a:graphicFrameLocks noChangeAspect="1"/>
+              <a:graphicFrameLocks xmlns:a="http://schemas.openxmlformats.org/drawingml/2006/main" noChangeAspect="1"/>
             </wp:cNvGraphicFramePr>
-            <a:graphic>
+            <a:graphic xmlns:a="http://schemas.openxmlformats.org/drawingml/2006/main">
               <a:graphicData uri="http://schemas.openxmlformats.org/drawingml/2006/picture">
-                <pic:pic>
+                <pic:pic xmlns:pic="http://schemas.openxmlformats.org/drawingml/2006/picture">
                   <pic:nvPicPr>
                     <pic:cNvPr id="0" name="image.png"/>
                     <pic:cNvPicPr/>
                   </pic:nvPicPr>
                   <pic:blipFill>
-                    <a:blip r:embed="rId51"/>
+                    <a:blip r:embed="rId17"/>
                     <a:stretch>
                       <a:fillRect/>
                     </a:stretch>
@@ -7052,7 +7784,9 @@
                       <a:off x="0" y="0"/>
                       <a:ext cx="5303520" cy="2486775"/>
                     </a:xfrm>
-                    <a:prstGeom prst="rect"/>
+                    <a:prstGeom prst="rect">
+                      <a:avLst/>
+                    </a:prstGeom>
                   </pic:spPr>
                 </pic:pic>
               </a:graphicData>
@@ -7074,9 +7808,10 @@
         <w:t>Figure 19. CPI division inflation heatmap.</w:t>
       </w:r>
     </w:p>
+    <w:p/>
     <w:sectPr>
-      <w:headerReference w:type="default" r:id="rId28"/>
-      <w:footerReference w:type="default" r:id="rId29"/>
+      <w:headerReference w:type="default" r:id="rId20"/>
+      <w:footerReference w:type="default" r:id="rId21"/>
       <w:pgSz w:w="11910" w:h="16840"/>
       <w:pgMar w:top="1340" w:right="1417" w:bottom="280" w:left="1417" w:header="720" w:footer="720" w:gutter="0"/>
       <w:cols w:space="720"/>
@@ -7284,6 +8019,24 @@
 <file path=word/numbering.xml><?xml version="1.0" encoding="utf-8"?>
 <w:numbering xmlns:wpc="http://schemas.microsoft.com/office/word/2010/wordprocessingCanvas" xmlns:cx="http://schemas.microsoft.com/office/drawing/2014/chartex" xmlns:cx1="http://schemas.microsoft.com/office/drawing/2015/9/8/chartex" xmlns:cx2="http://schemas.microsoft.com/office/drawing/2015/10/21/chartex" xmlns:cx3="http://schemas.microsoft.com/office/drawing/2016/5/9/chartex" xmlns:cx4="http://schemas.microsoft.com/office/drawing/2016/5/10/chartex" xmlns:cx5="http://schemas.microsoft.com/office/drawing/2016/5/11/chartex" xmlns:cx6="http://schemas.microsoft.com/office/drawing/2016/5/12/chartex" xmlns:cx7="http://schemas.microsoft.com/office/drawing/2016/5/13/chartex" xmlns:cx8="http://schemas.microsoft.com/office/drawing/2016/5/14/chartex" xmlns:mc="http://schemas.openxmlformats.org/markup-compatibility/2006" xmlns:aink="http://schemas.microsoft.com/office/drawing/2016/ink" xmlns:am3d="http://schemas.microsoft.com/office/drawing/2017/model3d" xmlns:o="urn:schemas-microsoft-com:office:office" xmlns:oel="http://schemas.microsoft.com/office/2019/extlst" xmlns:r="http://schemas.openxmlformats.org/officeDocument/2006/relationships" xmlns:m="http://schemas.openxmlformats.org/officeDocument/2006/math" xmlns:v="urn:schemas-microsoft-com:vml" xmlns:wp14="http://schemas.microsoft.com/office/word/2010/wordprocessingDrawing" xmlns:wp="http://schemas.openxmlformats.org/drawingml/2006/wordprocessingDrawing" xmlns:w10="urn:schemas-microsoft-com:office:word" xmlns:w="http://schemas.openxmlformats.org/wordprocessingml/2006/main" xmlns:w14="http://schemas.microsoft.com/office/word/2010/wordml" xmlns:w15="http://schemas.microsoft.com/office/word/2012/wordml" xmlns:w16cex="http://schemas.microsoft.com/office/word/2018/wordml/cex" xmlns:w16cid="http://schemas.microsoft.com/office/word/2016/wordml/cid" xmlns:w16="http://schemas.microsoft.com/office/word/2018/wordml" xmlns:w16du="http://schemas.microsoft.com/office/word/2023/wordml/word16du" xmlns:w16sdtdh="http://schemas.microsoft.com/office/word/2020/wordml/sdtdatahash" xmlns:w16sdtfl="http://schemas.microsoft.com/office/word/2024/wordml/sdtformatlock" xmlns:w16se="http://schemas.microsoft.com/office/word/2015/wordml/symex" xmlns:wpg="http://schemas.microsoft.com/office/word/2010/wordprocessingGroup" xmlns:wpi="http://schemas.microsoft.com/office/word/2010/wordprocessingInk" xmlns:wne="http://schemas.microsoft.com/office/word/2006/wordml" xmlns:wps="http://schemas.microsoft.com/office/word/2010/wordprocessingShape" mc:Ignorable="w14 w15 w16se w16cid w16 w16cex w16sdtdh w16sdtfl w16du wp14">
   <w:abstractNum w:abstractNumId="0" w15:restartNumberingAfterBreak="0">
+    <w:nsid w:val="FFFFFF7F"/>
+    <w:multiLevelType w:val="singleLevel"/>
+    <w:tmpl w:val="38441652"/>
+    <w:lvl w:ilvl="0">
+      <w:start w:val="1"/>
+      <w:numFmt w:val="decimal"/>
+      <w:pStyle w:val="ListNumber2"/>
+      <w:lvlText w:val="%1."/>
+      <w:lvlJc w:val="left"/>
+      <w:pPr>
+        <w:tabs>
+          <w:tab w:val="num" w:pos="720"/>
+        </w:tabs>
+        <w:ind w:left="720" w:hanging="360"/>
+      </w:pPr>
+    </w:lvl>
+  </w:abstractNum>
+  <w:abstractNum w:abstractNumId="1" w15:restartNumberingAfterBreak="0">
     <w:nsid w:val="05036928"/>
     <w:multiLevelType w:val="multilevel"/>
     <w:tmpl w:val="44090025"/>
@@ -7378,7 +8131,7 @@
       </w:pPr>
     </w:lvl>
   </w:abstractNum>
-  <w:abstractNum w:abstractNumId="1" w15:restartNumberingAfterBreak="0">
+  <w:abstractNum w:abstractNumId="2" w15:restartNumberingAfterBreak="0">
     <w:nsid w:val="103740BB"/>
     <w:multiLevelType w:val="hybridMultilevel"/>
     <w:tmpl w:val="1EAC09F6"/>
@@ -7499,7 +8252,7 @@
       </w:rPr>
     </w:lvl>
   </w:abstractNum>
-  <w:abstractNum w:abstractNumId="2" w15:restartNumberingAfterBreak="0">
+  <w:abstractNum w:abstractNumId="3" w15:restartNumberingAfterBreak="0">
     <w:nsid w:val="12DF1A9F"/>
     <w:multiLevelType w:val="multilevel"/>
     <w:tmpl w:val="8318D470"/>
@@ -7630,7 +8383,7 @@
       </w:rPr>
     </w:lvl>
   </w:abstractNum>
-  <w:abstractNum w:abstractNumId="3" w15:restartNumberingAfterBreak="0">
+  <w:abstractNum w:abstractNumId="4" w15:restartNumberingAfterBreak="0">
     <w:nsid w:val="1E097CD3"/>
     <w:multiLevelType w:val="hybridMultilevel"/>
     <w:tmpl w:val="E34A2120"/>
@@ -7751,7 +8504,7 @@
       </w:rPr>
     </w:lvl>
   </w:abstractNum>
-  <w:abstractNum w:abstractNumId="4" w15:restartNumberingAfterBreak="0">
+  <w:abstractNum w:abstractNumId="5" w15:restartNumberingAfterBreak="0">
     <w:nsid w:val="1F636278"/>
     <w:multiLevelType w:val="hybridMultilevel"/>
     <w:tmpl w:val="D21C1EB6"/>
@@ -7837,7 +8590,7 @@
       </w:pPr>
     </w:lvl>
   </w:abstractNum>
-  <w:abstractNum w:abstractNumId="5" w15:restartNumberingAfterBreak="0">
+  <w:abstractNum w:abstractNumId="6" w15:restartNumberingAfterBreak="0">
     <w:nsid w:val="4C4650D2"/>
     <w:multiLevelType w:val="multilevel"/>
     <w:tmpl w:val="4409001F"/>
@@ -7924,21 +8677,24 @@
     </w:lvl>
   </w:abstractNum>
   <w:num w:numId="1" w16cid:durableId="802966436">
+    <w:abstractNumId w:val="2"/>
+  </w:num>
+  <w:num w:numId="2" w16cid:durableId="454979971">
+    <w:abstractNumId w:val="3"/>
+  </w:num>
+  <w:num w:numId="3" w16cid:durableId="201746685">
+    <w:abstractNumId w:val="4"/>
+  </w:num>
+  <w:num w:numId="4" w16cid:durableId="1379813935">
+    <w:abstractNumId w:val="5"/>
+  </w:num>
+  <w:num w:numId="5" w16cid:durableId="271523246">
+    <w:abstractNumId w:val="6"/>
+  </w:num>
+  <w:num w:numId="6" w16cid:durableId="710422370">
     <w:abstractNumId w:val="1"/>
   </w:num>
-  <w:num w:numId="2" w16cid:durableId="454979971">
-    <w:abstractNumId w:val="2"/>
-  </w:num>
-  <w:num w:numId="3" w16cid:durableId="201746685">
-    <w:abstractNumId w:val="3"/>
-  </w:num>
-  <w:num w:numId="4" w16cid:durableId="1379813935">
-    <w:abstractNumId w:val="4"/>
-  </w:num>
-  <w:num w:numId="5" w16cid:durableId="271523246">
-    <w:abstractNumId w:val="5"/>
-  </w:num>
-  <w:num w:numId="6" w16cid:durableId="710422370">
+  <w:num w:numId="7" w16cid:durableId="501050018">
     <w:abstractNumId w:val="0"/>
   </w:num>
 </w:numbering>
@@ -8143,7 +8899,7 @@
     <w:lsdException w:name="Medium Shading 2 Accent 1" w:uiPriority="64"/>
     <w:lsdException w:name="Medium List 1 Accent 1" w:uiPriority="65"/>
     <w:lsdException w:name="Revision" w:semiHidden="1"/>
-    <w:lsdException w:name="List Paragraph" w:uiPriority="34" w:qFormat="1"/>
+    <w:lsdException w:name="List Paragraph" w:uiPriority="1" w:qFormat="1"/>
     <w:lsdException w:name="Quote" w:uiPriority="29" w:qFormat="1"/>
     <w:lsdException w:name="Intense Quote" w:uiPriority="30" w:qFormat="1"/>
     <w:lsdException w:name="Medium List 2 Accent 1" w:uiPriority="66"/>
@@ -8351,6 +9107,7 @@
   <w:style w:type="paragraph" w:styleId="Heading1">
     <w:name w:val="heading 1"/>
     <w:basedOn w:val="Normal"/>
+    <w:link w:val="Heading1Char"/>
     <w:uiPriority w:val="9"/>
     <w:qFormat/>
     <w:pPr>
@@ -8370,6 +9127,7 @@
   <w:style w:type="paragraph" w:styleId="Heading2">
     <w:name w:val="heading 2"/>
     <w:basedOn w:val="Normal"/>
+    <w:link w:val="Heading2Char"/>
     <w:uiPriority w:val="9"/>
     <w:unhideWhenUsed/>
     <w:qFormat/>
@@ -8898,6 +9656,79 @@
       <w:shd w:val="clear" w:color="auto" w:fill="E1DFDD"/>
     </w:rPr>
   </w:style>
+  <w:style w:type="paragraph" w:styleId="ListNumber2">
+    <w:name w:val="List Number 2"/>
+    <w:basedOn w:val="Normal"/>
+    <w:uiPriority w:val="99"/>
+    <w:unhideWhenUsed/>
+    <w:rsid w:val="00207F7A"/>
+    <w:pPr>
+      <w:widowControl/>
+      <w:numPr>
+        <w:numId w:val="7"/>
+      </w:numPr>
+      <w:tabs>
+        <w:tab w:val="clear" w:pos="720"/>
+      </w:tabs>
+      <w:autoSpaceDE/>
+      <w:autoSpaceDN/>
+      <w:spacing w:after="200" w:line="276" w:lineRule="auto"/>
+      <w:ind w:left="0" w:firstLine="0"/>
+      <w:contextualSpacing/>
+    </w:pPr>
+    <w:rPr>
+      <w:rFonts w:asciiTheme="minorHAnsi" w:eastAsiaTheme="minorEastAsia" w:hAnsiTheme="minorHAnsi" w:cstheme="minorBidi"/>
+    </w:rPr>
+  </w:style>
+  <w:style w:type="paragraph" w:styleId="Caption">
+    <w:name w:val="caption"/>
+    <w:basedOn w:val="Normal"/>
+    <w:next w:val="Normal"/>
+    <w:uiPriority w:val="35"/>
+    <w:unhideWhenUsed/>
+    <w:qFormat/>
+    <w:rsid w:val="00BE20CE"/>
+    <w:pPr>
+      <w:spacing w:after="200"/>
+    </w:pPr>
+    <w:rPr>
+      <w:i/>
+      <w:iCs/>
+      <w:color w:val="1F497D" w:themeColor="text2"/>
+      <w:sz w:val="18"/>
+      <w:szCs w:val="18"/>
+    </w:rPr>
+  </w:style>
+  <w:style w:type="character" w:customStyle="1" w:styleId="Heading1Char">
+    <w:name w:val="Heading 1 Char"/>
+    <w:basedOn w:val="DefaultParagraphFont"/>
+    <w:link w:val="Heading1"/>
+    <w:uiPriority w:val="9"/>
+    <w:rsid w:val="00565981"/>
+    <w:rPr>
+      <w:rFonts w:ascii="Arial" w:eastAsia="Arial" w:hAnsi="Arial" w:cs="Arial"/>
+      <w:b/>
+      <w:bCs/>
+      <w:sz w:val="23"/>
+      <w:szCs w:val="23"/>
+    </w:rPr>
+  </w:style>
+  <w:style w:type="character" w:customStyle="1" w:styleId="Heading2Char">
+    <w:name w:val="Heading 2 Char"/>
+    <w:basedOn w:val="DefaultParagraphFont"/>
+    <w:link w:val="Heading2"/>
+    <w:uiPriority w:val="9"/>
+    <w:rsid w:val="00565981"/>
+    <w:rPr>
+      <w:rFonts w:ascii="Arial" w:eastAsia="Arial" w:hAnsi="Arial" w:cs="Arial"/>
+      <w:b/>
+      <w:bCs/>
+      <w:i/>
+      <w:iCs/>
+      <w:sz w:val="23"/>
+      <w:szCs w:val="23"/>
+    </w:rPr>
+  </w:style>
 </w:styles>
 </file>
 
@@ -8906,7 +9737,7 @@
   <w:docParts>
     <w:docPart>
       <w:docPartPr>
-        <w:name w:val="76C1D5A310504B6D900500C145B06B13"/>
+        <w:name w:val="8A65AF95879F4BEDB736E3E333E352C3"/>
         <w:category>
           <w:name w:val="General"/>
           <w:gallery w:val="placeholder"/>
@@ -8917,12 +9748,12 @@
         <w:behaviors>
           <w:behavior w:val="content"/>
         </w:behaviors>
-        <w:guid w:val="{A83EB0CE-819F-434D-8C10-BE4CCB694912}"/>
+        <w:guid w:val="{AE29669B-980A-424F-84A3-E06D3FC015D0}"/>
       </w:docPartPr>
       <w:docPartBody>
         <w:p>
           <w:pPr>
-            <w:pStyle w:val="76C1D5A310504B6D900500C145B06B13"/>
+            <w:pStyle w:val="8A65AF95879F4BEDB736E3E333E352C3"/>
           </w:pPr>
           <w:r>
             <w:rPr>
@@ -9031,17 +9862,28 @@
   </w:compat>
   <w:rsids>
     <w:rsidRoot w:val="00AA6F48"/>
+    <w:rsid w:val="000820C8"/>
+    <w:rsid w:val="000E1A82"/>
     <w:rsid w:val="00483FA0"/>
     <w:rsid w:val="00593841"/>
     <w:rsid w:val="005A62D3"/>
     <w:rsid w:val="005C489E"/>
     <w:rsid w:val="00645877"/>
+    <w:rsid w:val="006C0968"/>
+    <w:rsid w:val="007B46A3"/>
+    <w:rsid w:val="0083165D"/>
+    <w:rsid w:val="008B7913"/>
     <w:rsid w:val="00982291"/>
     <w:rsid w:val="00AA6F48"/>
-    <w:rsid w:val="00BC50CE"/>
-    <w:rsid w:val="00BF5A0E"/>
+    <w:rsid w:val="00C5499A"/>
+    <w:rsid w:val="00CB2CA0"/>
     <w:rsid w:val="00CD7007"/>
     <w:rsid w:val="00D6136F"/>
+    <w:rsid w:val="00DC7634"/>
+    <w:rsid w:val="00EC1A11"/>
+    <w:rsid w:val="00EC5F8B"/>
+    <w:rsid w:val="00F73409"/>
+    <w:rsid w:val="00F85BA5"/>
     <w:rsid w:val="00FD63A0"/>
   </w:rsids>
   <m:mathPr>
@@ -9493,9 +10335,9 @@
     <w:semiHidden/>
     <w:unhideWhenUsed/>
   </w:style>
-  <w:style w:type="paragraph" w:customStyle="1" w:styleId="76C1D5A310504B6D900500C145B06B13">
-    <w:name w:val="76C1D5A310504B6D900500C145B06B13"/>
-    <w:rsid w:val="00AA6F48"/>
+  <w:style w:type="paragraph" w:customStyle="1" w:styleId="8A65AF95879F4BEDB736E3E333E352C3">
+    <w:name w:val="8A65AF95879F4BEDB736E3E333E352C3"/>
+    <w:rsid w:val="000820C8"/>
   </w:style>
 </w:styles>
 </file>

</xml_diff>